<commit_message>
Spell out leftover leaks as a queue, not extra banked volume.
Memo and deck now say why DL/Aadhaar/Permit/Fitness are not the rec
(never-upload or eligibility), that the same camera after C1b is a free
rider not in the 180, and that never-upload is an assist RCT — not
another WhatsApp. Airport rec 2 is explicit: do not hire.

Co-authored-by: KRRamanathan <KRRamanathan@users.noreply.github.com>
</commit_message>
<xml_diff>
--- a/MEMO.docx
+++ b/MEMO.docx
@@ -53,7 +53,7 @@
           <w:rFonts w:ascii="Calibri" w:hAnsi="Calibri"/>
           <w:sz w:val="21"/>
         </w:rPr>
-        <w:t xml:space="preserve"> The two groups do not overlap. The exact 179.5–185.6 range is a sensitivity table, not a forecast to three digits. Show-up for in-person RC is not in the data, and if Legal will not let captains proceed with RC deferred, the RC piece is an upper bound.</w:t>
+        <w:t xml:space="preserve"> The two groups do not overlap. The 179.5–185.6 range is a sensitivity table, not a three-decimal forecast. Show-up for in-person RC is unobserved. If Legal will not let captains proceed with RC deferred, the RC piece is an upper bound.</w:t>
       </w:r>
     </w:p>
     <w:p>
@@ -77,7 +77,7 @@
           <w:rFonts w:ascii="Calibri" w:hAnsi="Calibri"/>
           <w:sz w:val="21"/>
         </w:rPr>
-        <w:t xml:space="preserve"> (3,895 / 3,946). Getting them through documents is the bottleneck that matters.</w:t>
+        <w:t xml:space="preserve"> (3,895 / 3,946). Documents are the bottleneck, not first-order.</w:t>
       </w:r>
     </w:p>
     <w:p>
@@ -94,7 +94,22 @@
           <w:rFonts w:ascii="Calibri" w:hAnsi="Calibri"/>
           <w:sz w:val="21"/>
         </w:rPr>
-        <w:t xml:space="preserve"> Clickers complete at 0pp vs non-clickers (about −1.5pp; interval −3.6 to +0.6). Most recipients had already cleared RC. The 29% vs 11% “got the campaign” gap is targeting, not lift. Do not fund 5×. Run send vs no-send instead — zero cost, this week.</w:t>
+        <w:t xml:space="preserve"> Clickers complete at 0pp vs non-clickers (about −1.5pp; interval −3.6 to +0.6). Most recipients had already cleared RC. The 29% vs 11% “got the campaign” gap is targeting, not lift. Do not fund 5×. That same null is why we do </w:t>
+      </w:r>
+      <w:r>
+        <w:rPr>
+          <w:rFonts w:ascii="Calibri" w:hAnsi="Calibri"/>
+          <w:b/>
+          <w:sz w:val="21"/>
+        </w:rPr>
+        <w:t>not</w:t>
+      </w:r>
+      <w:r>
+        <w:rPr>
+          <w:rFonts w:ascii="Calibri" w:hAnsi="Calibri"/>
+          <w:sz w:val="21"/>
+        </w:rPr>
+        <w:t xml:space="preserve"> harvest the large “never uploaded the next doc” pile with another WhatsApp.</w:t>
       </w:r>
     </w:p>
     <w:p>
@@ -126,7 +141,22 @@
           <w:rFonts w:ascii="Calibri" w:hAnsi="Calibri"/>
           <w:sz w:val="21"/>
         </w:rPr>
-        <w:t xml:space="preserve"> (no sign-off).</w:t>
+        <w:t xml:space="preserve"> (no sign-off). Airport is rec 2 on purpose: the answer is </w:t>
+      </w:r>
+      <w:r>
+        <w:rPr>
+          <w:rFonts w:ascii="Calibri" w:hAnsi="Calibri"/>
+          <w:b/>
+          <w:sz w:val="21"/>
+        </w:rPr>
+        <w:t>do not hire</w:t>
+      </w:r>
+      <w:r>
+        <w:rPr>
+          <w:rFonts w:ascii="Calibri" w:hAnsi="Calibri"/>
+          <w:sz w:val="21"/>
+        </w:rPr>
+        <w:t>, not a second onboarding slide.</w:t>
       </w:r>
     </w:p>
     <w:p>
@@ -142,7 +172,7 @@
         <w:rPr>
           <w:sz w:val="18"/>
         </w:rPr>
-        <w:t xml:space="preserve"> **1**  ·  **C1a** 10-day in-person RC for 1,637 capture-only fails, plus **C1b** Insurance camera UX for 411 (must still clear before a ride)  ·  ~180 approved/month (~134 + ~50)  ·  C1a: Legal/T&amp;S on deferral, plus **~1 centre FTE (~₹40–60k/month, ~180 visits)** — assumed agent load, not a field in the file. C1b: no deferral, engineering only  ·  Approved captains split by the two cohorts </w:t>
+        <w:t xml:space="preserve"> **1**  ·  **C1b** Insurance camera UX (411; must clear before a ride) **this week**, then **C1a** 10-day in-person RC (1,637) once Legal signs  ·  ~180 approved/month (~50 + ~134). Same camera on DL/Aadhaar/Permit/Fitness is a **free rider after C1b — not added to 180**  ·  C1a: Legal/T&amp;S + **~1 FTE (~₹40–60k/month, ~180 visits)**, assumed. C1b: engineering only  ·  Approved split by cohort </w:t>
       </w:r>
     </w:p>
     <w:p>
@@ -150,7 +180,7 @@
         <w:rPr>
           <w:sz w:val="18"/>
         </w:rPr>
-        <w:t xml:space="preserve"> **2**  ·  **Airport Return Assurance** at **₹35.4 per unpaid night-suburban leg** (~₹69–103k/month on the sample)  ·  Restores rest-of-day suburban economics; does not hire  ·  Sampled trips ≠ city P&amp;L. Target rest-suburban, not city-core  ·  Night suburban return-in-20m, cancels, **falling payout run-rate** over 4 weeks </w:t>
+        <w:t xml:space="preserve"> **2**  ·  **Airport Return Assurance** at **₹35.4 per unpaid night-suburban leg** (~₹69–103k/month sample)  ·  Restores rest-of-day suburban economics. **No catchment hiring**  ·  Sampled trips ≠ city P&amp;L. Target rest-suburban, not city-core  ·  Night suburban return-in-20m, cancels, **falling payout run-rate** over 4 weeks </w:t>
       </w:r>
     </w:p>
     <w:p>
@@ -158,7 +188,7 @@
         <w:rPr>
           <w:sz w:val="18"/>
         </w:rPr>
-        <w:t xml:space="preserve"> **3**  ·  Kill the 5× WhatsApp paper; RCT send vs no-send among RC-cleared app/paid captains, no other campaign  ·  Cost avoided + answer in 4–6 weeks  ·  Near zero  ·  Aadhaar pass and approved </w:t>
+        <w:t xml:space="preserve"> **3**  ·  Kill the 5× WhatsApp; send vs no-send RCT among RC-cleared app/paid captains, no other campaign  ·  Cost avoided + answer in 4–6 weeks  ·  Near zero  ·  Aadhaar pass and approved </w:t>
       </w:r>
     </w:p>
     <w:p>
@@ -168,14 +198,14 @@
           <w:b/>
           <w:sz w:val="21"/>
         </w:rPr>
-        <w:t>Airport in one line:</w:t>
+        <w:t>Airport, said plainly:</w:t>
       </w:r>
       <w:r>
         <w:rPr>
           <w:rFonts w:ascii="Calibri" w:hAnsi="Calibri"/>
           <w:sz w:val="21"/>
         </w:rPr>
-        <w:t xml:space="preserve"> do not hire the catchment. Nights fail because suburban backhaul and overnight return-collapse </w:t>
+        <w:t xml:space="preserve"> unfilled demand is ~40% at terminals vs ~3% elsewhere; 84% of that pain is 21:00–03:59. After the trip, suburban backhaul and overnight return-collapse </w:t>
       </w:r>
       <w:r>
         <w:rPr>
@@ -190,7 +220,7 @@
           <w:rFonts w:ascii="Calibri" w:hAnsi="Calibri"/>
           <w:sz w:val="21"/>
         </w:rPr>
-        <w:t xml:space="preserve">, and mix does not shift after dark. New captains inherit both penalties. ARA first; headcount only if a 4-week pilot’s payout run-rate is </w:t>
+        <w:t xml:space="preserve">, and mix does </w:t>
       </w:r>
       <w:r>
         <w:rPr>
@@ -205,7 +235,22 @@
           <w:rFonts w:ascii="Calibri" w:hAnsi="Calibri"/>
           <w:sz w:val="21"/>
         </w:rPr>
-        <w:t xml:space="preserve"> falling and unfilled demand remains.</w:t>
+        <w:t xml:space="preserve"> shift after dark. New hires inherit both penalties. ARA first; headcount only if a 4-week run-rate is </w:t>
+      </w:r>
+      <w:r>
+        <w:rPr>
+          <w:rFonts w:ascii="Calibri" w:hAnsi="Calibri"/>
+          <w:b/>
+          <w:sz w:val="21"/>
+        </w:rPr>
+        <w:t>not</w:t>
+      </w:r>
+      <w:r>
+        <w:rPr>
+          <w:rFonts w:ascii="Calibri" w:hAnsi="Calibri"/>
+          <w:sz w:val="21"/>
+        </w:rPr>
+        <w:t xml:space="preserve"> falling and nights stay unfilled.</w:t>
       </w:r>
     </w:p>
     <w:p>
@@ -215,7 +260,7 @@
           <w:color w:val="C45C26"/>
           <w:sz w:val="26"/>
         </w:rPr>
-        <w:t>Page 2 — Why, and what would change my mind</w:t>
+        <w:t>Page 2 — Why these two stages, what we left, what would change my mind</w:t>
       </w:r>
     </w:p>
     <w:p>
@@ -225,14 +270,74 @@
           <w:b/>
           <w:sz w:val="21"/>
         </w:rPr>
-        <w:t>RC vs Insurance.</w:t>
+        <w:t>Why RC and Insurance, not “fix the whole funnel.”</w:t>
       </w:r>
       <w:r>
         <w:rPr>
           <w:rFonts w:ascii="Calibri" w:hAnsi="Calibri"/>
           <w:sz w:val="21"/>
         </w:rPr>
-        <w:t xml:space="preserve"> 1,637 captains failed RC only on blur / weak OCR / illegible text. RC is vehicle identity — no passenger liability — so a 10-day in-person check is a scoped deferral. 411 failed Insurance the same way; Insurance is the liability document and </w:t>
+        <w:t xml:space="preserve"> RC loses 5,405 people — the largest stage. </w:t>
+      </w:r>
+      <w:r>
+        <w:rPr>
+          <w:rFonts w:ascii="Calibri" w:hAnsi="Calibri"/>
+          <w:b/>
+          <w:sz w:val="21"/>
+        </w:rPr>
+        <w:t>1,637</w:t>
+      </w:r>
+      <w:r>
+        <w:rPr>
+          <w:rFonts w:ascii="Calibri" w:hAnsi="Calibri"/>
+          <w:sz w:val="21"/>
+        </w:rPr>
+        <w:t xml:space="preserve"> failed *only* on blur / OCR / illegible; retry pass rates go </w:t>
+      </w:r>
+      <w:r>
+        <w:rPr>
+          <w:rFonts w:ascii="Calibri" w:hAnsi="Calibri"/>
+          <w:b/>
+          <w:sz w:val="21"/>
+        </w:rPr>
+        <w:t>up</w:t>
+      </w:r>
+      <w:r>
+        <w:rPr>
+          <w:rFonts w:ascii="Calibri" w:hAnsi="Calibri"/>
+          <w:sz w:val="21"/>
+        </w:rPr>
+        <w:t xml:space="preserve"> (65% → 74%). RC is vehicle identity, not passenger liability, so a 10-day in-person grace is scoped. Insurance loses 3,289, but </w:t>
+      </w:r>
+      <w:r>
+        <w:rPr>
+          <w:rFonts w:ascii="Calibri" w:hAnsi="Calibri"/>
+          <w:b/>
+          <w:sz w:val="21"/>
+        </w:rPr>
+        <w:t>~2,530 never uploaded</w:t>
+      </w:r>
+      <w:r>
+        <w:rPr>
+          <w:rFonts w:ascii="Calibri" w:hAnsi="Calibri"/>
+          <w:sz w:val="21"/>
+        </w:rPr>
+        <w:t xml:space="preserve"> after Fitness. C1b is only the </w:t>
+      </w:r>
+      <w:r>
+        <w:rPr>
+          <w:rFonts w:ascii="Calibri" w:hAnsi="Calibri"/>
+          <w:b/>
+          <w:sz w:val="21"/>
+        </w:rPr>
+        <w:t>411</w:t>
+      </w:r>
+      <w:r>
+        <w:rPr>
+          <w:rFonts w:ascii="Calibri" w:hAnsi="Calibri"/>
+          <w:sz w:val="21"/>
+        </w:rPr>
+        <w:t xml:space="preserve"> capture-only fails (same photo mechanism; </w:t>
       </w:r>
       <w:r>
         <w:rPr>
@@ -247,7 +352,69 @@
           <w:rFonts w:ascii="Calibri" w:hAnsi="Calibri"/>
           <w:sz w:val="21"/>
         </w:rPr>
-        <w:t xml:space="preserve"> defer. Most Insurance *volume* never uploaded after Fitness; C1b does not claim that pile.</w:t>
+        <w:t xml:space="preserve"> defer — liability). DL (1,166) is 100% uploaded-fail and </w:t>
+      </w:r>
+      <w:r>
+        <w:rPr>
+          <w:rFonts w:ascii="Calibri" w:hAnsi="Calibri"/>
+          <w:b/>
+          <w:sz w:val="21"/>
+        </w:rPr>
+        <w:t>cannot</w:t>
+      </w:r>
+      <w:r>
+        <w:rPr>
+          <w:rFonts w:ascii="Calibri" w:hAnsi="Calibri"/>
+          <w:sz w:val="21"/>
+        </w:rPr>
+        <w:t xml:space="preserve"> be deferred. Aadhaar / Permit / Fitness losses are real (1,540 / 2,616 / 2,653) but mostly </w:t>
+      </w:r>
+      <w:r>
+        <w:rPr>
+          <w:rFonts w:ascii="Calibri" w:hAnsi="Calibri"/>
+          <w:b/>
+          <w:sz w:val="21"/>
+        </w:rPr>
+        <w:t>never-uploaded</w:t>
+      </w:r>
+      <w:r>
+        <w:rPr>
+          <w:rFonts w:ascii="Calibri" w:hAnsi="Calibri"/>
+          <w:sz w:val="21"/>
+        </w:rPr>
+        <w:t xml:space="preserve"> or mixed with eligibility (expired, duplicate, name mismatch). A camera does not fix those. Rejected 409 already cleared docs — a gate.</w:t>
+      </w:r>
+    </w:p>
+    <w:p>
+      <w:r>
+        <w:rPr>
+          <w:rFonts w:ascii="Calibri" w:hAnsi="Calibri"/>
+          <w:b/>
+          <w:sz w:val="21"/>
+        </w:rPr>
+        <w:t>Leftover queue — possible, not banked.</w:t>
+      </w:r>
+      <w:r>
+        <w:rPr>
+          <w:rFonts w:ascii="Calibri" w:hAnsi="Calibri"/>
+          <w:sz w:val="21"/>
+        </w:rPr>
+        <w:t xml:space="preserve"> (1) Reuse C1b’s capture UX on every upload screen including DL — cheap once C1b ships; capture-only n not sized except RC/Insurance; do not add it to 180. (2) Never-upload RC (~2,388) and Insurance (~2,530): looks like a nudge; CAMP_WA_002 was 0pp and only 13 post-Fitness nudges exist in 7,644 people. Fos abandonment after Fitness is 26% vs paid 43% — in-person help, not WhatsApp. That is the </w:t>
+      </w:r>
+      <w:r>
+        <w:rPr>
+          <w:rFonts w:ascii="Calibri" w:hAnsi="Calibri"/>
+          <w:b/>
+          <w:sz w:val="21"/>
+        </w:rPr>
+        <w:t>assisted-onboarding RCT</w:t>
+      </w:r>
+      <w:r>
+        <w:rPr>
+          <w:rFonts w:ascii="Calibri" w:hAnsi="Calibri"/>
+          <w:sz w:val="21"/>
+        </w:rPr>
+        <w:t xml:space="preserve"> (unproven ceiling 128–256/month; overlaps 726 C1a captains; do not add). (3) Paid never-starts docs at 11.5% vs fos ~1% — channel quality; no CAC so not sized.</w:t>
       </w:r>
     </w:p>
     <w:p>
@@ -264,7 +431,7 @@
           <w:rFonts w:ascii="Calibri" w:hAnsi="Calibri"/>
           <w:sz w:val="21"/>
         </w:rPr>
-        <w:t xml:space="preserve"> RC stock is ~300/month. Additional = flow × 10-day show-up × pass. Pass is grounded: 74% on a third RC attempt, 78% when field assists RC. Central cell: 60% show-up × 74% = </w:t>
+        <w:t xml:space="preserve"> RC flow ~300/month × 60% show-up × 74% pass = </w:t>
       </w:r>
       <w:r>
         <w:rPr>
@@ -272,14 +439,14 @@
           <w:b/>
           <w:sz w:val="21"/>
         </w:rPr>
-        <w:t>~134/month</w:t>
+        <w:t>~134</w:t>
       </w:r>
       <w:r>
         <w:rPr>
           <w:rFonts w:ascii="Calibri" w:hAnsi="Calibri"/>
           <w:sz w:val="21"/>
         </w:rPr>
-        <w:t xml:space="preserve">. Insurance uses its own 67% → 74% → 76% retry pattern × 91% approved-if-cleared = </w:t>
+        <w:t xml:space="preserve">. Insurance 67→76% × 91% approved-if-cleared = </w:t>
       </w:r>
       <w:r>
         <w:rPr>
@@ -287,14 +454,14 @@
           <w:b/>
           <w:sz w:val="21"/>
         </w:rPr>
-        <w:t>~46–52/month</w:t>
+        <w:t>~46–52</w:t>
       </w:r>
       <w:r>
         <w:rPr>
           <w:rFonts w:ascii="Calibri" w:hAnsi="Calibri"/>
           <w:sz w:val="21"/>
         </w:rPr>
-        <w:t xml:space="preserve">. </w:t>
+        <w:t xml:space="preserve">. If remaining docs still bind after RC, historical P(approved | passed RC) is 27% and C1a shrinks toward </w:t>
       </w:r>
       <w:r>
         <w:rPr>
@@ -302,14 +469,14 @@
           <w:b/>
           <w:sz w:val="21"/>
         </w:rPr>
-        <w:t>Do not add 128–256/month</w:t>
+        <w:t>~36/month</w:t>
       </w:r>
       <w:r>
         <w:rPr>
           <w:rFonts w:ascii="Calibri" w:hAnsi="Calibri"/>
           <w:sz w:val="21"/>
         </w:rPr>
-        <w:t xml:space="preserve"> from “make app signups convert like field”: 726 of the RC group are already in that gap, and field teams recruit a different pool.</w:t>
+        <w:t xml:space="preserve"> — that is the Legal ask (deferral-as-activation).</w:t>
       </w:r>
     </w:p>
     <w:p>
@@ -319,31 +486,14 @@
           <w:b/>
           <w:sz w:val="21"/>
         </w:rPr>
-        <w:t>If remaining documents still bind.</w:t>
+        <w:t>ARA:</w:t>
       </w:r>
       <w:r>
         <w:rPr>
           <w:rFonts w:ascii="Calibri" w:hAnsi="Calibri"/>
           <w:sz w:val="21"/>
         </w:rPr>
-        <w:t xml:space="preserve"> Historical P(approved \| passed RC) is 27% (3,946 / 14,453). If Legal only defers RC *inside* the rest of the funnel, C1a shrinks toward ~36 fully-approved/month until Aadhaar→Insurance is also fixed. That is why the Legal ask is deferral-as-activation, not a photo waiver. C1b is already at Insurance; that haircut does not apply.</w:t>
-      </w:r>
-    </w:p>
-    <w:p>
-      <w:r>
-        <w:rPr>
-          <w:rFonts w:ascii="Calibri" w:hAnsi="Calibri"/>
-          <w:b/>
-          <w:sz w:val="21"/>
-        </w:rPr>
-        <w:t>ARA payout is derived, not a % of fare.</w:t>
-      </w:r>
-      <w:r>
-        <w:rPr>
-          <w:rFonts w:ascii="Calibri" w:hAnsi="Calibri"/>
-          <w:sz w:val="21"/>
-        </w:rPr>
-        <w:t xml:space="preserve"> Eligible = suburban × 21:00–03:59 × completed × no return in 20 min (89.31% of those trips; 2,422.5 sample legs/month). The ₹31.6 gap (₹24.9 vs ₹56.5) averages *all* completed worst-suburban trips, including the 10.69% that already got a return. Required ₹/eligible leg = </w:t>
+        <w:t xml:space="preserve"> ₹31.6 gap (₹24.9 vs ₹56.5) is a mean across *all* completed worst-suburban trips. ARA pays only the 89.31% with no return in 20 min → </w:t>
       </w:r>
       <w:r>
         <w:rPr>
@@ -351,29 +501,14 @@
           <w:b/>
           <w:sz w:val="21"/>
         </w:rPr>
-        <w:t>31.6 / 0.8931 ≈ 35.4</w:t>
+        <w:t>31.6 / 0.8931 ≈ ₹35.4</w:t>
       </w:r>
       <w:r>
         <w:rPr>
           <w:rFonts w:ascii="Calibri" w:hAnsi="Calibri"/>
           <w:sz w:val="21"/>
         </w:rPr>
-        <w:t xml:space="preserve">. Band 80/100/120% of that: ₹28.3 / ₹35.4 / ₹42.5 → </w:t>
-      </w:r>
-      <w:r>
-        <w:rPr>
-          <w:rFonts w:ascii="Calibri" w:hAnsi="Calibri"/>
-          <w:b/>
-          <w:sz w:val="21"/>
-        </w:rPr>
-        <w:t>~₹69k–103k/month</w:t>
-      </w:r>
-      <w:r>
-        <w:rPr>
-          <w:rFonts w:ascii="Calibri" w:hAnsi="Calibri"/>
-          <w:sz w:val="21"/>
-        </w:rPr>
-        <w:t xml:space="preserve"> sample. 30% of the ₹350 fare (₹105) would overpay. City-core (₹104.7 net) is geography, not this product.</w:t>
+        <w:t>/leg. 80/100/120% → ~₹69–103k/month sample. 30% of fare (₹105) overpays. City-core ₹104.7 is geography.</w:t>
       </w:r>
     </w:p>
     <w:p>
@@ -390,7 +525,7 @@
         <w:pStyle w:val="ListBullet"/>
       </w:pPr>
       <w:r>
-        <w:t>**~15.6-day cutoff.** Newer signups are unfinished, not failed. Later capture-fails → 180 is a floor; they finish alone → slight overstatement.</w:t>
+        <w:t>**~15.6-day cutoff.** Later capture-fails → 180 is a floor; they finish alone → slight overstatement.</w:t>
       </w:r>
     </w:p>
     <w:p>
@@ -398,7 +533,7 @@
         <w:pStyle w:val="ListBullet"/>
       </w:pPr>
       <w:r>
-        <w:t>**Document events decide which docs passed**, not the approvals file (they disagree only while unfinished).</w:t>
+        <w:t>**Document events**, not the approvals file, for which docs passed (disagree only while unfinished).</w:t>
       </w:r>
     </w:p>
     <w:p>
@@ -406,7 +541,7 @@
         <w:pStyle w:val="ListBullet"/>
       </w:pPr>
       <w:r>
-        <w:t>**Field vs app is not banked** until a randomised assist test on ordinary app/paid signups.</w:t>
+        <w:t>**Field vs app not banked** until a randomised assist test on ordinary app/paid signups.</w:t>
       </w:r>
     </w:p>
     <w:p>
@@ -414,7 +549,7 @@
         <w:pStyle w:val="ListBullet"/>
       </w:pPr>
       <w:r>
-        <w:t>**ARA target is rest-suburban, not city-core.** Night suburban trips would have to get as short as city-core to change that. They don’t.</w:t>
+        <w:t>**ARA = rest-suburban, not city-core.** Night suburban trips would have to get as short as city-core. They don’t.</w:t>
       </w:r>
     </w:p>
     <w:p>
@@ -430,7 +565,7 @@
         <w:pStyle w:val="ListBullet"/>
       </w:pPr>
       <w:r>
-        <w:t>**C1a ops ₹40–60k/month** assumes one FTE at a typical centre-agent load (~12–15 checks/day). A wage or roster from Ops would replace this.</w:t>
+        <w:t>**C1a ops ₹40–60k** assumes one FTE at 12–15 checks/day.</w:t>
       </w:r>
     </w:p>
     <w:p>
@@ -448,7 +583,7 @@
           <w:rFonts w:ascii="Calibri" w:hAnsi="Calibri"/>
           <w:sz w:val="21"/>
         </w:rPr>
-        <w:t>No CAC/spend field — cannot price field vs paid as media ROI. `airport_trips.csv` is sampled — rates hold; ₹/month is not a city budget. `signup_zone_id` does not join airport zones — cannot size captains who already live in the catchment.</w:t>
+        <w:t>No CAC — cannot price field vs paid. `airport_trips.csv` is sampled — rates hold; ₹/month is not a city budget. `signup_zone_id` does not join airport zones. Capture-only was not counted on Aadhaar/Permit/Fitness — reuse UX, then measure.</w:t>
       </w:r>
     </w:p>
     <w:sectPr>

</xml_diff>

<commit_message>
Light ice theme for memo and deck, with pies and bars.
Rebuild the Word memo and pptxgen deck on a pale background, add doughnut/bar charts for the ~180 split, RC/Insurance capture slices, overnight airport mix, and stage volume lost, and keep headline maths unchanged.

Co-authored-by: KRRamanathan <KRRamanathan@users.noreply.github.com>
</commit_message>
<xml_diff>
--- a/MEMO.docx
+++ b/MEMO.docx
@@ -1,15 +1,629 @@
 
 <file path=word/document.xml><?xml version="1.0" encoding="utf-8"?>
 <w:document xmlns:wpc="http://schemas.microsoft.com/office/word/2010/wordprocessingCanvas" xmlns:mo="http://schemas.microsoft.com/office/mac/office/2008/main" xmlns:mc="http://schemas.openxmlformats.org/markup-compatibility/2006" xmlns:mv="urn:schemas-microsoft-com:mac:vml" xmlns:o="urn:schemas-microsoft-com:office:office" xmlns:r="http://schemas.openxmlformats.org/officeDocument/2006/relationships" xmlns:m="http://schemas.openxmlformats.org/officeDocument/2006/math" xmlns:v="urn:schemas-microsoft-com:vml" xmlns:wp14="http://schemas.microsoft.com/office/word/2010/wordprocessingDrawing" xmlns:wp="http://schemas.openxmlformats.org/drawingml/2006/wordprocessingDrawing" xmlns:w10="urn:schemas-microsoft-com:office:word" xmlns:w="http://schemas.openxmlformats.org/wordprocessingml/2006/main" xmlns:w14="http://schemas.microsoft.com/office/word/2010/wordml" xmlns:wpg="http://schemas.microsoft.com/office/word/2010/wordprocessingGroup" xmlns:wpi="http://schemas.microsoft.com/office/word/2010/wordprocessingInk" xmlns:wne="http://schemas.microsoft.com/office/word/2006/wordml" xmlns:wps="http://schemas.microsoft.com/office/word/2010/wordprocessingShape" mc:Ignorable="w14 wp14">
+  <w:background w:color="F7F8FC"/>
   <w:body>
+    <w:tbl>
+      <w:tblPr>
+        <w:tblW w:type="auto" w:w="0"/>
+        <w:tblLayout w:type="autofit"/>
+        <w:tblLook w:firstColumn="1" w:firstRow="1" w:lastColumn="0" w:lastRow="0" w:noHBand="0" w:noVBand="1" w:val="04A0"/>
+      </w:tblPr>
+      <w:tblGrid>
+        <w:gridCol w:w="10224"/>
+      </w:tblGrid>
+      <w:tr>
+        <w:tc>
+          <w:tcPr>
+            <w:tcW w:type="dxa" w:w="10224"/>
+            <w:shd w:fill="CADCFC" w:val="clear"/>
+          </w:tcPr>
+          <w:p>
+            <w:r>
+              <w:rPr>
+                <w:rFonts w:ascii="Calibri" w:hAnsi="Calibri"/>
+                <w:b/>
+                <w:color w:val="1E2761"/>
+                <w:sz w:val="20"/>
+              </w:rPr>
+              <w:t>RAPIDO  ·  MEMO TO THE HEAD OF SUPPLY</w:t>
+            </w:r>
+          </w:p>
+          <w:p>
+            <w:r>
+              <w:rPr>
+                <w:rFonts w:ascii="Calibri" w:hAnsi="Calibri"/>
+                <w:b w:val="0"/>
+                <w:color w:val="1C7293"/>
+                <w:sz w:val="18"/>
+              </w:rPr>
+              <w:t>Onboarding leak and overnight airport  ·  10 Sep 2026  ·  extract 30 Jun 2026, 23:59 IST</w:t>
+            </w:r>
+          </w:p>
+        </w:tc>
+      </w:tr>
+    </w:tbl>
     <w:p>
       <w:r>
         <w:rPr>
+          <w:rFonts w:ascii="Cambria" w:hAnsi="Cambria"/>
           <w:b/>
-          <w:color w:val="1F3A5F"/>
+          <w:color w:val="1E2761"/>
           <w:sz w:val="32"/>
         </w:rPr>
-        <w:t>Memo to the Head of Supply</w:t>
+        <w:t>~180 more approved captains a month — two photo fixes, not five programmes</w:t>
+      </w:r>
+    </w:p>
+    <w:p>
+      <w:r>
+        <w:rPr>
+          <w:rFonts w:ascii="Calibri" w:hAnsi="Calibri"/>
+          <w:b w:val="0"/>
+          <w:color w:val="333333"/>
+          <w:sz w:val="21"/>
+        </w:rPr>
+        <w:t>Central case is about 134 from a 10-day RC in-person grace (C1a) and ~50 from Insurance upload UX (C1b). The groups do not overlap. 98.7% of mature approved captains already take a first trip (3,895 / 3,946) — documents are the bottleneck. Show-up for RC is unobserved; if Legal will not treat deferred RC as activation, C1a shrinks toward ~36/month.</w:t>
+      </w:r>
+    </w:p>
+    <w:p>
+      <w:pPr>
+        <w:jc w:val="center"/>
+      </w:pPr>
+      <w:r>
+        <w:drawing>
+          <wp:inline xmlns:a="http://schemas.openxmlformats.org/drawingml/2006/main" xmlns:pic="http://schemas.openxmlformats.org/drawingml/2006/picture">
+            <wp:extent cx="2880360" cy="1626149"/>
+            <wp:docPr id="1" name="Picture 1"/>
+            <wp:cNvGraphicFramePr>
+              <a:graphicFrameLocks noChangeAspect="1"/>
+            </wp:cNvGraphicFramePr>
+            <a:graphic>
+              <a:graphicData uri="http://schemas.openxmlformats.org/drawingml/2006/picture">
+                <pic:pic>
+                  <pic:nvPicPr>
+                    <pic:cNvPr id="0" name="pie_c1.png"/>
+                    <pic:cNvPicPr/>
+                  </pic:nvPicPr>
+                  <pic:blipFill>
+                    <a:blip r:embed="rId9"/>
+                    <a:stretch>
+                      <a:fillRect/>
+                    </a:stretch>
+                  </pic:blipFill>
+                  <pic:spPr>
+                    <a:xfrm>
+                      <a:off x="0" y="0"/>
+                      <a:ext cx="2880360" cy="1626149"/>
+                    </a:xfrm>
+                    <a:prstGeom prst="rect"/>
+                  </pic:spPr>
+                </pic:pic>
+              </a:graphicData>
+            </a:graphic>
+          </wp:inline>
+        </w:drawing>
+      </w:r>
+      <w:r>
+        <w:t xml:space="preserve">  </w:t>
+      </w:r>
+      <w:r>
+        <w:drawing>
+          <wp:inline xmlns:a="http://schemas.openxmlformats.org/drawingml/2006/main" xmlns:pic="http://schemas.openxmlformats.org/drawingml/2006/picture">
+            <wp:extent cx="2880360" cy="2028292"/>
+            <wp:docPr id="2" name="Picture 2"/>
+            <wp:cNvGraphicFramePr>
+              <a:graphicFrameLocks noChangeAspect="1"/>
+            </wp:cNvGraphicFramePr>
+            <a:graphic>
+              <a:graphicData uri="http://schemas.openxmlformats.org/drawingml/2006/picture">
+                <pic:pic>
+                  <pic:nvPicPr>
+                    <pic:cNvPr id="0" name="pie_airport_night.png"/>
+                    <pic:cNvPicPr/>
+                  </pic:nvPicPr>
+                  <pic:blipFill>
+                    <a:blip r:embed="rId10"/>
+                    <a:stretch>
+                      <a:fillRect/>
+                    </a:stretch>
+                  </pic:blipFill>
+                  <pic:spPr>
+                    <a:xfrm>
+                      <a:off x="0" y="0"/>
+                      <a:ext cx="2880360" cy="2028292"/>
+                    </a:xfrm>
+                    <a:prstGeom prst="rect"/>
+                  </pic:spPr>
+                </pic:pic>
+              </a:graphicData>
+            </a:graphic>
+          </wp:inline>
+        </w:drawing>
+      </w:r>
+      <w:r>
+        <w:t xml:space="preserve">  </w:t>
+      </w:r>
+    </w:p>
+    <w:p>
+      <w:pPr>
+        <w:jc w:val="center"/>
+      </w:pPr>
+      <w:r>
+        <w:rPr>
+          <w:rFonts w:ascii="Calibri" w:hAnsi="Calibri"/>
+          <w:b w:val="0"/>
+          <w:color w:val="8A8FA3"/>
+          <w:sz w:val="17"/>
+        </w:rPr>
+        <w:t>Left: bank only C1a + C1b (~180). Right: 84% of airport unfulfilled volume sits in 21:00–03:59.</w:t>
+      </w:r>
+    </w:p>
+    <w:p>
+      <w:r>
+        <w:rPr>
+          <w:rFonts w:ascii="Cambria" w:hAnsi="Cambria"/>
+          <w:b/>
+          <w:color w:val="1C7293"/>
+          <w:sz w:val="26"/>
+        </w:rPr>
+        <w:t>What to do this week</w:t>
+      </w:r>
+    </w:p>
+    <w:tbl>
+      <w:tblPr>
+        <w:tblStyle w:val="TableGrid"/>
+        <w:tblW w:type="auto" w:w="0"/>
+        <w:jc w:val="center"/>
+        <w:tblLook w:firstColumn="1" w:firstRow="1" w:lastColumn="0" w:lastRow="0" w:noHBand="0" w:noVBand="1" w:val="04A0"/>
+      </w:tblPr>
+      <w:tblGrid>
+        <w:gridCol w:w="2556"/>
+        <w:gridCol w:w="2556"/>
+        <w:gridCol w:w="2556"/>
+        <w:gridCol w:w="2556"/>
+      </w:tblGrid>
+      <w:tr>
+        <w:tc>
+          <w:tcPr>
+            <w:tcW w:type="dxa" w:w="2556"/>
+            <w:shd w:fill="1E2761" w:val="clear"/>
+          </w:tcPr>
+          <w:p>
+            <w:r>
+              <w:rPr>
+                <w:rFonts w:ascii="Calibri" w:hAnsi="Calibri"/>
+                <w:b/>
+                <w:color w:val="FFFFFF"/>
+                <w:sz w:val="18"/>
+              </w:rPr>
+              <w:t>#</w:t>
+            </w:r>
+          </w:p>
+        </w:tc>
+        <w:tc>
+          <w:tcPr>
+            <w:tcW w:type="dxa" w:w="2556"/>
+            <w:shd w:fill="1E2761" w:val="clear"/>
+          </w:tcPr>
+          <w:p>
+            <w:r>
+              <w:rPr>
+                <w:rFonts w:ascii="Calibri" w:hAnsi="Calibri"/>
+                <w:b/>
+                <w:color w:val="FFFFFF"/>
+                <w:sz w:val="18"/>
+              </w:rPr>
+              <w:t>Do this</w:t>
+            </w:r>
+          </w:p>
+        </w:tc>
+        <w:tc>
+          <w:tcPr>
+            <w:tcW w:type="dxa" w:w="2556"/>
+            <w:shd w:fill="1E2761" w:val="clear"/>
+          </w:tcPr>
+          <w:p>
+            <w:r>
+              <w:rPr>
+                <w:rFonts w:ascii="Calibri" w:hAnsi="Calibri"/>
+                <w:b/>
+                <w:color w:val="FFFFFF"/>
+                <w:sz w:val="18"/>
+              </w:rPr>
+              <w:t>Impact</w:t>
+            </w:r>
+          </w:p>
+        </w:tc>
+        <w:tc>
+          <w:tcPr>
+            <w:tcW w:type="dxa" w:w="2556"/>
+            <w:shd w:fill="1E2761" w:val="clear"/>
+          </w:tcPr>
+          <w:p>
+            <w:r>
+              <w:rPr>
+                <w:rFonts w:ascii="Calibri" w:hAnsi="Calibri"/>
+                <w:b/>
+                <w:color w:val="FFFFFF"/>
+                <w:sz w:val="18"/>
+              </w:rPr>
+              <w:t>Watch</w:t>
+            </w:r>
+          </w:p>
+        </w:tc>
+      </w:tr>
+      <w:tr>
+        <w:tc>
+          <w:tcPr>
+            <w:tcW w:type="dxa" w:w="2556"/>
+            <w:shd w:fill="F7F8FC" w:val="clear"/>
+          </w:tcPr>
+          <w:p>
+            <w:r>
+              <w:rPr>
+                <w:rFonts w:ascii="Calibri" w:hAnsi="Calibri"/>
+                <w:b/>
+                <w:color w:val="1E2761"/>
+                <w:sz w:val="17"/>
+              </w:rPr>
+              <w:t>1</w:t>
+            </w:r>
+          </w:p>
+        </w:tc>
+        <w:tc>
+          <w:tcPr>
+            <w:tcW w:type="dxa" w:w="2556"/>
+            <w:shd w:fill="F7F8FC" w:val="clear"/>
+          </w:tcPr>
+          <w:p>
+            <w:r>
+              <w:rPr>
+                <w:rFonts w:ascii="Calibri" w:hAnsi="Calibri"/>
+                <w:b w:val="0"/>
+                <w:color w:val="333333"/>
+                <w:sz w:val="17"/>
+              </w:rPr>
+              <w:t>C1b Insurance camera this week, then C1a 10-day RC grace after Legal (1,637 + 411 capture-only). Same camera on other docs is a free rider — not added to 180.</w:t>
+            </w:r>
+          </w:p>
+        </w:tc>
+        <w:tc>
+          <w:tcPr>
+            <w:tcW w:type="dxa" w:w="2556"/>
+            <w:shd w:fill="F7F8FC" w:val="clear"/>
+          </w:tcPr>
+          <w:p>
+            <w:r>
+              <w:rPr>
+                <w:rFonts w:ascii="Calibri" w:hAnsi="Calibri"/>
+                <w:b w:val="0"/>
+                <w:color w:val="333333"/>
+                <w:sz w:val="17"/>
+              </w:rPr>
+              <w:t>~180/mo (~50 + ~134). C1a ops ~1 FTE ₹40–60k assumed.</w:t>
+            </w:r>
+          </w:p>
+        </w:tc>
+        <w:tc>
+          <w:tcPr>
+            <w:tcW w:type="dxa" w:w="2556"/>
+            <w:shd w:fill="F7F8FC" w:val="clear"/>
+          </w:tcPr>
+          <w:p>
+            <w:r>
+              <w:rPr>
+                <w:rFonts w:ascii="Calibri" w:hAnsi="Calibri"/>
+                <w:b w:val="0"/>
+                <w:color w:val="333333"/>
+                <w:sz w:val="17"/>
+              </w:rPr>
+              <w:t>Approved by cohort</w:t>
+            </w:r>
+          </w:p>
+        </w:tc>
+      </w:tr>
+      <w:tr>
+        <w:tc>
+          <w:tcPr>
+            <w:tcW w:type="dxa" w:w="2556"/>
+            <w:shd w:fill="FFFFFF" w:val="clear"/>
+          </w:tcPr>
+          <w:p>
+            <w:r>
+              <w:rPr>
+                <w:rFonts w:ascii="Calibri" w:hAnsi="Calibri"/>
+                <w:b/>
+                <w:color w:val="1E2761"/>
+                <w:sz w:val="17"/>
+              </w:rPr>
+              <w:t>2</w:t>
+            </w:r>
+          </w:p>
+        </w:tc>
+        <w:tc>
+          <w:tcPr>
+            <w:tcW w:type="dxa" w:w="2556"/>
+            <w:shd w:fill="FFFFFF" w:val="clear"/>
+          </w:tcPr>
+          <w:p>
+            <w:r>
+              <w:rPr>
+                <w:rFonts w:ascii="Calibri" w:hAnsi="Calibri"/>
+                <w:b w:val="0"/>
+                <w:color w:val="333333"/>
+                <w:sz w:val="17"/>
+              </w:rPr>
+              <w:t>Airport Return Assurance at ₹35.4 per unpaid night-suburban leg. Do not hire the catchment.</w:t>
+            </w:r>
+          </w:p>
+        </w:tc>
+        <w:tc>
+          <w:tcPr>
+            <w:tcW w:type="dxa" w:w="2556"/>
+            <w:shd w:fill="FFFFFF" w:val="clear"/>
+          </w:tcPr>
+          <w:p>
+            <w:r>
+              <w:rPr>
+                <w:rFonts w:ascii="Calibri" w:hAnsi="Calibri"/>
+                <w:b w:val="0"/>
+                <w:color w:val="333333"/>
+                <w:sz w:val="17"/>
+              </w:rPr>
+              <w:t>Sample ~₹69–103k/mo. Restores rest-of-day suburban net, not city-core.</w:t>
+            </w:r>
+          </w:p>
+        </w:tc>
+        <w:tc>
+          <w:tcPr>
+            <w:tcW w:type="dxa" w:w="2556"/>
+            <w:shd w:fill="FFFFFF" w:val="clear"/>
+          </w:tcPr>
+          <w:p>
+            <w:r>
+              <w:rPr>
+                <w:rFonts w:ascii="Calibri" w:hAnsi="Calibri"/>
+                <w:b w:val="0"/>
+                <w:color w:val="333333"/>
+                <w:sz w:val="17"/>
+              </w:rPr>
+              <w:t>Return-in-20m, cancels, falling 4-week payout run-rate</w:t>
+            </w:r>
+          </w:p>
+        </w:tc>
+      </w:tr>
+      <w:tr>
+        <w:tc>
+          <w:tcPr>
+            <w:tcW w:type="dxa" w:w="2556"/>
+            <w:shd w:fill="F7F8FC" w:val="clear"/>
+          </w:tcPr>
+          <w:p>
+            <w:r>
+              <w:rPr>
+                <w:rFonts w:ascii="Calibri" w:hAnsi="Calibri"/>
+                <w:b/>
+                <w:color w:val="1E2761"/>
+                <w:sz w:val="17"/>
+              </w:rPr>
+              <w:t>3</w:t>
+            </w:r>
+          </w:p>
+        </w:tc>
+        <w:tc>
+          <w:tcPr>
+            <w:tcW w:type="dxa" w:w="2556"/>
+            <w:shd w:fill="F7F8FC" w:val="clear"/>
+          </w:tcPr>
+          <w:p>
+            <w:r>
+              <w:rPr>
+                <w:rFonts w:ascii="Calibri" w:hAnsi="Calibri"/>
+                <w:b w:val="0"/>
+                <w:color w:val="333333"/>
+                <w:sz w:val="17"/>
+              </w:rPr>
+              <w:t>Stop CAMP_WA_002 5×. Send/no-send RCT on RC-cleared app/paid captains, no other campaign.</w:t>
+            </w:r>
+          </w:p>
+        </w:tc>
+        <w:tc>
+          <w:tcPr>
+            <w:tcW w:type="dxa" w:w="2556"/>
+            <w:shd w:fill="F7F8FC" w:val="clear"/>
+          </w:tcPr>
+          <w:p>
+            <w:r>
+              <w:rPr>
+                <w:rFonts w:ascii="Calibri" w:hAnsi="Calibri"/>
+                <w:b w:val="0"/>
+                <w:color w:val="333333"/>
+                <w:sz w:val="17"/>
+              </w:rPr>
+              <w:t>0 pp click lift. Cost avoided + answer in 4–6 weeks.</w:t>
+            </w:r>
+          </w:p>
+        </w:tc>
+        <w:tc>
+          <w:tcPr>
+            <w:tcW w:type="dxa" w:w="2556"/>
+            <w:shd w:fill="F7F8FC" w:val="clear"/>
+          </w:tcPr>
+          <w:p>
+            <w:r>
+              <w:rPr>
+                <w:rFonts w:ascii="Calibri" w:hAnsi="Calibri"/>
+                <w:b w:val="0"/>
+                <w:color w:val="333333"/>
+                <w:sz w:val="17"/>
+              </w:rPr>
+              <w:t>Aadhaar pass and approved</w:t>
+            </w:r>
+          </w:p>
+        </w:tc>
+      </w:tr>
+    </w:tbl>
+    <w:p>
+      <w:r>
+        <w:rPr>
+          <w:rFonts w:ascii="Calibri" w:hAnsi="Calibri"/>
+          <w:b w:val="0"/>
+          <w:sz w:val="21"/>
+        </w:rPr>
+        <w:t>Stop scaling CAMP_WA_002. Clicked vs not is −1.5pp (CI −3.6 to +0.6) → 0 pp. The 29% vs 11% recipient gap is targeting after RC. That same null is why never-upload is not another WhatsApp.</w:t>
+      </w:r>
+    </w:p>
+    <w:p>
+      <w:r>
+        <w:rPr>
+          <w:rFonts w:ascii="Cambria" w:hAnsi="Cambria"/>
+          <w:b/>
+          <w:color w:val="1C7293"/>
+          <w:sz w:val="26"/>
+        </w:rPr>
+        <w:t>Why these two stages — leftover queue — ARA maths</w:t>
+      </w:r>
+    </w:p>
+    <w:p>
+      <w:pPr>
+        <w:jc w:val="center"/>
+      </w:pPr>
+      <w:r>
+        <w:drawing>
+          <wp:inline xmlns:a="http://schemas.openxmlformats.org/drawingml/2006/main" xmlns:pic="http://schemas.openxmlformats.org/drawingml/2006/picture">
+            <wp:extent cx="2880360" cy="1772204"/>
+            <wp:docPr id="3" name="Picture 3"/>
+            <wp:cNvGraphicFramePr>
+              <a:graphicFrameLocks noChangeAspect="1"/>
+            </wp:cNvGraphicFramePr>
+            <a:graphic>
+              <a:graphicData uri="http://schemas.openxmlformats.org/drawingml/2006/picture">
+                <pic:pic>
+                  <pic:nvPicPr>
+                    <pic:cNvPr id="0" name="pie_rc_capture.png"/>
+                    <pic:cNvPicPr/>
+                  </pic:nvPicPr>
+                  <pic:blipFill>
+                    <a:blip r:embed="rId11"/>
+                    <a:stretch>
+                      <a:fillRect/>
+                    </a:stretch>
+                  </pic:blipFill>
+                  <pic:spPr>
+                    <a:xfrm>
+                      <a:off x="0" y="0"/>
+                      <a:ext cx="2880360" cy="1772204"/>
+                    </a:xfrm>
+                    <a:prstGeom prst="rect"/>
+                  </pic:spPr>
+                </pic:pic>
+              </a:graphicData>
+            </a:graphic>
+          </wp:inline>
+        </w:drawing>
+      </w:r>
+      <w:r>
+        <w:t xml:space="preserve">  </w:t>
+      </w:r>
+      <w:r>
+        <w:drawing>
+          <wp:inline xmlns:a="http://schemas.openxmlformats.org/drawingml/2006/main" xmlns:pic="http://schemas.openxmlformats.org/drawingml/2006/picture">
+            <wp:extent cx="2880360" cy="1566789"/>
+            <wp:docPr id="4" name="Picture 4"/>
+            <wp:cNvGraphicFramePr>
+              <a:graphicFrameLocks noChangeAspect="1"/>
+            </wp:cNvGraphicFramePr>
+            <a:graphic>
+              <a:graphicData uri="http://schemas.openxmlformats.org/drawingml/2006/picture">
+                <pic:pic>
+                  <pic:nvPicPr>
+                    <pic:cNvPr id="0" name="pie_c1b.png"/>
+                    <pic:cNvPicPr/>
+                  </pic:nvPicPr>
+                  <pic:blipFill>
+                    <a:blip r:embed="rId12"/>
+                    <a:stretch>
+                      <a:fillRect/>
+                    </a:stretch>
+                  </pic:blipFill>
+                  <pic:spPr>
+                    <a:xfrm>
+                      <a:off x="0" y="0"/>
+                      <a:ext cx="2880360" cy="1566789"/>
+                    </a:xfrm>
+                    <a:prstGeom prst="rect"/>
+                  </pic:spPr>
+                </pic:pic>
+              </a:graphicData>
+            </a:graphic>
+          </wp:inline>
+        </w:drawing>
+      </w:r>
+      <w:r>
+        <w:t xml:space="preserve">  </w:t>
+      </w:r>
+    </w:p>
+    <w:p>
+      <w:pPr>
+        <w:jc w:val="center"/>
+      </w:pPr>
+      <w:r>
+        <w:rPr>
+          <w:rFonts w:ascii="Calibri" w:hAnsi="Calibri"/>
+          <w:b w:val="0"/>
+          <w:color w:val="8A8FA3"/>
+          <w:sz w:val="17"/>
+        </w:rPr>
+        <w:t>Left: only 1,637 of 5,405 RC losses are C1a. Right: only 411 of 3,289 Insurance leftovers are C1b.</w:t>
+      </w:r>
+    </w:p>
+    <w:p>
+      <w:pPr>
+        <w:jc w:val="center"/>
+      </w:pPr>
+      <w:r>
+        <w:drawing>
+          <wp:inline xmlns:a="http://schemas.openxmlformats.org/drawingml/2006/main" xmlns:pic="http://schemas.openxmlformats.org/drawingml/2006/picture">
+            <wp:extent cx="5577840" cy="2815230"/>
+            <wp:docPr id="5" name="Picture 5"/>
+            <wp:cNvGraphicFramePr>
+              <a:graphicFrameLocks noChangeAspect="1"/>
+            </wp:cNvGraphicFramePr>
+            <a:graphic>
+              <a:graphicData uri="http://schemas.openxmlformats.org/drawingml/2006/picture">
+                <pic:pic>
+                  <pic:nvPicPr>
+                    <pic:cNvPr id="0" name="bar_volume_lost.png"/>
+                    <pic:cNvPicPr/>
+                  </pic:nvPicPr>
+                  <pic:blipFill>
+                    <a:blip r:embed="rId13"/>
+                    <a:stretch>
+                      <a:fillRect/>
+                    </a:stretch>
+                  </pic:blipFill>
+                  <pic:spPr>
+                    <a:xfrm>
+                      <a:off x="0" y="0"/>
+                      <a:ext cx="5577840" cy="2815230"/>
+                    </a:xfrm>
+                    <a:prstGeom prst="rect"/>
+                  </pic:spPr>
+                </pic:pic>
+              </a:graphicData>
+            </a:graphic>
+          </wp:inline>
+        </w:drawing>
+      </w:r>
+    </w:p>
+    <w:p>
+      <w:r>
+        <w:rPr>
+          <w:rFonts w:ascii="Calibri" w:hAnsi="Calibri"/>
+          <w:b w:val="0"/>
+          <w:sz w:val="21"/>
+        </w:rPr>
+        <w:t>RC loses 5,405; only 1,637 are capture-only (C1a). Insurance loses 3,289 but ~2,530 never uploaded after Fitness — C1b is the 411 photo fails. DL cannot be deferred. Mix does not shift overnight (χ² p=0.12). ARA: gap ₹31.6 ÷ 0.8931 eligible share ≈ ₹35.4/leg. 30% of fare (₹105) overpays.</w:t>
       </w:r>
     </w:p>
     <w:p>
@@ -17,578 +631,23 @@
         <w:rPr>
           <w:rFonts w:ascii="Calibri" w:hAnsi="Calibri"/>
           <w:b/>
-          <w:sz w:val="21"/>
+          <w:color w:val="1E2761"/>
+          <w:sz w:val="22"/>
         </w:rPr>
-        <w:t>Onboarding leak and overnight airport</w:t>
+        <w:t xml:space="preserve">What I assumed, and what would change my answer. </w:t>
       </w:r>
       <w:r>
         <w:rPr>
           <w:rFonts w:ascii="Calibri" w:hAnsi="Calibri"/>
-          <w:sz w:val="21"/>
+          <w:b w:val="0"/>
+          <w:sz w:val="20"/>
         </w:rPr>
-        <w:t xml:space="preserve"> · 10 Sep 2026 · extract 30 Jun 2026, 23:59 IST</w:t>
-      </w:r>
-    </w:p>
-    <w:p>
-      <w:r>
-        <w:rPr>
-          <w:b/>
-          <w:color w:val="C45C26"/>
-          <w:sz w:val="26"/>
-        </w:rPr>
-        <w:t>Page 1 — What to do this week</w:t>
-      </w:r>
-    </w:p>
-    <w:p>
-      <w:r>
-        <w:rPr>
-          <w:rFonts w:ascii="Calibri" w:hAnsi="Calibri"/>
-          <w:b/>
-          <w:sz w:val="21"/>
-        </w:rPr>
-        <w:t>About 180 more approved captains a month, medium confidence — roughly 134 from an RC grace window and 50 from Insurance upload UX.</w:t>
-      </w:r>
-      <w:r>
-        <w:rPr>
-          <w:rFonts w:ascii="Calibri" w:hAnsi="Calibri"/>
-          <w:sz w:val="21"/>
-        </w:rPr>
-        <w:t xml:space="preserve"> The two groups do not overlap. The 179.5–185.6 range is a sensitivity table, not a three-decimal forecast. Show-up for in-person RC is unobserved. If Legal will not let captains proceed with RC deferred, the RC piece is an upper bound.</w:t>
-      </w:r>
-    </w:p>
-    <w:p>
-      <w:r>
-        <w:rPr>
-          <w:rFonts w:ascii="Calibri" w:hAnsi="Calibri"/>
-          <w:sz w:val="21"/>
-        </w:rPr>
-        <w:t xml:space="preserve">These approvals are not hollow. Among mature approved captains, </w:t>
-      </w:r>
-      <w:r>
-        <w:rPr>
-          <w:rFonts w:ascii="Calibri" w:hAnsi="Calibri"/>
-          <w:b/>
-          <w:sz w:val="21"/>
-        </w:rPr>
-        <w:t>98.7% take a first trip</w:t>
-      </w:r>
-      <w:r>
-        <w:rPr>
-          <w:rFonts w:ascii="Calibri" w:hAnsi="Calibri"/>
-          <w:sz w:val="21"/>
-        </w:rPr>
-        <w:t xml:space="preserve"> (3,895 / 3,946). Documents are the bottleneck, not first-order.</w:t>
-      </w:r>
-    </w:p>
-    <w:p>
-      <w:r>
-        <w:rPr>
-          <w:rFonts w:ascii="Calibri" w:hAnsi="Calibri"/>
-          <w:b/>
-          <w:sz w:val="21"/>
-        </w:rPr>
-        <w:t>Stop scaling CAMP_WA_002.</w:t>
-      </w:r>
-      <w:r>
-        <w:rPr>
-          <w:rFonts w:ascii="Calibri" w:hAnsi="Calibri"/>
-          <w:sz w:val="21"/>
-        </w:rPr>
-        <w:t xml:space="preserve"> Clickers complete at 0pp vs non-clickers (about −1.5pp; interval −3.6 to +0.6). Most recipients had already cleared RC. The 29% vs 11% “got the campaign” gap is targeting, not lift. Do not fund 5×. That same null is why we do </w:t>
-      </w:r>
-      <w:r>
-        <w:rPr>
-          <w:rFonts w:ascii="Calibri" w:hAnsi="Calibri"/>
-          <w:b/>
-          <w:sz w:val="21"/>
-        </w:rPr>
-        <w:t>not</w:t>
-      </w:r>
-      <w:r>
-        <w:rPr>
-          <w:rFonts w:ascii="Calibri" w:hAnsi="Calibri"/>
-          <w:sz w:val="21"/>
-        </w:rPr>
-        <w:t xml:space="preserve"> harvest the large “never uploaded the next doc” pile with another WhatsApp.</w:t>
-      </w:r>
-    </w:p>
-    <w:p>
-      <w:r>
-        <w:rPr>
-          <w:rFonts w:ascii="Calibri" w:hAnsi="Calibri"/>
-          <w:b/>
-          <w:sz w:val="21"/>
-        </w:rPr>
-        <w:t>Ranked by monthly impact.</w:t>
-      </w:r>
-      <w:r>
-        <w:rPr>
-          <w:rFonts w:ascii="Calibri" w:hAnsi="Calibri"/>
-          <w:sz w:val="21"/>
-        </w:rPr>
-        <w:t xml:space="preserve"> Item 3 is the smallest number and the </w:t>
-      </w:r>
-      <w:r>
-        <w:rPr>
-          <w:rFonts w:ascii="Calibri" w:hAnsi="Calibri"/>
-          <w:b/>
-          <w:sz w:val="21"/>
-        </w:rPr>
-        <w:t>fastest yes</w:t>
-      </w:r>
-      <w:r>
-        <w:rPr>
-          <w:rFonts w:ascii="Calibri" w:hAnsi="Calibri"/>
-          <w:sz w:val="21"/>
-        </w:rPr>
-        <w:t xml:space="preserve"> (no sign-off). Airport is rec 2 on purpose: the answer is </w:t>
-      </w:r>
-      <w:r>
-        <w:rPr>
-          <w:rFonts w:ascii="Calibri" w:hAnsi="Calibri"/>
-          <w:b/>
-          <w:sz w:val="21"/>
-        </w:rPr>
-        <w:t>do not hire</w:t>
-      </w:r>
-      <w:r>
-        <w:rPr>
-          <w:rFonts w:ascii="Calibri" w:hAnsi="Calibri"/>
-          <w:sz w:val="21"/>
-        </w:rPr>
-        <w:t>, not a second onboarding slide.</w:t>
-      </w:r>
-    </w:p>
-    <w:p>
-      <w:r>
-        <w:rPr>
-          <w:sz w:val="18"/>
-        </w:rPr>
-        <w:t xml:space="preserve"> #  ·  Do this  ·  Impact  ·  Cost / risk  ·  Watch </w:t>
-      </w:r>
-    </w:p>
-    <w:p>
-      <w:r>
-        <w:rPr>
-          <w:sz w:val="18"/>
-        </w:rPr>
-        <w:t xml:space="preserve"> **1**  ·  **C1b** Insurance camera UX (411; must clear before a ride) **this week**, then **C1a** 10-day in-person RC (1,637) once Legal signs  ·  ~180 approved/month (~50 + ~134). Same camera on DL/Aadhaar/Permit/Fitness is a **free rider after C1b — not added to 180**  ·  C1a: Legal/T&amp;S + **~1 FTE (~₹40–60k/month, ~180 visits)**, assumed. C1b: engineering only  ·  Approved split by cohort </w:t>
-      </w:r>
-    </w:p>
-    <w:p>
-      <w:r>
-        <w:rPr>
-          <w:sz w:val="18"/>
-        </w:rPr>
-        <w:t xml:space="preserve"> **2**  ·  **Airport Return Assurance** at **₹35.4 per unpaid night-suburban leg** (~₹69–103k/month sample)  ·  Restores rest-of-day suburban economics. **No catchment hiring**  ·  Sampled trips ≠ city P&amp;L. Target rest-suburban, not city-core  ·  Night suburban return-in-20m, cancels, **falling payout run-rate** over 4 weeks </w:t>
-      </w:r>
-    </w:p>
-    <w:p>
-      <w:r>
-        <w:rPr>
-          <w:sz w:val="18"/>
-        </w:rPr>
-        <w:t xml:space="preserve"> **3**  ·  Kill the 5× WhatsApp; send vs no-send RCT among RC-cleared app/paid captains, no other campaign  ·  Cost avoided + answer in 4–6 weeks  ·  Near zero  ·  Aadhaar pass and approved </w:t>
-      </w:r>
-    </w:p>
-    <w:p>
-      <w:r>
-        <w:rPr>
-          <w:rFonts w:ascii="Calibri" w:hAnsi="Calibri"/>
-          <w:b/>
-          <w:sz w:val="21"/>
-        </w:rPr>
-        <w:t>Airport, said plainly:</w:t>
-      </w:r>
-      <w:r>
-        <w:rPr>
-          <w:rFonts w:ascii="Calibri" w:hAnsi="Calibri"/>
-          <w:sz w:val="21"/>
-        </w:rPr>
-        <w:t xml:space="preserve"> unfilled demand is ~40% at terminals vs ~3% elsewhere; 84% of that pain is 21:00–03:59. After the trip, suburban backhaul and overnight return-collapse </w:t>
-      </w:r>
-      <w:r>
-        <w:rPr>
-          <w:rFonts w:ascii="Calibri" w:hAnsi="Calibri"/>
-          <w:b/>
-          <w:sz w:val="21"/>
-        </w:rPr>
-        <w:t>compound</w:t>
-      </w:r>
-      <w:r>
-        <w:rPr>
-          <w:rFonts w:ascii="Calibri" w:hAnsi="Calibri"/>
-          <w:sz w:val="21"/>
-        </w:rPr>
-        <w:t xml:space="preserve">, and mix does </w:t>
-      </w:r>
-      <w:r>
-        <w:rPr>
-          <w:rFonts w:ascii="Calibri" w:hAnsi="Calibri"/>
-          <w:b/>
-          <w:sz w:val="21"/>
-        </w:rPr>
-        <w:t>not</w:t>
-      </w:r>
-      <w:r>
-        <w:rPr>
-          <w:rFonts w:ascii="Calibri" w:hAnsi="Calibri"/>
-          <w:sz w:val="21"/>
-        </w:rPr>
-        <w:t xml:space="preserve"> shift after dark. New hires inherit both penalties. ARA first; headcount only if a 4-week run-rate is </w:t>
-      </w:r>
-      <w:r>
-        <w:rPr>
-          <w:rFonts w:ascii="Calibri" w:hAnsi="Calibri"/>
-          <w:b/>
-          <w:sz w:val="21"/>
-        </w:rPr>
-        <w:t>not</w:t>
-      </w:r>
-      <w:r>
-        <w:rPr>
-          <w:rFonts w:ascii="Calibri" w:hAnsi="Calibri"/>
-          <w:sz w:val="21"/>
-        </w:rPr>
-        <w:t xml:space="preserve"> falling and nights stay unfilled.</w:t>
-      </w:r>
-    </w:p>
-    <w:p>
-      <w:r>
-        <w:rPr>
-          <w:b/>
-          <w:color w:val="C45C26"/>
-          <w:sz w:val="26"/>
-        </w:rPr>
-        <w:t>Page 2 — Why these two stages, what we left, what would change my mind</w:t>
-      </w:r>
-    </w:p>
-    <w:p>
-      <w:r>
-        <w:rPr>
-          <w:rFonts w:ascii="Calibri" w:hAnsi="Calibri"/>
-          <w:b/>
-          <w:sz w:val="21"/>
-        </w:rPr>
-        <w:t>Why RC and Insurance, not “fix the whole funnel.”</w:t>
-      </w:r>
-      <w:r>
-        <w:rPr>
-          <w:rFonts w:ascii="Calibri" w:hAnsi="Calibri"/>
-          <w:sz w:val="21"/>
-        </w:rPr>
-        <w:t xml:space="preserve"> RC loses 5,405 people — the largest stage. </w:t>
-      </w:r>
-      <w:r>
-        <w:rPr>
-          <w:rFonts w:ascii="Calibri" w:hAnsi="Calibri"/>
-          <w:b/>
-          <w:sz w:val="21"/>
-        </w:rPr>
-        <w:t>1,637</w:t>
-      </w:r>
-      <w:r>
-        <w:rPr>
-          <w:rFonts w:ascii="Calibri" w:hAnsi="Calibri"/>
-          <w:sz w:val="21"/>
-        </w:rPr>
-        <w:t xml:space="preserve"> failed *only* on blur / OCR / illegible; retry pass rates go </w:t>
-      </w:r>
-      <w:r>
-        <w:rPr>
-          <w:rFonts w:ascii="Calibri" w:hAnsi="Calibri"/>
-          <w:b/>
-          <w:sz w:val="21"/>
-        </w:rPr>
-        <w:t>up</w:t>
-      </w:r>
-      <w:r>
-        <w:rPr>
-          <w:rFonts w:ascii="Calibri" w:hAnsi="Calibri"/>
-          <w:sz w:val="21"/>
-        </w:rPr>
-        <w:t xml:space="preserve"> (65% → 74%). RC is vehicle identity, not passenger liability, so a 10-day in-person grace is scoped. Insurance loses 3,289, but </w:t>
-      </w:r>
-      <w:r>
-        <w:rPr>
-          <w:rFonts w:ascii="Calibri" w:hAnsi="Calibri"/>
-          <w:b/>
-          <w:sz w:val="21"/>
-        </w:rPr>
-        <w:t>~2,530 never uploaded</w:t>
-      </w:r>
-      <w:r>
-        <w:rPr>
-          <w:rFonts w:ascii="Calibri" w:hAnsi="Calibri"/>
-          <w:sz w:val="21"/>
-        </w:rPr>
-        <w:t xml:space="preserve"> after Fitness. C1b is only the </w:t>
-      </w:r>
-      <w:r>
-        <w:rPr>
-          <w:rFonts w:ascii="Calibri" w:hAnsi="Calibri"/>
-          <w:b/>
-          <w:sz w:val="21"/>
-        </w:rPr>
-        <w:t>411</w:t>
-      </w:r>
-      <w:r>
-        <w:rPr>
-          <w:rFonts w:ascii="Calibri" w:hAnsi="Calibri"/>
-          <w:sz w:val="21"/>
-        </w:rPr>
-        <w:t xml:space="preserve"> capture-only fails (same photo mechanism; </w:t>
-      </w:r>
-      <w:r>
-        <w:rPr>
-          <w:rFonts w:ascii="Calibri" w:hAnsi="Calibri"/>
-          <w:b/>
-          <w:sz w:val="21"/>
-        </w:rPr>
-        <w:t>cannot</w:t>
-      </w:r>
-      <w:r>
-        <w:rPr>
-          <w:rFonts w:ascii="Calibri" w:hAnsi="Calibri"/>
-          <w:sz w:val="21"/>
-        </w:rPr>
-        <w:t xml:space="preserve"> defer — liability). DL (1,166) is 100% uploaded-fail and </w:t>
-      </w:r>
-      <w:r>
-        <w:rPr>
-          <w:rFonts w:ascii="Calibri" w:hAnsi="Calibri"/>
-          <w:b/>
-          <w:sz w:val="21"/>
-        </w:rPr>
-        <w:t>cannot</w:t>
-      </w:r>
-      <w:r>
-        <w:rPr>
-          <w:rFonts w:ascii="Calibri" w:hAnsi="Calibri"/>
-          <w:sz w:val="21"/>
-        </w:rPr>
-        <w:t xml:space="preserve"> be deferred. Aadhaar / Permit / Fitness losses are real (1,540 / 2,616 / 2,653) but mostly </w:t>
-      </w:r>
-      <w:r>
-        <w:rPr>
-          <w:rFonts w:ascii="Calibri" w:hAnsi="Calibri"/>
-          <w:b/>
-          <w:sz w:val="21"/>
-        </w:rPr>
-        <w:t>never-uploaded</w:t>
-      </w:r>
-      <w:r>
-        <w:rPr>
-          <w:rFonts w:ascii="Calibri" w:hAnsi="Calibri"/>
-          <w:sz w:val="21"/>
-        </w:rPr>
-        <w:t xml:space="preserve"> or mixed with eligibility (expired, duplicate, name mismatch). A camera does not fix those. Rejected 409 already cleared docs — a gate.</w:t>
-      </w:r>
-    </w:p>
-    <w:p>
-      <w:r>
-        <w:rPr>
-          <w:rFonts w:ascii="Calibri" w:hAnsi="Calibri"/>
-          <w:b/>
-          <w:sz w:val="21"/>
-        </w:rPr>
-        <w:t>Leftover queue — possible, not banked.</w:t>
-      </w:r>
-      <w:r>
-        <w:rPr>
-          <w:rFonts w:ascii="Calibri" w:hAnsi="Calibri"/>
-          <w:sz w:val="21"/>
-        </w:rPr>
-        <w:t xml:space="preserve"> (1) Reuse C1b’s capture UX on every upload screen including DL — cheap once C1b ships; capture-only n not sized except RC/Insurance; do not add it to 180. (2) Never-upload RC (~2,388) and Insurance (~2,530): looks like a nudge; CAMP_WA_002 was 0pp and only 13 post-Fitness nudges exist in 7,644 people. Fos abandonment after Fitness is 26% vs paid 43% — in-person help, not WhatsApp. That is the </w:t>
-      </w:r>
-      <w:r>
-        <w:rPr>
-          <w:rFonts w:ascii="Calibri" w:hAnsi="Calibri"/>
-          <w:b/>
-          <w:sz w:val="21"/>
-        </w:rPr>
-        <w:t>assisted-onboarding RCT</w:t>
-      </w:r>
-      <w:r>
-        <w:rPr>
-          <w:rFonts w:ascii="Calibri" w:hAnsi="Calibri"/>
-          <w:sz w:val="21"/>
-        </w:rPr>
-        <w:t xml:space="preserve"> (unproven ceiling 128–256/month; overlaps 726 C1a captains; do not add). (3) Paid never-starts docs at 11.5% vs fos ~1% — channel quality; no CAC so not sized.</w:t>
-      </w:r>
-    </w:p>
-    <w:p>
-      <w:r>
-        <w:rPr>
-          <w:rFonts w:ascii="Calibri" w:hAnsi="Calibri"/>
-          <w:b/>
-          <w:sz w:val="21"/>
-        </w:rPr>
-        <w:t>How ~134 and ~50 are built.</w:t>
-      </w:r>
-      <w:r>
-        <w:rPr>
-          <w:rFonts w:ascii="Calibri" w:hAnsi="Calibri"/>
-          <w:sz w:val="21"/>
-        </w:rPr>
-        <w:t xml:space="preserve"> RC flow ~300/month × 60% show-up × 74% pass = </w:t>
-      </w:r>
-      <w:r>
-        <w:rPr>
-          <w:rFonts w:ascii="Calibri" w:hAnsi="Calibri"/>
-          <w:b/>
-          <w:sz w:val="21"/>
-        </w:rPr>
-        <w:t>~134</w:t>
-      </w:r>
-      <w:r>
-        <w:rPr>
-          <w:rFonts w:ascii="Calibri" w:hAnsi="Calibri"/>
-          <w:sz w:val="21"/>
-        </w:rPr>
-        <w:t xml:space="preserve">. Insurance 67→76% × 91% approved-if-cleared = </w:t>
-      </w:r>
-      <w:r>
-        <w:rPr>
-          <w:rFonts w:ascii="Calibri" w:hAnsi="Calibri"/>
-          <w:b/>
-          <w:sz w:val="21"/>
-        </w:rPr>
-        <w:t>~46–52</w:t>
-      </w:r>
-      <w:r>
-        <w:rPr>
-          <w:rFonts w:ascii="Calibri" w:hAnsi="Calibri"/>
-          <w:sz w:val="21"/>
-        </w:rPr>
-        <w:t xml:space="preserve">. If remaining docs still bind after RC, historical P(approved | passed RC) is 27% and C1a shrinks toward </w:t>
-      </w:r>
-      <w:r>
-        <w:rPr>
-          <w:rFonts w:ascii="Calibri" w:hAnsi="Calibri"/>
-          <w:b/>
-          <w:sz w:val="21"/>
-        </w:rPr>
-        <w:t>~36/month</w:t>
-      </w:r>
-      <w:r>
-        <w:rPr>
-          <w:rFonts w:ascii="Calibri" w:hAnsi="Calibri"/>
-          <w:sz w:val="21"/>
-        </w:rPr>
-        <w:t xml:space="preserve"> — that is the Legal ask (deferral-as-activation).</w:t>
-      </w:r>
-    </w:p>
-    <w:p>
-      <w:r>
-        <w:rPr>
-          <w:rFonts w:ascii="Calibri" w:hAnsi="Calibri"/>
-          <w:b/>
-          <w:sz w:val="21"/>
-        </w:rPr>
-        <w:t>ARA:</w:t>
-      </w:r>
-      <w:r>
-        <w:rPr>
-          <w:rFonts w:ascii="Calibri" w:hAnsi="Calibri"/>
-          <w:sz w:val="21"/>
-        </w:rPr>
-        <w:t xml:space="preserve"> ₹31.6 gap (₹24.9 vs ₹56.5) is a mean across *all* completed worst-suburban trips. ARA pays only the 89.31% with no return in 20 min → </w:t>
-      </w:r>
-      <w:r>
-        <w:rPr>
-          <w:rFonts w:ascii="Calibri" w:hAnsi="Calibri"/>
-          <w:b/>
-          <w:sz w:val="21"/>
-        </w:rPr>
-        <w:t>31.6 / 0.8931 ≈ ₹35.4</w:t>
-      </w:r>
-      <w:r>
-        <w:rPr>
-          <w:rFonts w:ascii="Calibri" w:hAnsi="Calibri"/>
-          <w:sz w:val="21"/>
-        </w:rPr>
-        <w:t>/leg. 80/100/120% → ~₹69–103k/month sample. 30% of fare (₹105) overpays. City-core ₹104.7 is geography.</w:t>
-      </w:r>
-    </w:p>
-    <w:p>
-      <w:r>
-        <w:rPr>
-          <w:b/>
-          <w:sz w:val="24"/>
-        </w:rPr>
-        <w:t>What I assumed, and what would change my answer</w:t>
-      </w:r>
-    </w:p>
-    <w:p>
-      <w:pPr>
-        <w:pStyle w:val="ListBullet"/>
-      </w:pPr>
-      <w:r>
-        <w:t>**~15.6-day cutoff.** Later capture-fails → 180 is a floor; they finish alone → slight overstatement.</w:t>
-      </w:r>
-    </w:p>
-    <w:p>
-      <w:pPr>
-        <w:pStyle w:val="ListBullet"/>
-      </w:pPr>
-      <w:r>
-        <w:t>**Document events**, not the approvals file, for which docs passed (disagree only while unfinished).</w:t>
-      </w:r>
-    </w:p>
-    <w:p>
-      <w:pPr>
-        <w:pStyle w:val="ListBullet"/>
-      </w:pPr>
-      <w:r>
-        <w:t>**Field vs app not banked** until a randomised assist test on ordinary app/paid signups.</w:t>
-      </w:r>
-    </w:p>
-    <w:p>
-      <w:pPr>
-        <w:pStyle w:val="ListBullet"/>
-      </w:pPr>
-      <w:r>
-        <w:t>**ARA = rest-suburban, not city-core.** Night suburban trips would have to get as short as city-core. They don’t.</w:t>
-      </w:r>
-    </w:p>
-    <w:p>
-      <w:pPr>
-        <w:pStyle w:val="ListBullet"/>
-      </w:pPr>
-      <w:r>
-        <w:t>**₹31.6 / 0.8931.** If night returns rise, re-derive; do not freeze ₹35.4.</w:t>
-      </w:r>
-    </w:p>
-    <w:p>
-      <w:pPr>
-        <w:pStyle w:val="ListBullet"/>
-      </w:pPr>
-      <w:r>
-        <w:t>**C1a ops ₹40–60k** assumes one FTE at 12–15 checks/day.</w:t>
-      </w:r>
-    </w:p>
-    <w:p>
-      <w:r>
-        <w:rPr>
-          <w:b/>
-          <w:sz w:val="24"/>
-        </w:rPr>
-        <w:t>Unresolved (not omitted)</w:t>
-      </w:r>
-    </w:p>
-    <w:p>
-      <w:r>
-        <w:rPr>
-          <w:rFonts w:ascii="Calibri" w:hAnsi="Calibri"/>
-          <w:sz w:val="21"/>
-        </w:rPr>
-        <w:t>No CAC — cannot price field vs paid. `airport_trips.csv` is sampled — rates hold; ₹/month is not a city budget. `signup_zone_id` does not join airport zones. Capture-only was not counted on Aadhaar/Permit/Fitness — reuse UX, then measure.</w:t>
+        <w:t>~15.6-day cutoff; doc_events not approvals.docs_cleared; field gap not banked; ARA vs rest-suburban not city-core; C1a FTE ₹40–60k assumed; trips file is sampled so ₹/month is not a city P&amp;L.</w:t>
       </w:r>
     </w:p>
     <w:sectPr>
       <w:pgSz w:w="12240" w:h="15840"/>
-      <w:pgMar w:top="1008" w:right="1224" w:bottom="1008" w:left="1224" w:header="720" w:footer="720" w:gutter="0"/>
+      <w:pgMar w:top="792" w:right="1008" w:bottom="792" w:left="1008" w:header="720" w:footer="720" w:gutter="0"/>
       <w:cols w:space="720"/>
       <w:docGrid w:linePitch="360"/>
     </w:sectPr>

</xml_diff>

<commit_message>
Show the pie PNGs on the deck and switch to yellow–orange–red.
Headline, RC, Insurance, and overnight pies are embedded images so they actually show. Slides use Rapido yellow, orange, and red fills instead of navy.

Co-authored-by: KRRamanathan <KRRamanathan@users.noreply.github.com>
</commit_message>
<xml_diff>
--- a/MEMO.docx
+++ b/MEMO.docx
@@ -240,7 +240,7 @@
         <w:tc>
           <w:tcPr>
             <w:tcW w:type="dxa" w:w="2556"/>
-            <w:shd w:fill="FFF8E1" w:val="clear"/>
+            <w:shd w:fill="FFE8C2" w:val="clear"/>
           </w:tcPr>
           <w:p>
             <w:r>
@@ -257,7 +257,7 @@
         <w:tc>
           <w:tcPr>
             <w:tcW w:type="dxa" w:w="2556"/>
-            <w:shd w:fill="FFF8E1" w:val="clear"/>
+            <w:shd w:fill="FFE8C2" w:val="clear"/>
           </w:tcPr>
           <w:p>
             <w:r>
@@ -274,7 +274,7 @@
         <w:tc>
           <w:tcPr>
             <w:tcW w:type="dxa" w:w="2556"/>
-            <w:shd w:fill="FFF8E1" w:val="clear"/>
+            <w:shd w:fill="FFE8C2" w:val="clear"/>
           </w:tcPr>
           <w:p>
             <w:r>
@@ -291,7 +291,7 @@
         <w:tc>
           <w:tcPr>
             <w:tcW w:type="dxa" w:w="2556"/>
-            <w:shd w:fill="FFF8E1" w:val="clear"/>
+            <w:shd w:fill="FFE8C2" w:val="clear"/>
           </w:tcPr>
           <w:p>
             <w:r>
@@ -310,7 +310,7 @@
         <w:tc>
           <w:tcPr>
             <w:tcW w:type="dxa" w:w="2556"/>
-            <w:shd w:fill="FFFDF6" w:val="clear"/>
+            <w:shd w:fill="FFF6E8" w:val="clear"/>
           </w:tcPr>
           <w:p>
             <w:r>
@@ -327,7 +327,7 @@
         <w:tc>
           <w:tcPr>
             <w:tcW w:type="dxa" w:w="2556"/>
-            <w:shd w:fill="FFFDF6" w:val="clear"/>
+            <w:shd w:fill="FFF6E8" w:val="clear"/>
           </w:tcPr>
           <w:p>
             <w:r>
@@ -344,7 +344,7 @@
         <w:tc>
           <w:tcPr>
             <w:tcW w:type="dxa" w:w="2556"/>
-            <w:shd w:fill="FFFDF6" w:val="clear"/>
+            <w:shd w:fill="FFF6E8" w:val="clear"/>
           </w:tcPr>
           <w:p>
             <w:r>
@@ -361,7 +361,7 @@
         <w:tc>
           <w:tcPr>
             <w:tcW w:type="dxa" w:w="2556"/>
-            <w:shd w:fill="FFFDF6" w:val="clear"/>
+            <w:shd w:fill="FFF6E8" w:val="clear"/>
           </w:tcPr>
           <w:p>
             <w:r>
@@ -380,7 +380,7 @@
         <w:tc>
           <w:tcPr>
             <w:tcW w:type="dxa" w:w="2556"/>
-            <w:shd w:fill="FFF8E1" w:val="clear"/>
+            <w:shd w:fill="FFE8C2" w:val="clear"/>
           </w:tcPr>
           <w:p>
             <w:r>
@@ -397,7 +397,7 @@
         <w:tc>
           <w:tcPr>
             <w:tcW w:type="dxa" w:w="2556"/>
-            <w:shd w:fill="FFF8E1" w:val="clear"/>
+            <w:shd w:fill="FFE8C2" w:val="clear"/>
           </w:tcPr>
           <w:p>
             <w:r>
@@ -414,7 +414,7 @@
         <w:tc>
           <w:tcPr>
             <w:tcW w:type="dxa" w:w="2556"/>
-            <w:shd w:fill="FFF8E1" w:val="clear"/>
+            <w:shd w:fill="FFE8C2" w:val="clear"/>
           </w:tcPr>
           <w:p>
             <w:r>
@@ -431,7 +431,7 @@
         <w:tc>
           <w:tcPr>
             <w:tcW w:type="dxa" w:w="2556"/>
-            <w:shd w:fill="FFF8E1" w:val="clear"/>
+            <w:shd w:fill="FFE8C2" w:val="clear"/>
           </w:tcPr>
           <w:p>
             <w:r>

</xml_diff>

<commit_message>
Rewrite the Word memo as a full two-page yellow–orange–red packet.
Page 1 is the ranked ask plus the two headline pies. Page 2 is the bound: leftover queue, derived ARA, and assumptions — not a second copy of the deck.

Co-authored-by: KRRamanathan <KRRamanathan@users.noreply.github.com>
</commit_message>
<xml_diff>
--- a/MEMO.docx
+++ b/MEMO.docx
@@ -1,22 +1,27 @@
 
 <file path=word/document.xml><?xml version="1.0" encoding="utf-8"?>
 <w:document xmlns:wpc="http://schemas.microsoft.com/office/word/2010/wordprocessingCanvas" xmlns:mo="http://schemas.microsoft.com/office/mac/office/2008/main" xmlns:mc="http://schemas.openxmlformats.org/markup-compatibility/2006" xmlns:mv="urn:schemas-microsoft-com:mac:vml" xmlns:o="urn:schemas-microsoft-com:office:office" xmlns:r="http://schemas.openxmlformats.org/officeDocument/2006/relationships" xmlns:m="http://schemas.openxmlformats.org/officeDocument/2006/math" xmlns:v="urn:schemas-microsoft-com:vml" xmlns:wp14="http://schemas.microsoft.com/office/word/2010/wordprocessingDrawing" xmlns:wp="http://schemas.openxmlformats.org/drawingml/2006/wordprocessingDrawing" xmlns:w10="urn:schemas-microsoft-com:office:word" xmlns:w="http://schemas.openxmlformats.org/wordprocessingml/2006/main" xmlns:w14="http://schemas.microsoft.com/office/word/2010/wordml" xmlns:wpg="http://schemas.microsoft.com/office/word/2010/wordprocessingGroup" xmlns:wpi="http://schemas.microsoft.com/office/word/2010/wordprocessingInk" xmlns:wne="http://schemas.microsoft.com/office/word/2006/wordml" xmlns:wps="http://schemas.microsoft.com/office/word/2010/wordprocessingShape" mc:Ignorable="w14 wp14">
+  <w:background w:color="FFE8C2"/>
   <w:body>
     <w:tbl>
       <w:tblPr>
         <w:tblW w:type="auto" w:w="0"/>
+        <w:tblLayout w:type="autofit"/>
         <w:tblLook w:firstColumn="1" w:firstRow="1" w:lastColumn="0" w:lastRow="0" w:noHBand="0" w:noVBand="1" w:val="04A0"/>
       </w:tblPr>
       <w:tblGrid>
-        <w:gridCol w:w="10224"/>
+        <w:gridCol w:w="10368"/>
       </w:tblGrid>
       <w:tr>
         <w:tc>
           <w:tcPr>
-            <w:tcW w:type="dxa" w:w="10224"/>
+            <w:tcW w:type="dxa" w:w="10368"/>
             <w:shd w:fill="FFC400" w:val="clear"/>
           </w:tcPr>
           <w:p>
+            <w:pPr>
+              <w:spacing w:after="40" w:before="40" w:line="240" w:lineRule="auto"/>
+            </w:pPr>
             <w:r>
               <w:rPr>
                 <w:rFonts w:ascii="Calibri" w:hAnsi="Calibri"/>
@@ -24,24 +29,21 @@
                 <w:color w:val="1E2761"/>
                 <w:sz w:val="20"/>
               </w:rPr>
-              <w:t>RAPIDO  ·  MEMO TO THE HEAD OF SUPPLY</w:t>
-            </w:r>
-          </w:p>
-          <w:p>
-            <w:r>
-              <w:rPr>
-                <w:rFonts w:ascii="Calibri" w:hAnsi="Calibri"/>
-                <w:b w:val="0"/>
-                <w:color w:val="1E2761"/>
-                <w:sz w:val="18"/>
-              </w:rPr>
-              <w:t>Onboarding leak and overnight airport  ·  Ramanathan K R  ·  10 Sep 2026  ·  extract 30 Jun 2026, 23:59 IST</w:t>
+              <w:t>RAPIDO  ·  MEMO TO THE HEAD OF SUPPLY  ·  Ramanathan K R  ·  10 Sep 2026  ·  extract 30 Jun 2026, 23:59 IST</w:t>
             </w:r>
           </w:p>
         </w:tc>
       </w:tr>
     </w:tbl>
     <w:p>
+      <w:pPr>
+        <w:spacing w:after="80" w:before="0" w:line="240" w:lineRule="auto"/>
+      </w:pPr>
+    </w:p>
+    <w:p>
+      <w:pPr>
+        <w:spacing w:after="120" w:before="0" w:line="240" w:lineRule="auto"/>
+      </w:pPr>
       <w:r>
         <w:rPr>
           <w:rFonts w:ascii="Cambria" w:hAnsi="Cambria"/>
@@ -49,28 +51,32 @@
           <w:color w:val="1E2761"/>
           <w:sz w:val="32"/>
         </w:rPr>
-        <w:t>~180 more approved captains a month — two photo fixes, not a hiring push</w:t>
+        <w:t>~180 more approved captains a month — two photo fixes, not five programmes</w:t>
       </w:r>
     </w:p>
     <w:p>
+      <w:pPr>
+        <w:spacing w:after="120" w:before="0" w:line="240" w:lineRule="auto"/>
+      </w:pPr>
       <w:r>
         <w:rPr>
           <w:rFonts w:ascii="Calibri" w:hAnsi="Calibri"/>
           <w:b w:val="0"/>
-          <w:color w:val="333333"/>
+          <w:color w:val="3A2208"/>
           <w:sz w:val="21"/>
         </w:rPr>
-        <w:t>The ask. Ship Insurance camera UX this week, then a 10-day RC grace after Legal. Do not hire the airport catchment. Stop scaling CAMP_WA_002. Medium confidence on 180; the campaign call is a hard no. These approvals are not hollow: 98.7% of mature approved captains already take a first trip (3,895 / 3,946).</w:t>
+        <w:t>Bank only two disjoint capture fixes: ~134/month from a 10-day in-person RC grace (C1a) and ~50 from Insurance upload UX (C1b). 98.7% of mature approved captains already take a first trip (3,895 / 3,946) — documents are the bottleneck, not first-order. Show-up for RC is unobserved; if Legal will not treat deferred RC as activation, C1a shrinks toward ~36/month. That is the only number I would put in a deck with my name on the campaign: 0 pp, not 5×.</w:t>
       </w:r>
     </w:p>
     <w:p>
       <w:pPr>
+        <w:spacing w:after="40" w:before="0" w:line="240" w:lineRule="auto"/>
         <w:jc w:val="center"/>
       </w:pPr>
       <w:r>
         <w:drawing>
           <wp:inline xmlns:a="http://schemas.openxmlformats.org/drawingml/2006/main" xmlns:pic="http://schemas.openxmlformats.org/drawingml/2006/picture">
-            <wp:extent cx="2880360" cy="1626149"/>
+            <wp:extent cx="3063240" cy="1729397"/>
             <wp:docPr id="1" name="Picture 1"/>
             <wp:cNvGraphicFramePr>
               <a:graphicFrameLocks noChangeAspect="1"/>
@@ -91,7 +97,7 @@
                   <pic:spPr>
                     <a:xfrm>
                       <a:off x="0" y="0"/>
-                      <a:ext cx="2880360" cy="1626149"/>
+                      <a:ext cx="3063240" cy="1729397"/>
                     </a:xfrm>
                     <a:prstGeom prst="rect"/>
                   </pic:spPr>
@@ -107,7 +113,7 @@
       <w:r>
         <w:drawing>
           <wp:inline xmlns:a="http://schemas.openxmlformats.org/drawingml/2006/main" xmlns:pic="http://schemas.openxmlformats.org/drawingml/2006/picture">
-            <wp:extent cx="2880360" cy="2028292"/>
+            <wp:extent cx="3063240" cy="2157072"/>
             <wp:docPr id="2" name="Picture 2"/>
             <wp:cNvGraphicFramePr>
               <a:graphicFrameLocks noChangeAspect="1"/>
@@ -128,7 +134,7 @@
                   <pic:spPr>
                     <a:xfrm>
                       <a:off x="0" y="0"/>
-                      <a:ext cx="2880360" cy="2028292"/>
+                      <a:ext cx="3063240" cy="2157072"/>
                     </a:xfrm>
                     <a:prstGeom prst="rect"/>
                   </pic:spPr>
@@ -143,15 +149,56 @@
       </w:r>
     </w:p>
     <w:p>
+      <w:pPr>
+        <w:spacing w:after="160" w:before="0" w:line="240" w:lineRule="auto"/>
+        <w:jc w:val="center"/>
+      </w:pPr>
       <w:r>
         <w:rPr>
-          <w:rFonts w:ascii="Cambria" w:hAnsi="Cambria"/>
-          <w:b/>
-          <w:color w:val="1C7293"/>
-          <w:sz w:val="26"/>
+          <w:rFonts w:ascii="Calibri" w:hAnsi="Calibri"/>
+          <w:b w:val="0"/>
+          <w:color w:val="6B4A2A"/>
+          <w:sz w:val="17"/>
         </w:rPr>
-        <w:t>What to do this week</w:t>
+        <w:t>Left: bank C1a + C1b only. Right: 84% of airport unfulfilled volume is 21:00–03:59.</w:t>
       </w:r>
+    </w:p>
+    <w:tbl>
+      <w:tblPr>
+        <w:tblW w:type="auto" w:w="0"/>
+        <w:tblLayout w:type="autofit"/>
+        <w:tblLook w:firstColumn="1" w:firstRow="1" w:lastColumn="0" w:lastRow="0" w:noHBand="0" w:noVBand="1" w:val="04A0"/>
+      </w:tblPr>
+      <w:tblGrid>
+        <w:gridCol w:w="10368"/>
+      </w:tblGrid>
+      <w:tr>
+        <w:tc>
+          <w:tcPr>
+            <w:tcW w:type="dxa" w:w="10368"/>
+            <w:shd w:fill="FF8A3D" w:val="clear"/>
+          </w:tcPr>
+          <w:p>
+            <w:pPr>
+              <w:spacing w:after="40" w:before="40" w:line="240" w:lineRule="auto"/>
+            </w:pPr>
+            <w:r>
+              <w:rPr>
+                <w:rFonts w:ascii="Calibri" w:hAnsi="Calibri"/>
+                <w:b/>
+                <w:color w:val="FFFFFF"/>
+                <w:sz w:val="22"/>
+              </w:rPr>
+              <w:t>PAGE 1  ·  WHAT TO DO THIS WEEK</w:t>
+            </w:r>
+          </w:p>
+        </w:tc>
+      </w:tr>
+    </w:tbl>
+    <w:p>
+      <w:pPr>
+        <w:spacing w:after="80" w:before="0" w:line="240" w:lineRule="auto"/>
+      </w:pPr>
     </w:p>
     <w:tbl>
       <w:tblPr>
@@ -161,24 +208,28 @@
         <w:tblLook w:firstColumn="1" w:firstRow="1" w:lastColumn="0" w:lastRow="0" w:noHBand="0" w:noVBand="1" w:val="04A0"/>
       </w:tblPr>
       <w:tblGrid>
-        <w:gridCol w:w="2556"/>
-        <w:gridCol w:w="2556"/>
-        <w:gridCol w:w="2556"/>
-        <w:gridCol w:w="2556"/>
+        <w:gridCol w:w="2074"/>
+        <w:gridCol w:w="2074"/>
+        <w:gridCol w:w="2074"/>
+        <w:gridCol w:w="2074"/>
+        <w:gridCol w:w="2074"/>
       </w:tblGrid>
       <w:tr>
         <w:tc>
           <w:tcPr>
-            <w:tcW w:type="dxa" w:w="2556"/>
-            <w:shd w:fill="1E2761" w:val="clear"/>
+            <w:tcW w:type="dxa" w:w="576"/>
+            <w:shd w:fill="E85D4C" w:val="clear"/>
           </w:tcPr>
           <w:p>
+            <w:pPr>
+              <w:spacing w:after="40" w:before="40" w:line="240" w:lineRule="auto"/>
+            </w:pPr>
             <w:r>
               <w:rPr>
                 <w:rFonts w:ascii="Calibri" w:hAnsi="Calibri"/>
                 <w:b/>
                 <w:color w:val="FFFFFF"/>
-                <w:sz w:val="18"/>
+                <w:sz w:val="17"/>
               </w:rPr>
               <w:t>#</w:t>
             </w:r>
@@ -186,16 +237,19 @@
         </w:tc>
         <w:tc>
           <w:tcPr>
-            <w:tcW w:type="dxa" w:w="2556"/>
-            <w:shd w:fill="1E2761" w:val="clear"/>
+            <w:tcW w:type="dxa" w:w="3672"/>
+            <w:shd w:fill="E85D4C" w:val="clear"/>
           </w:tcPr>
           <w:p>
+            <w:pPr>
+              <w:spacing w:after="40" w:before="40" w:line="240" w:lineRule="auto"/>
+            </w:pPr>
             <w:r>
               <w:rPr>
                 <w:rFonts w:ascii="Calibri" w:hAnsi="Calibri"/>
                 <w:b/>
                 <w:color w:val="FFFFFF"/>
-                <w:sz w:val="18"/>
+                <w:sz w:val="17"/>
               </w:rPr>
               <w:t>Do this</w:t>
             </w:r>
@@ -203,16 +257,19 @@
         </w:tc>
         <w:tc>
           <w:tcPr>
-            <w:tcW w:type="dxa" w:w="2556"/>
-            <w:shd w:fill="1E2761" w:val="clear"/>
+            <w:tcW w:type="dxa" w:w="2232"/>
+            <w:shd w:fill="E85D4C" w:val="clear"/>
           </w:tcPr>
           <w:p>
+            <w:pPr>
+              <w:spacing w:after="40" w:before="40" w:line="240" w:lineRule="auto"/>
+            </w:pPr>
             <w:r>
               <w:rPr>
                 <w:rFonts w:ascii="Calibri" w:hAnsi="Calibri"/>
                 <w:b/>
                 <w:color w:val="FFFFFF"/>
-                <w:sz w:val="18"/>
+                <w:sz w:val="17"/>
               </w:rPr>
               <w:t>Impact</w:t>
             </w:r>
@@ -220,16 +277,39 @@
         </w:tc>
         <w:tc>
           <w:tcPr>
-            <w:tcW w:type="dxa" w:w="2556"/>
-            <w:shd w:fill="1E2761" w:val="clear"/>
+            <w:tcW w:type="dxa" w:w="2448"/>
+            <w:shd w:fill="E85D4C" w:val="clear"/>
           </w:tcPr>
           <w:p>
+            <w:pPr>
+              <w:spacing w:after="40" w:before="40" w:line="240" w:lineRule="auto"/>
+            </w:pPr>
             <w:r>
               <w:rPr>
                 <w:rFonts w:ascii="Calibri" w:hAnsi="Calibri"/>
                 <w:b/>
                 <w:color w:val="FFFFFF"/>
-                <w:sz w:val="18"/>
+                <w:sz w:val="17"/>
+              </w:rPr>
+              <w:t>Cost / risk</w:t>
+            </w:r>
+          </w:p>
+        </w:tc>
+        <w:tc>
+          <w:tcPr>
+            <w:tcW w:type="dxa" w:w="2160"/>
+            <w:shd w:fill="E85D4C" w:val="clear"/>
+          </w:tcPr>
+          <w:p>
+            <w:pPr>
+              <w:spacing w:after="40" w:before="40" w:line="240" w:lineRule="auto"/>
+            </w:pPr>
+            <w:r>
+              <w:rPr>
+                <w:rFonts w:ascii="Calibri" w:hAnsi="Calibri"/>
+                <w:b/>
+                <w:color w:val="FFFFFF"/>
+                <w:sz w:val="17"/>
               </w:rPr>
               <w:t>Watch</w:t>
             </w:r>
@@ -239,16 +319,19 @@
       <w:tr>
         <w:tc>
           <w:tcPr>
-            <w:tcW w:type="dxa" w:w="2556"/>
+            <w:tcW w:type="dxa" w:w="576"/>
             <w:shd w:fill="FFE8C2" w:val="clear"/>
           </w:tcPr>
           <w:p>
+            <w:pPr>
+              <w:spacing w:after="60" w:before="40" w:line="240" w:lineRule="auto"/>
+            </w:pPr>
             <w:r>
               <w:rPr>
                 <w:rFonts w:ascii="Calibri" w:hAnsi="Calibri"/>
                 <w:b/>
                 <w:color w:val="1E2761"/>
-                <w:sz w:val="17"/>
+                <w:sz w:val="16"/>
               </w:rPr>
               <w:t>1</w:t>
             </w:r>
@@ -256,50 +339,79 @@
         </w:tc>
         <w:tc>
           <w:tcPr>
-            <w:tcW w:type="dxa" w:w="2556"/>
+            <w:tcW w:type="dxa" w:w="3672"/>
             <w:shd w:fill="FFE8C2" w:val="clear"/>
           </w:tcPr>
           <w:p>
+            <w:pPr>
+              <w:spacing w:after="60" w:before="40" w:line="240" w:lineRule="auto"/>
+            </w:pPr>
             <w:r>
               <w:rPr>
                 <w:rFonts w:ascii="Calibri" w:hAnsi="Calibri"/>
                 <w:b w:val="0"/>
-                <w:color w:val="333333"/>
-                <w:sz w:val="17"/>
+                <w:color w:val="3A2208"/>
+                <w:sz w:val="16"/>
               </w:rPr>
-              <w:t>C1b Insurance camera this week (411), then C1a 10-day RC grace after Legal (1,637). Same camera on other docs is a free rider — not in the 180.</w:t>
+              <w:t>C1b Insurance camera this week (411). Then C1a 10-day RC grace after Legal (1,637). Same camera on other docs: free rider, not in 180.</w:t>
             </w:r>
           </w:p>
         </w:tc>
         <w:tc>
           <w:tcPr>
-            <w:tcW w:type="dxa" w:w="2556"/>
+            <w:tcW w:type="dxa" w:w="2232"/>
             <w:shd w:fill="FFE8C2" w:val="clear"/>
           </w:tcPr>
           <w:p>
+            <w:pPr>
+              <w:spacing w:after="60" w:before="40" w:line="240" w:lineRule="auto"/>
+            </w:pPr>
             <w:r>
               <w:rPr>
                 <w:rFonts w:ascii="Calibri" w:hAnsi="Calibri"/>
                 <w:b w:val="0"/>
-                <w:color w:val="333333"/>
-                <w:sz w:val="17"/>
+                <w:color w:val="3A2208"/>
+                <w:sz w:val="16"/>
               </w:rPr>
-              <w:t>~180/mo (~50 + ~134). C1a ops ~1 FTE ₹40–60k assumed.</w:t>
+              <w:t>~180/mo (~50 + ~134)</w:t>
             </w:r>
           </w:p>
         </w:tc>
         <w:tc>
           <w:tcPr>
-            <w:tcW w:type="dxa" w:w="2556"/>
+            <w:tcW w:type="dxa" w:w="2448"/>
             <w:shd w:fill="FFE8C2" w:val="clear"/>
           </w:tcPr>
           <w:p>
+            <w:pPr>
+              <w:spacing w:after="60" w:before="40" w:line="240" w:lineRule="auto"/>
+            </w:pPr>
             <w:r>
               <w:rPr>
                 <w:rFonts w:ascii="Calibri" w:hAnsi="Calibri"/>
                 <w:b w:val="0"/>
-                <w:color w:val="333333"/>
-                <w:sz w:val="17"/>
+                <w:color w:val="3A2208"/>
+                <w:sz w:val="16"/>
+              </w:rPr>
+              <w:t>C1b: engineering. C1a: Legal/T&amp;S + ~1 FTE ₹40–60k (assumed).</w:t>
+            </w:r>
+          </w:p>
+        </w:tc>
+        <w:tc>
+          <w:tcPr>
+            <w:tcW w:type="dxa" w:w="2160"/>
+            <w:shd w:fill="FFE8C2" w:val="clear"/>
+          </w:tcPr>
+          <w:p>
+            <w:pPr>
+              <w:spacing w:after="60" w:before="40" w:line="240" w:lineRule="auto"/>
+            </w:pPr>
+            <w:r>
+              <w:rPr>
+                <w:rFonts w:ascii="Calibri" w:hAnsi="Calibri"/>
+                <w:b w:val="0"/>
+                <w:color w:val="3A2208"/>
+                <w:sz w:val="16"/>
               </w:rPr>
               <w:t>Approved by cohort</w:t>
             </w:r>
@@ -309,16 +421,19 @@
       <w:tr>
         <w:tc>
           <w:tcPr>
-            <w:tcW w:type="dxa" w:w="2556"/>
+            <w:tcW w:type="dxa" w:w="576"/>
             <w:shd w:fill="FFF6E8" w:val="clear"/>
           </w:tcPr>
           <w:p>
+            <w:pPr>
+              <w:spacing w:after="60" w:before="40" w:line="240" w:lineRule="auto"/>
+            </w:pPr>
             <w:r>
               <w:rPr>
                 <w:rFonts w:ascii="Calibri" w:hAnsi="Calibri"/>
                 <w:b/>
                 <w:color w:val="1E2761"/>
-                <w:sz w:val="17"/>
+                <w:sz w:val="16"/>
               </w:rPr>
               <w:t>2</w:t>
             </w:r>
@@ -326,52 +441,81 @@
         </w:tc>
         <w:tc>
           <w:tcPr>
-            <w:tcW w:type="dxa" w:w="2556"/>
+            <w:tcW w:type="dxa" w:w="3672"/>
             <w:shd w:fill="FFF6E8" w:val="clear"/>
           </w:tcPr>
           <w:p>
+            <w:pPr>
+              <w:spacing w:after="60" w:before="40" w:line="240" w:lineRule="auto"/>
+            </w:pPr>
             <w:r>
               <w:rPr>
                 <w:rFonts w:ascii="Calibri" w:hAnsi="Calibri"/>
                 <w:b w:val="0"/>
-                <w:color w:val="333333"/>
-                <w:sz w:val="17"/>
+                <w:color w:val="3A2208"/>
+                <w:sz w:val="16"/>
               </w:rPr>
-              <w:t>Airport Return Assurance at ₹35.4 per unpaid night-suburban leg. Do not hire the catchment.</w:t>
+              <w:t>Airport Return Assurance at ₹35.4 / unpaid night-suburban leg. Do not hire the catchment.</w:t>
             </w:r>
           </w:p>
         </w:tc>
         <w:tc>
           <w:tcPr>
-            <w:tcW w:type="dxa" w:w="2556"/>
+            <w:tcW w:type="dxa" w:w="2232"/>
             <w:shd w:fill="FFF6E8" w:val="clear"/>
           </w:tcPr>
           <w:p>
+            <w:pPr>
+              <w:spacing w:after="60" w:before="40" w:line="240" w:lineRule="auto"/>
+            </w:pPr>
             <w:r>
               <w:rPr>
                 <w:rFonts w:ascii="Calibri" w:hAnsi="Calibri"/>
                 <w:b w:val="0"/>
-                <w:color w:val="333333"/>
-                <w:sz w:val="17"/>
+                <w:color w:val="3A2208"/>
+                <w:sz w:val="16"/>
               </w:rPr>
-              <w:t>Sample ~₹69–103k/mo. Rest-suburban, not city-core.</w:t>
+              <w:t>Sample ~₹69–103k/mo. Restores rest-suburban net.</w:t>
             </w:r>
           </w:p>
         </w:tc>
         <w:tc>
           <w:tcPr>
-            <w:tcW w:type="dxa" w:w="2556"/>
+            <w:tcW w:type="dxa" w:w="2448"/>
             <w:shd w:fill="FFF6E8" w:val="clear"/>
           </w:tcPr>
           <w:p>
+            <w:pPr>
+              <w:spacing w:after="60" w:before="40" w:line="240" w:lineRule="auto"/>
+            </w:pPr>
             <w:r>
               <w:rPr>
                 <w:rFonts w:ascii="Calibri" w:hAnsi="Calibri"/>
                 <w:b w:val="0"/>
-                <w:color w:val="333333"/>
-                <w:sz w:val="17"/>
+                <w:color w:val="3A2208"/>
+                <w:sz w:val="16"/>
               </w:rPr>
-              <w:t>Return-in-20m, cancels, falling 4-week run-rate</w:t>
+              <w:t>Sampled trips ≠ city P&amp;L. Not city-core.</w:t>
+            </w:r>
+          </w:p>
+        </w:tc>
+        <w:tc>
+          <w:tcPr>
+            <w:tcW w:type="dxa" w:w="2160"/>
+            <w:shd w:fill="FFF6E8" w:val="clear"/>
+          </w:tcPr>
+          <w:p>
+            <w:pPr>
+              <w:spacing w:after="60" w:before="40" w:line="240" w:lineRule="auto"/>
+            </w:pPr>
+            <w:r>
+              <w:rPr>
+                <w:rFonts w:ascii="Calibri" w:hAnsi="Calibri"/>
+                <w:b w:val="0"/>
+                <w:color w:val="3A2208"/>
+                <w:sz w:val="16"/>
+              </w:rPr>
+              <w:t>Return-in-20m, cancels, falling 4-wk run-rate</w:t>
             </w:r>
           </w:p>
         </w:tc>
@@ -379,16 +523,19 @@
       <w:tr>
         <w:tc>
           <w:tcPr>
-            <w:tcW w:type="dxa" w:w="2556"/>
+            <w:tcW w:type="dxa" w:w="576"/>
             <w:shd w:fill="FFE8C2" w:val="clear"/>
           </w:tcPr>
           <w:p>
+            <w:pPr>
+              <w:spacing w:after="60" w:before="40" w:line="240" w:lineRule="auto"/>
+            </w:pPr>
             <w:r>
               <w:rPr>
                 <w:rFonts w:ascii="Calibri" w:hAnsi="Calibri"/>
                 <w:b/>
                 <w:color w:val="1E2761"/>
-                <w:sz w:val="17"/>
+                <w:sz w:val="16"/>
               </w:rPr>
               <w:t>3</w:t>
             </w:r>
@@ -396,50 +543,79 @@
         </w:tc>
         <w:tc>
           <w:tcPr>
-            <w:tcW w:type="dxa" w:w="2556"/>
+            <w:tcW w:type="dxa" w:w="3672"/>
             <w:shd w:fill="FFE8C2" w:val="clear"/>
           </w:tcPr>
           <w:p>
+            <w:pPr>
+              <w:spacing w:after="60" w:before="40" w:line="240" w:lineRule="auto"/>
+            </w:pPr>
             <w:r>
               <w:rPr>
                 <w:rFonts w:ascii="Calibri" w:hAnsi="Calibri"/>
                 <w:b w:val="0"/>
-                <w:color w:val="333333"/>
-                <w:sz w:val="17"/>
+                <w:color w:val="3A2208"/>
+                <w:sz w:val="16"/>
               </w:rPr>
-              <w:t>Stop CAMP_WA_002 5×. Send/no-send RCT on RC-cleared app/paid captains only.</w:t>
+              <w:t>Kill CAMP_WA_002 5×. Send/no-send RCT on RC-cleared app/paid captains, no other campaign.</w:t>
             </w:r>
           </w:p>
         </w:tc>
         <w:tc>
           <w:tcPr>
-            <w:tcW w:type="dxa" w:w="2556"/>
+            <w:tcW w:type="dxa" w:w="2232"/>
             <w:shd w:fill="FFE8C2" w:val="clear"/>
           </w:tcPr>
           <w:p>
+            <w:pPr>
+              <w:spacing w:after="60" w:before="40" w:line="240" w:lineRule="auto"/>
+            </w:pPr>
             <w:r>
               <w:rPr>
                 <w:rFonts w:ascii="Calibri" w:hAnsi="Calibri"/>
                 <w:b w:val="0"/>
-                <w:color w:val="333333"/>
-                <w:sz w:val="17"/>
+                <w:color w:val="3A2208"/>
+                <w:sz w:val="16"/>
               </w:rPr>
-              <w:t>0 pp click lift. Cost avoided + answer in 4–6 weeks.</w:t>
+              <w:t>0 pp lift. Cost avoided + 4–6 week answer.</w:t>
             </w:r>
           </w:p>
         </w:tc>
         <w:tc>
           <w:tcPr>
-            <w:tcW w:type="dxa" w:w="2556"/>
+            <w:tcW w:type="dxa" w:w="2448"/>
             <w:shd w:fill="FFE8C2" w:val="clear"/>
           </w:tcPr>
           <w:p>
+            <w:pPr>
+              <w:spacing w:after="60" w:before="40" w:line="240" w:lineRule="auto"/>
+            </w:pPr>
             <w:r>
               <w:rPr>
                 <w:rFonts w:ascii="Calibri" w:hAnsi="Calibri"/>
                 <w:b w:val="0"/>
-                <w:color w:val="333333"/>
-                <w:sz w:val="17"/>
+                <w:color w:val="3A2208"/>
+                <w:sz w:val="16"/>
+              </w:rPr>
+              <w:t>Near zero</w:t>
+            </w:r>
+          </w:p>
+        </w:tc>
+        <w:tc>
+          <w:tcPr>
+            <w:tcW w:type="dxa" w:w="2160"/>
+            <w:shd w:fill="FFE8C2" w:val="clear"/>
+          </w:tcPr>
+          <w:p>
+            <w:pPr>
+              <w:spacing w:after="60" w:before="40" w:line="240" w:lineRule="auto"/>
+            </w:pPr>
+            <w:r>
+              <w:rPr>
+                <w:rFonts w:ascii="Calibri" w:hAnsi="Calibri"/>
+                <w:b w:val="0"/>
+                <w:color w:val="3A2208"/>
+                <w:sz w:val="16"/>
               </w:rPr>
               <w:t>Aadhaar pass and approved</w:t>
             </w:r>
@@ -448,35 +624,136 @@
       </w:tr>
     </w:tbl>
     <w:p>
+      <w:pPr>
+        <w:spacing w:after="120" w:before="0" w:line="240" w:lineRule="auto"/>
+      </w:pPr>
+    </w:p>
+    <w:tbl>
+      <w:tblPr>
+        <w:tblW w:type="auto" w:w="0"/>
+        <w:tblLook w:firstColumn="1" w:firstRow="1" w:lastColumn="0" w:lastRow="0" w:noHBand="0" w:noVBand="1" w:val="04A0"/>
+      </w:tblPr>
+      <w:tblGrid>
+        <w:gridCol w:w="5184"/>
+        <w:gridCol w:w="5184"/>
+      </w:tblGrid>
+      <w:tr>
+        <w:tc>
+          <w:tcPr>
+            <w:tcW w:type="dxa" w:w="5112"/>
+            <w:shd w:fill="FF8A3D" w:val="clear"/>
+          </w:tcPr>
+          <w:p>
+            <w:r>
+              <w:rPr>
+                <w:rFonts w:ascii="Calibri" w:hAnsi="Calibri"/>
+                <w:b/>
+                <w:color w:val="FFFFFF"/>
+                <w:sz w:val="20"/>
+              </w:rPr>
+              <w:t>Why rec 2 is “do not hire”</w:t>
+              <w:br/>
+            </w:r>
+            <w:r>
+              <w:rPr>
+                <w:rFonts w:ascii="Calibri" w:hAnsi="Calibri"/>
+                <w:b w:val="0"/>
+                <w:color w:val="FFFFFF"/>
+                <w:sz w:val="18"/>
+              </w:rPr>
+              <w:t>Terminals ~40% unfulfilled vs ~3% elsewhere. After the trip, suburban backhaul and overnight return-collapse compound. Mix does not shift after dark (χ² p=0.12). New hires inherit both penalties. Price the deadhead for 4 weeks; hire only if the payout run-rate is not falling.</w:t>
+            </w:r>
+          </w:p>
+        </w:tc>
+        <w:tc>
+          <w:tcPr>
+            <w:tcW w:type="dxa" w:w="5112"/>
+            <w:shd w:fill="E85D4C" w:val="clear"/>
+          </w:tcPr>
+          <w:p>
+            <w:r>
+              <w:rPr>
+                <w:rFonts w:ascii="Calibri" w:hAnsi="Calibri"/>
+                <w:b/>
+                <w:color w:val="FFFFFF"/>
+                <w:sz w:val="20"/>
+              </w:rPr>
+              <w:t>Why rec 3 is a hard no on 5×</w:t>
+              <w:br/>
+            </w:r>
+            <w:r>
+              <w:rPr>
+                <w:rFonts w:ascii="Calibri" w:hAnsi="Calibri"/>
+                <w:b w:val="0"/>
+                <w:color w:val="FFFFFF"/>
+                <w:sz w:val="18"/>
+              </w:rPr>
+              <w:t>Clicked vs not (delivered): −1.5pp, CI −3.6 to +0.6 → 0 pp. The 29% vs 11% “got CAMP” gap is targeting after RC, not lift. That same null is why never-upload is not another WhatsApp. Redirect the paper into a send/no-send RCT this week.</w:t>
+            </w:r>
+          </w:p>
+        </w:tc>
+      </w:tr>
+    </w:tbl>
+    <w:tbl>
+      <w:tblPr>
+        <w:tblW w:type="auto" w:w="0"/>
+        <w:tblLayout w:type="autofit"/>
+        <w:tblLook w:firstColumn="1" w:firstRow="1" w:lastColumn="0" w:lastRow="0" w:noHBand="0" w:noVBand="1" w:val="04A0"/>
+      </w:tblPr>
+      <w:tblGrid>
+        <w:gridCol w:w="10368"/>
+      </w:tblGrid>
+      <w:tr>
+        <w:tc>
+          <w:tcPr>
+            <w:tcW w:type="dxa" w:w="10368"/>
+            <w:shd w:fill="FF8A3D" w:val="clear"/>
+          </w:tcPr>
+          <w:p>
+            <w:pPr>
+              <w:spacing w:after="40" w:before="40" w:line="240" w:lineRule="auto"/>
+            </w:pPr>
+            <w:r>
+              <w:rPr>
+                <w:rFonts w:ascii="Calibri" w:hAnsi="Calibri"/>
+                <w:b/>
+                <w:color w:val="FFFFFF"/>
+                <w:sz w:val="22"/>
+              </w:rPr>
+              <w:t>PAGE 2  ·  WHY THESE TWO STAGES, WHAT WE LEFT, WHAT WOULD CHANGE MY MIND</w:t>
+            </w:r>
+          </w:p>
+        </w:tc>
+      </w:tr>
+    </w:tbl>
+    <w:p>
+      <w:pPr>
+        <w:spacing w:after="80" w:before="0" w:line="240" w:lineRule="auto"/>
+      </w:pPr>
+    </w:p>
+    <w:p>
+      <w:pPr>
+        <w:spacing w:after="120" w:before="0" w:line="240" w:lineRule="auto"/>
+      </w:pPr>
       <w:r>
         <w:rPr>
           <w:rFonts w:ascii="Calibri" w:hAnsi="Calibri"/>
           <w:b w:val="0"/>
-          <w:color w:val="333333"/>
+          <w:color w:val="3A2208"/>
           <w:sz w:val="21"/>
         </w:rPr>
-        <w:t>Airport: ~40% unfulfilled vs ~3% elsewhere; 84% in 21:00–03:59. Mix does not shift overnight (χ² p=0.12). CAMP_WA_002 clicked vs not is −1.5pp (CI −3.6 to +0.6) → 0 pp. Do not fund 5×.</w:t>
-      </w:r>
-    </w:p>
-    <w:p>
-      <w:r>
-        <w:rPr>
-          <w:rFonts w:ascii="Cambria" w:hAnsi="Cambria"/>
-          <w:b/>
-          <w:color w:val="1C7293"/>
-          <w:sz w:val="26"/>
-        </w:rPr>
-        <w:t>Why these two stages — leftover queue — ARA maths</w:t>
+        <w:t>The deck shows the leaks. This page is the bound: what is C1a vs leftover, how ₹35.4 is derived, and which piles I refuse to add to 180. RC loses 5,405 people — largest stage — but only 1,637 failed solely on blur / OCR / illegible. Insurance loses 3,289; ~2,530 never uploaded after Fitness. C1b is the 411 photo fails and cannot defer (liability). DL (1,166) is 100% uploaded-fail and cannot be deferred. Aadhaar / Permit / Fitness (1,540 / 2,616 / 2,653) are mostly never-upload or eligibility. Rejected 409 already cleared docs — a gate, not a UX leak.</w:t>
       </w:r>
     </w:p>
     <w:p>
       <w:pPr>
+        <w:spacing w:after="40" w:before="0" w:line="240" w:lineRule="auto"/>
         <w:jc w:val="center"/>
       </w:pPr>
       <w:r>
         <w:drawing>
           <wp:inline xmlns:a="http://schemas.openxmlformats.org/drawingml/2006/main" xmlns:pic="http://schemas.openxmlformats.org/drawingml/2006/picture">
-            <wp:extent cx="2880360" cy="1772204"/>
+            <wp:extent cx="2971800" cy="1828464"/>
             <wp:docPr id="3" name="Picture 3"/>
             <wp:cNvGraphicFramePr>
               <a:graphicFrameLocks noChangeAspect="1"/>
@@ -497,7 +774,7 @@
                   <pic:spPr>
                     <a:xfrm>
                       <a:off x="0" y="0"/>
-                      <a:ext cx="2880360" cy="1772204"/>
+                      <a:ext cx="2971800" cy="1828464"/>
                     </a:xfrm>
                     <a:prstGeom prst="rect"/>
                   </pic:spPr>
@@ -513,7 +790,7 @@
       <w:r>
         <w:drawing>
           <wp:inline xmlns:a="http://schemas.openxmlformats.org/drawingml/2006/main" xmlns:pic="http://schemas.openxmlformats.org/drawingml/2006/picture">
-            <wp:extent cx="2880360" cy="1566789"/>
+            <wp:extent cx="2971800" cy="1616528"/>
             <wp:docPr id="4" name="Picture 4"/>
             <wp:cNvGraphicFramePr>
               <a:graphicFrameLocks noChangeAspect="1"/>
@@ -534,7 +811,7 @@
                   <pic:spPr>
                     <a:xfrm>
                       <a:off x="0" y="0"/>
-                      <a:ext cx="2880360" cy="1566789"/>
+                      <a:ext cx="2971800" cy="1616528"/>
                     </a:xfrm>
                     <a:prstGeom prst="rect"/>
                   </pic:spPr>
@@ -550,12 +827,28 @@
     </w:p>
     <w:p>
       <w:pPr>
+        <w:spacing w:after="120" w:before="0" w:line="240" w:lineRule="auto"/>
+        <w:jc w:val="center"/>
+      </w:pPr>
+      <w:r>
+        <w:rPr>
+          <w:rFonts w:ascii="Calibri" w:hAnsi="Calibri"/>
+          <w:b w:val="0"/>
+          <w:color w:val="6B4A2A"/>
+          <w:sz w:val="17"/>
+        </w:rPr>
+        <w:t>Left: 1,637 of 5,405 RC losses are C1a. Right: 411 of 3,289 Insurance leftovers are C1b.</w:t>
+      </w:r>
+    </w:p>
+    <w:p>
+      <w:pPr>
+        <w:spacing w:after="80" w:before="0" w:line="240" w:lineRule="auto"/>
         <w:jc w:val="center"/>
       </w:pPr>
       <w:r>
         <w:drawing>
           <wp:inline xmlns:a="http://schemas.openxmlformats.org/drawingml/2006/main" xmlns:pic="http://schemas.openxmlformats.org/drawingml/2006/picture">
-            <wp:extent cx="5577840" cy="2815230"/>
+            <wp:extent cx="5943600" cy="2999836"/>
             <wp:docPr id="5" name="Picture 5"/>
             <wp:cNvGraphicFramePr>
               <a:graphicFrameLocks noChangeAspect="1"/>
@@ -576,7 +869,7 @@
                   <pic:spPr>
                     <a:xfrm>
                       <a:off x="0" y="0"/>
-                      <a:ext cx="5577840" cy="2815230"/>
+                      <a:ext cx="5943600" cy="2999836"/>
                     </a:xfrm>
                     <a:prstGeom prst="rect"/>
                   </pic:spPr>
@@ -587,40 +880,399 @@
         </w:drawing>
       </w:r>
     </w:p>
+    <w:tbl>
+      <w:tblPr>
+        <w:tblW w:type="auto" w:w="0"/>
+        <w:jc w:val="center"/>
+        <w:tblLook w:firstColumn="1" w:firstRow="1" w:lastColumn="0" w:lastRow="0" w:noHBand="0" w:noVBand="1" w:val="04A0"/>
+      </w:tblPr>
+      <w:tblGrid>
+        <w:gridCol w:w="2592"/>
+        <w:gridCol w:w="2592"/>
+        <w:gridCol w:w="2592"/>
+        <w:gridCol w:w="2592"/>
+      </w:tblGrid>
+      <w:tr>
+        <w:tc>
+          <w:tcPr>
+            <w:tcW w:type="dxa" w:w="2592"/>
+            <w:shd w:fill="FFC400" w:val="clear"/>
+          </w:tcPr>
+          <w:p>
+            <w:r>
+              <w:rPr>
+                <w:rFonts w:ascii="Calibri" w:hAnsi="Calibri"/>
+                <w:b/>
+                <w:color w:val="1E2761"/>
+                <w:sz w:val="18"/>
+              </w:rPr>
+              <w:t>Fix</w:t>
+            </w:r>
+          </w:p>
+        </w:tc>
+        <w:tc>
+          <w:tcPr>
+            <w:tcW w:type="dxa" w:w="2736"/>
+            <w:shd w:fill="FFC400" w:val="clear"/>
+          </w:tcPr>
+          <w:p>
+            <w:r>
+              <w:rPr>
+                <w:rFonts w:ascii="Calibri" w:hAnsi="Calibri"/>
+                <w:b/>
+                <w:color w:val="1E2761"/>
+                <w:sz w:val="18"/>
+              </w:rPr>
+              <w:t>Flow</w:t>
+            </w:r>
+          </w:p>
+        </w:tc>
+        <w:tc>
+          <w:tcPr>
+            <w:tcW w:type="dxa" w:w="3312"/>
+            <w:shd w:fill="FFC400" w:val="clear"/>
+          </w:tcPr>
+          <w:p>
+            <w:r>
+              <w:rPr>
+                <w:rFonts w:ascii="Calibri" w:hAnsi="Calibri"/>
+                <w:b/>
+                <w:color w:val="1E2761"/>
+                <w:sz w:val="18"/>
+              </w:rPr>
+              <w:t>Maths</w:t>
+            </w:r>
+          </w:p>
+        </w:tc>
+        <w:tc>
+          <w:tcPr>
+            <w:tcW w:type="dxa" w:w="1584"/>
+            <w:shd w:fill="FFC400" w:val="clear"/>
+          </w:tcPr>
+          <w:p>
+            <w:r>
+              <w:rPr>
+                <w:rFonts w:ascii="Calibri" w:hAnsi="Calibri"/>
+                <w:b/>
+                <w:color w:val="1E2761"/>
+                <w:sz w:val="18"/>
+              </w:rPr>
+              <w:t>Bank</w:t>
+            </w:r>
+          </w:p>
+        </w:tc>
+      </w:tr>
+      <w:tr>
+        <w:tc>
+          <w:tcPr>
+            <w:tcW w:type="dxa" w:w="2592"/>
+            <w:shd w:fill="FFF6E8" w:val="clear"/>
+          </w:tcPr>
+          <w:p>
+            <w:r>
+              <w:rPr>
+                <w:rFonts w:ascii="Calibri" w:hAnsi="Calibri"/>
+                <w:b w:val="0"/>
+                <w:color w:val="1E2761"/>
+                <w:sz w:val="18"/>
+              </w:rPr>
+              <w:t>C1a RC grace</w:t>
+            </w:r>
+          </w:p>
+        </w:tc>
+        <w:tc>
+          <w:tcPr>
+            <w:tcW w:type="dxa" w:w="2736"/>
+            <w:shd w:fill="FFF6E8" w:val="clear"/>
+          </w:tcPr>
+          <w:p>
+            <w:r>
+              <w:rPr>
+                <w:rFonts w:ascii="Calibri" w:hAnsi="Calibri"/>
+                <w:b w:val="0"/>
+                <w:color w:val="1E2761"/>
+                <w:sz w:val="18"/>
+              </w:rPr>
+              <w:t>~300/mo capture-only</w:t>
+            </w:r>
+          </w:p>
+        </w:tc>
+        <w:tc>
+          <w:tcPr>
+            <w:tcW w:type="dxa" w:w="3312"/>
+            <w:shd w:fill="FFF6E8" w:val="clear"/>
+          </w:tcPr>
+          <w:p>
+            <w:r>
+              <w:rPr>
+                <w:rFonts w:ascii="Calibri" w:hAnsi="Calibri"/>
+                <w:b w:val="0"/>
+                <w:color w:val="1E2761"/>
+                <w:sz w:val="18"/>
+              </w:rPr>
+              <w:t>× 60% show-up × 74% pass</w:t>
+            </w:r>
+          </w:p>
+        </w:tc>
+        <w:tc>
+          <w:tcPr>
+            <w:tcW w:type="dxa" w:w="1584"/>
+            <w:shd w:fill="FFF6E8" w:val="clear"/>
+          </w:tcPr>
+          <w:p>
+            <w:r>
+              <w:rPr>
+                <w:rFonts w:ascii="Calibri" w:hAnsi="Calibri"/>
+                <w:b/>
+                <w:color w:val="1E2761"/>
+                <w:sz w:val="18"/>
+              </w:rPr>
+              <w:t>~134/mo</w:t>
+            </w:r>
+          </w:p>
+        </w:tc>
+      </w:tr>
+      <w:tr>
+        <w:tc>
+          <w:tcPr>
+            <w:tcW w:type="dxa" w:w="2592"/>
+            <w:shd w:fill="FFF6E8" w:val="clear"/>
+          </w:tcPr>
+          <w:p>
+            <w:r>
+              <w:rPr>
+                <w:rFonts w:ascii="Calibri" w:hAnsi="Calibri"/>
+                <w:b w:val="0"/>
+                <w:color w:val="1E2761"/>
+                <w:sz w:val="18"/>
+              </w:rPr>
+              <w:t>C1b Insurance UX</w:t>
+            </w:r>
+          </w:p>
+        </w:tc>
+        <w:tc>
+          <w:tcPr>
+            <w:tcW w:type="dxa" w:w="2736"/>
+            <w:shd w:fill="FFF6E8" w:val="clear"/>
+          </w:tcPr>
+          <w:p>
+            <w:r>
+              <w:rPr>
+                <w:rFonts w:ascii="Calibri" w:hAnsi="Calibri"/>
+                <w:b w:val="0"/>
+                <w:color w:val="1E2761"/>
+                <w:sz w:val="18"/>
+              </w:rPr>
+              <w:t>411 capture-only</w:t>
+            </w:r>
+          </w:p>
+        </w:tc>
+        <w:tc>
+          <w:tcPr>
+            <w:tcW w:type="dxa" w:w="3312"/>
+            <w:shd w:fill="FFF6E8" w:val="clear"/>
+          </w:tcPr>
+          <w:p>
+            <w:r>
+              <w:rPr>
+                <w:rFonts w:ascii="Calibri" w:hAnsi="Calibri"/>
+                <w:b w:val="0"/>
+                <w:color w:val="1E2761"/>
+                <w:sz w:val="18"/>
+              </w:rPr>
+              <w:t>67→76% × 91% approved-if-cleared</w:t>
+            </w:r>
+          </w:p>
+        </w:tc>
+        <w:tc>
+          <w:tcPr>
+            <w:tcW w:type="dxa" w:w="1584"/>
+            <w:shd w:fill="FFF6E8" w:val="clear"/>
+          </w:tcPr>
+          <w:p>
+            <w:r>
+              <w:rPr>
+                <w:rFonts w:ascii="Calibri" w:hAnsi="Calibri"/>
+                <w:b/>
+                <w:color w:val="1E2761"/>
+                <w:sz w:val="18"/>
+              </w:rPr>
+              <w:t>~46–52/mo</w:t>
+            </w:r>
+          </w:p>
+        </w:tc>
+      </w:tr>
+    </w:tbl>
     <w:p>
+      <w:pPr>
+        <w:spacing w:after="120" w:before="0" w:line="240" w:lineRule="auto"/>
+      </w:pPr>
       <w:r>
         <w:rPr>
           <w:rFonts w:ascii="Calibri" w:hAnsi="Calibri"/>
           <w:b w:val="0"/>
-          <w:color w:val="333333"/>
-          <w:sz w:val="21"/>
+          <w:color w:val="3A2208"/>
+          <w:sz w:val="20"/>
         </w:rPr>
-        <w:t>RC loses 5,405; only 1,637 are capture-only (C1a). Insurance loses 3,289 but ~2,530 never uploaded after Fitness — C1b is the 411 photo fails. C1a: ~300/mo × 60% show-up × 74% pass ≈ 134. C1b: 67→76% × 91% approved-if-cleared ≈ 46–52. If remaining docs bind, C1a shrinks toward ~36/month. ARA: gap ₹31.6 ÷ 0.8931 ≈ ₹35.4/leg. 30% of fare (₹105) overpays. Do not add field 128–256 (overlaps 726 C1a captains).</w:t>
+        <w:t>40–80% show-up → ~89–188. If remaining docs still bind after RC, historical P(approved | passed RC) is 27% and C1a → ~36/month — that is the Legal question (deferral-as-activation).</w:t>
       </w:r>
     </w:p>
+    <w:tbl>
+      <w:tblPr>
+        <w:tblW w:type="auto" w:w="0"/>
+        <w:tblLayout w:type="autofit"/>
+        <w:tblLook w:firstColumn="1" w:firstRow="1" w:lastColumn="0" w:lastRow="0" w:noHBand="0" w:noVBand="1" w:val="04A0"/>
+      </w:tblPr>
+      <w:tblGrid>
+        <w:gridCol w:w="10368"/>
+      </w:tblGrid>
+      <w:tr>
+        <w:tc>
+          <w:tcPr>
+            <w:tcW w:type="dxa" w:w="10368"/>
+            <w:shd w:fill="E85D4C" w:val="clear"/>
+          </w:tcPr>
+          <w:p>
+            <w:pPr>
+              <w:spacing w:after="40" w:before="40" w:line="240" w:lineRule="auto"/>
+            </w:pPr>
+            <w:r>
+              <w:rPr>
+                <w:rFonts w:ascii="Calibri" w:hAnsi="Calibri"/>
+                <w:b/>
+                <w:color w:val="FFFFFF"/>
+                <w:sz w:val="22"/>
+              </w:rPr>
+              <w:t>NOT BANKED  ·  leftover queue (possible, not in the 180)</w:t>
+            </w:r>
+          </w:p>
+        </w:tc>
+      </w:tr>
+    </w:tbl>
     <w:p>
-      <w:r>
-        <w:rPr>
-          <w:rFonts w:ascii="Calibri" w:hAnsi="Calibri"/>
-          <w:b/>
-          <w:color w:val="1E2761"/>
-          <w:sz w:val="22"/>
-        </w:rPr>
-        <w:t xml:space="preserve">What I assumed, and what would change my answer. </w:t>
-      </w:r>
+      <w:pPr>
+        <w:spacing w:after="80" w:before="0" w:line="240" w:lineRule="auto"/>
+      </w:pPr>
+    </w:p>
+    <w:p>
+      <w:pPr>
+        <w:spacing w:after="120" w:before="0" w:line="240" w:lineRule="auto"/>
+      </w:pPr>
       <w:r>
         <w:rPr>
           <w:rFonts w:ascii="Calibri" w:hAnsi="Calibri"/>
           <w:b w:val="0"/>
-          <w:color w:val="333333"/>
+          <w:color w:val="3A2208"/>
+          <w:sz w:val="21"/>
+        </w:rPr>
+        <w:t>(1) Reuse C1b’s camera on DL / Aadhaar / Permit / Fitness after C1b ships — cheap, capture-only n not sized except RC/Insurance. (2) Never-upload RC ~2,388 and Insurance ~2,530 looks like a nudge; CAMP was 0 pp and only 13 post-Fitness nudges exist in 7,644 people. Fos abandon after Fitness 26% vs paid 43% — assisted-onboarding RCT, unproven ceiling 128–256/month, overlaps 726 C1a captains. (3) Paid never-starts docs at 11.5% vs fos ~1% — channel quality; no CAC, not sized.</w:t>
+      </w:r>
+    </w:p>
+    <w:tbl>
+      <w:tblPr>
+        <w:tblW w:type="auto" w:w="0"/>
+        <w:tblLayout w:type="autofit"/>
+        <w:tblLook w:firstColumn="1" w:firstRow="1" w:lastColumn="0" w:lastRow="0" w:noHBand="0" w:noVBand="1" w:val="04A0"/>
+      </w:tblPr>
+      <w:tblGrid>
+        <w:gridCol w:w="10368"/>
+      </w:tblGrid>
+      <w:tr>
+        <w:tc>
+          <w:tcPr>
+            <w:tcW w:type="dxa" w:w="10368"/>
+            <w:shd w:fill="FF8A3D" w:val="clear"/>
+          </w:tcPr>
+          <w:p>
+            <w:pPr>
+              <w:spacing w:after="40" w:before="40" w:line="240" w:lineRule="auto"/>
+            </w:pPr>
+            <w:r>
+              <w:rPr>
+                <w:rFonts w:ascii="Calibri" w:hAnsi="Calibri"/>
+                <w:b/>
+                <w:color w:val="FFFFFF"/>
+                <w:sz w:val="22"/>
+              </w:rPr>
+              <w:t>ARA  ·  derived payout, not 30% of fare</w:t>
+            </w:r>
+          </w:p>
+        </w:tc>
+      </w:tr>
+    </w:tbl>
+    <w:p>
+      <w:pPr>
+        <w:spacing w:after="80" w:before="0" w:line="240" w:lineRule="auto"/>
+      </w:pPr>
+    </w:p>
+    <w:p>
+      <w:pPr>
+        <w:spacing w:after="120" w:before="0" w:line="240" w:lineRule="auto"/>
+      </w:pPr>
+      <w:r>
+        <w:rPr>
+          <w:rFonts w:ascii="Calibri" w:hAnsi="Calibri"/>
+          <w:b w:val="0"/>
+          <w:color w:val="3A2208"/>
+          <w:sz w:val="21"/>
+        </w:rPr>
+        <w:t>Night-suburban net ₹24.9 vs rest-suburban ₹56.5 → gap ₹31.6 across all completed worst-suburban trips. ARA pays only the 89.31% with no return in 20 min → 31.6 / 0.8931 ≈ ₹35.4 per eligible leg. 80 / 100 / 120% → sample ~₹69k / ₹86k / ₹103k a month. 30% of a ₹350 fare (₹105) overpays. City-core ₹104.7 is geography, not the matching comparison.</w:t>
+      </w:r>
+    </w:p>
+    <w:tbl>
+      <w:tblPr>
+        <w:tblW w:type="auto" w:w="0"/>
+        <w:tblLayout w:type="autofit"/>
+        <w:tblLook w:firstColumn="1" w:firstRow="1" w:lastColumn="0" w:lastRow="0" w:noHBand="0" w:noVBand="1" w:val="04A0"/>
+      </w:tblPr>
+      <w:tblGrid>
+        <w:gridCol w:w="10368"/>
+      </w:tblGrid>
+      <w:tr>
+        <w:tc>
+          <w:tcPr>
+            <w:tcW w:type="dxa" w:w="10368"/>
+            <w:shd w:fill="FFC400" w:val="clear"/>
+          </w:tcPr>
+          <w:p>
+            <w:pPr>
+              <w:spacing w:after="40" w:before="40" w:line="240" w:lineRule="auto"/>
+            </w:pPr>
+            <w:r>
+              <w:rPr>
+                <w:rFonts w:ascii="Calibri" w:hAnsi="Calibri"/>
+                <w:b/>
+                <w:color w:val="1E2761"/>
+                <w:sz w:val="22"/>
+              </w:rPr>
+              <w:t>WHAT I ASSUMED, AND WHAT WOULD CHANGE MY ANSWER</w:t>
+            </w:r>
+          </w:p>
+        </w:tc>
+      </w:tr>
+    </w:tbl>
+    <w:p>
+      <w:pPr>
+        <w:spacing w:after="80" w:before="0" w:line="240" w:lineRule="auto"/>
+      </w:pPr>
+    </w:p>
+    <w:p>
+      <w:pPr>
+        <w:spacing w:after="40" w:before="0" w:line="240" w:lineRule="auto"/>
+      </w:pPr>
+      <w:r>
+        <w:rPr>
+          <w:rFonts w:ascii="Calibri" w:hAnsi="Calibri"/>
+          <w:b w:val="0"/>
+          <w:color w:val="3A2208"/>
           <w:sz w:val="20"/>
         </w:rPr>
-        <w:t>~15.6-day cutoff; doc_events not approvals.docs_cleared; field gap not banked; ARA vs rest-suburban not city-core; C1a FTE ₹40–60k assumed; trips file is sampled so ₹/month is not a city P&amp;L.</w:t>
+        <w:t>• ~15.6-day cutoff (max in_progress age). Later capture-fails still in flight → 180 is a floor; they finish alone → slight overstatement.  • doc_events.verification_pass, not approvals.docs_cleared (they disagree only while unfinished).  • Field vs app not banked until a randomised assist test on ordinary app/paid signups.  • ARA matches rest-suburban, not city-core. If night returns rise, re-derive ₹35.4; do not freeze it.  • C1a ops ₹40–60k assumes one FTE at 12–15 checks/day.  Unresolved, not omitted: no CAC so field vs paid cannot be priced. airport_trips.csv is sampled — rates hold; ₹/month is not a city budget. signup_zone_id does not join airport zones. Capture-only was counted only on RC and Insurance.</w:t>
       </w:r>
     </w:p>
     <w:sectPr>
       <w:pgSz w:w="12240" w:h="15840"/>
-      <w:pgMar w:top="792" w:right="1008" w:bottom="720" w:left="1008" w:header="720" w:footer="720" w:gutter="0"/>
+      <w:pgMar w:top="720" w:right="936" w:bottom="720" w:left="936" w:header="720" w:footer="720" w:gutter="0"/>
       <w:cols w:space="720"/>
       <w:docGrid w:linePitch="360"/>
     </w:sectPr>

</xml_diff>

<commit_message>
Fit the assumptions block onto page 2 of the Word memo.
Collapse leftover, ARA, and assumptions into one three-column table and shrink page-2 charts so the packet stays at two pages.

Co-authored-by: KRRamanathan <KRRamanathan@users.noreply.github.com>
</commit_message>
<xml_diff>
--- a/MEMO.docx
+++ b/MEMO.docx
@@ -37,7 +37,7 @@
     </w:tbl>
     <w:p>
       <w:pPr>
-        <w:spacing w:after="80" w:before="0" w:line="240" w:lineRule="auto"/>
+        <w:spacing w:after="40" w:before="0" w:line="240" w:lineRule="auto"/>
       </w:pPr>
     </w:p>
     <w:p>
@@ -197,7 +197,7 @@
     </w:tbl>
     <w:p>
       <w:pPr>
-        <w:spacing w:after="80" w:before="0" w:line="240" w:lineRule="auto"/>
+        <w:spacing w:after="40" w:before="0" w:line="240" w:lineRule="auto"/>
       </w:pPr>
     </w:p>
     <w:tbl>
@@ -728,7 +728,7 @@
     </w:tbl>
     <w:p>
       <w:pPr>
-        <w:spacing w:after="80" w:before="0" w:line="240" w:lineRule="auto"/>
+        <w:spacing w:after="40" w:before="0" w:line="240" w:lineRule="auto"/>
       </w:pPr>
     </w:p>
     <w:p>
@@ -753,7 +753,7 @@
       <w:r>
         <w:drawing>
           <wp:inline xmlns:a="http://schemas.openxmlformats.org/drawingml/2006/main" xmlns:pic="http://schemas.openxmlformats.org/drawingml/2006/picture">
-            <wp:extent cx="2971800" cy="1828464"/>
+            <wp:extent cx="2606040" cy="1603423"/>
             <wp:docPr id="3" name="Picture 3"/>
             <wp:cNvGraphicFramePr>
               <a:graphicFrameLocks noChangeAspect="1"/>
@@ -774,7 +774,7 @@
                   <pic:spPr>
                     <a:xfrm>
                       <a:off x="0" y="0"/>
-                      <a:ext cx="2971800" cy="1828464"/>
+                      <a:ext cx="2606040" cy="1603423"/>
                     </a:xfrm>
                     <a:prstGeom prst="rect"/>
                   </pic:spPr>
@@ -790,7 +790,7 @@
       <w:r>
         <w:drawing>
           <wp:inline xmlns:a="http://schemas.openxmlformats.org/drawingml/2006/main" xmlns:pic="http://schemas.openxmlformats.org/drawingml/2006/picture">
-            <wp:extent cx="2971800" cy="1616528"/>
+            <wp:extent cx="2606040" cy="1417571"/>
             <wp:docPr id="4" name="Picture 4"/>
             <wp:cNvGraphicFramePr>
               <a:graphicFrameLocks noChangeAspect="1"/>
@@ -811,7 +811,7 @@
                   <pic:spPr>
                     <a:xfrm>
                       <a:off x="0" y="0"/>
-                      <a:ext cx="2971800" cy="1616528"/>
+                      <a:ext cx="2606040" cy="1417571"/>
                     </a:xfrm>
                     <a:prstGeom prst="rect"/>
                   </pic:spPr>
@@ -827,7 +827,7 @@
     </w:p>
     <w:p>
       <w:pPr>
-        <w:spacing w:after="120" w:before="0" w:line="240" w:lineRule="auto"/>
+        <w:spacing w:after="60" w:before="0" w:line="240" w:lineRule="auto"/>
         <w:jc w:val="center"/>
       </w:pPr>
       <w:r>
@@ -842,13 +842,13 @@
     </w:p>
     <w:p>
       <w:pPr>
-        <w:spacing w:after="80" w:before="0" w:line="240" w:lineRule="auto"/>
+        <w:spacing w:after="40" w:before="0" w:line="240" w:lineRule="auto"/>
         <w:jc w:val="center"/>
       </w:pPr>
       <w:r>
         <w:drawing>
           <wp:inline xmlns:a="http://schemas.openxmlformats.org/drawingml/2006/main" xmlns:pic="http://schemas.openxmlformats.org/drawingml/2006/picture">
-            <wp:extent cx="5943600" cy="2999836"/>
+            <wp:extent cx="5212080" cy="2630625"/>
             <wp:docPr id="5" name="Picture 5"/>
             <wp:cNvGraphicFramePr>
               <a:graphicFrameLocks noChangeAspect="1"/>
@@ -869,7 +869,7 @@
                   <pic:spPr>
                     <a:xfrm>
                       <a:off x="0" y="0"/>
-                      <a:ext cx="5943600" cy="2999836"/>
+                      <a:ext cx="5212080" cy="2630625"/>
                     </a:xfrm>
                     <a:prstGeom prst="rect"/>
                   </pic:spPr>
@@ -882,6 +882,7 @@
     </w:p>
     <w:tbl>
       <w:tblPr>
+        <w:tblStyle w:val="TableGrid"/>
         <w:tblW w:type="auto" w:w="0"/>
         <w:jc w:val="center"/>
         <w:tblLook w:firstColumn="1" w:firstRow="1" w:lastColumn="0" w:lastRow="0" w:noHBand="0" w:noVBand="1" w:val="04A0"/>
@@ -1105,31 +1106,34 @@
     </w:tbl>
     <w:p>
       <w:pPr>
-        <w:spacing w:after="120" w:before="0" w:line="240" w:lineRule="auto"/>
+        <w:spacing w:after="80" w:before="0" w:line="240" w:lineRule="auto"/>
       </w:pPr>
       <w:r>
         <w:rPr>
           <w:rFonts w:ascii="Calibri" w:hAnsi="Calibri"/>
           <w:b w:val="0"/>
           <w:color w:val="3A2208"/>
-          <w:sz w:val="20"/>
+          <w:sz w:val="19"/>
         </w:rPr>
-        <w:t>40–80% show-up → ~89–188. If remaining docs still bind after RC, historical P(approved | passed RC) is 27% and C1a → ~36/month — that is the Legal question (deferral-as-activation).</w:t>
+        <w:t>40–80% show-up → ~89–188. If remaining docs still bind after RC, P(approved | passed RC)=27% → ~36/month (Legal ask).</w:t>
       </w:r>
     </w:p>
     <w:tbl>
       <w:tblPr>
+        <w:tblStyle w:val="TableGrid"/>
         <w:tblW w:type="auto" w:w="0"/>
-        <w:tblLayout w:type="autofit"/>
+        <w:jc w:val="center"/>
         <w:tblLook w:firstColumn="1" w:firstRow="1" w:lastColumn="0" w:lastRow="0" w:noHBand="0" w:noVBand="1" w:val="04A0"/>
       </w:tblPr>
       <w:tblGrid>
-        <w:gridCol w:w="10368"/>
+        <w:gridCol w:w="3456"/>
+        <w:gridCol w:w="3456"/>
+        <w:gridCol w:w="3456"/>
       </w:tblGrid>
       <w:tr>
         <w:tc>
           <w:tcPr>
-            <w:tcW w:type="dxa" w:w="10368"/>
+            <w:tcW w:type="dxa" w:w="3456"/>
             <w:shd w:fill="E85D4C" w:val="clear"/>
           </w:tcPr>
           <w:p>
@@ -1141,46 +1145,15 @@
                 <w:rFonts w:ascii="Calibri" w:hAnsi="Calibri"/>
                 <w:b/>
                 <w:color w:val="FFFFFF"/>
-                <w:sz w:val="22"/>
+                <w:sz w:val="16"/>
               </w:rPr>
-              <w:t>NOT BANKED  ·  leftover queue (possible, not in the 180)</w:t>
+              <w:t>NOT BANKED</w:t>
             </w:r>
           </w:p>
         </w:tc>
-      </w:tr>
-    </w:tbl>
-    <w:p>
-      <w:pPr>
-        <w:spacing w:after="80" w:before="0" w:line="240" w:lineRule="auto"/>
-      </w:pPr>
-    </w:p>
-    <w:p>
-      <w:pPr>
-        <w:spacing w:after="120" w:before="0" w:line="240" w:lineRule="auto"/>
-      </w:pPr>
-      <w:r>
-        <w:rPr>
-          <w:rFonts w:ascii="Calibri" w:hAnsi="Calibri"/>
-          <w:b w:val="0"/>
-          <w:color w:val="3A2208"/>
-          <w:sz w:val="21"/>
-        </w:rPr>
-        <w:t>(1) Reuse C1b’s camera on DL / Aadhaar / Permit / Fitness after C1b ships — cheap, capture-only n not sized except RC/Insurance. (2) Never-upload RC ~2,388 and Insurance ~2,530 looks like a nudge; CAMP was 0 pp and only 13 post-Fitness nudges exist in 7,644 people. Fos abandon after Fitness 26% vs paid 43% — assisted-onboarding RCT, unproven ceiling 128–256/month, overlaps 726 C1a captains. (3) Paid never-starts docs at 11.5% vs fos ~1% — channel quality; no CAC, not sized.</w:t>
-      </w:r>
-    </w:p>
-    <w:tbl>
-      <w:tblPr>
-        <w:tblW w:type="auto" w:w="0"/>
-        <w:tblLayout w:type="autofit"/>
-        <w:tblLook w:firstColumn="1" w:firstRow="1" w:lastColumn="0" w:lastRow="0" w:noHBand="0" w:noVBand="1" w:val="04A0"/>
-      </w:tblPr>
-      <w:tblGrid>
-        <w:gridCol w:w="10368"/>
-      </w:tblGrid>
-      <w:tr>
         <w:tc>
           <w:tcPr>
-            <w:tcW w:type="dxa" w:w="10368"/>
+            <w:tcW w:type="dxa" w:w="3456"/>
             <w:shd w:fill="FF8A3D" w:val="clear"/>
           </w:tcPr>
           <w:p>
@@ -1192,46 +1165,15 @@
                 <w:rFonts w:ascii="Calibri" w:hAnsi="Calibri"/>
                 <w:b/>
                 <w:color w:val="FFFFFF"/>
-                <w:sz w:val="22"/>
+                <w:sz w:val="16"/>
               </w:rPr>
-              <w:t>ARA  ·  derived payout, not 30% of fare</w:t>
+              <w:t>ARA (not 30% of fare)</w:t>
             </w:r>
           </w:p>
         </w:tc>
-      </w:tr>
-    </w:tbl>
-    <w:p>
-      <w:pPr>
-        <w:spacing w:after="80" w:before="0" w:line="240" w:lineRule="auto"/>
-      </w:pPr>
-    </w:p>
-    <w:p>
-      <w:pPr>
-        <w:spacing w:after="120" w:before="0" w:line="240" w:lineRule="auto"/>
-      </w:pPr>
-      <w:r>
-        <w:rPr>
-          <w:rFonts w:ascii="Calibri" w:hAnsi="Calibri"/>
-          <w:b w:val="0"/>
-          <w:color w:val="3A2208"/>
-          <w:sz w:val="21"/>
-        </w:rPr>
-        <w:t>Night-suburban net ₹24.9 vs rest-suburban ₹56.5 → gap ₹31.6 across all completed worst-suburban trips. ARA pays only the 89.31% with no return in 20 min → 31.6 / 0.8931 ≈ ₹35.4 per eligible leg. 80 / 100 / 120% → sample ~₹69k / ₹86k / ₹103k a month. 30% of a ₹350 fare (₹105) overpays. City-core ₹104.7 is geography, not the matching comparison.</w:t>
-      </w:r>
-    </w:p>
-    <w:tbl>
-      <w:tblPr>
-        <w:tblW w:type="auto" w:w="0"/>
-        <w:tblLayout w:type="autofit"/>
-        <w:tblLook w:firstColumn="1" w:firstRow="1" w:lastColumn="0" w:lastRow="0" w:noHBand="0" w:noVBand="1" w:val="04A0"/>
-      </w:tblPr>
-      <w:tblGrid>
-        <w:gridCol w:w="10368"/>
-      </w:tblGrid>
-      <w:tr>
         <w:tc>
           <w:tcPr>
-            <w:tcW w:type="dxa" w:w="10368"/>
+            <w:tcW w:type="dxa" w:w="3456"/>
             <w:shd w:fill="FFC400" w:val="clear"/>
           </w:tcPr>
           <w:p>
@@ -1243,33 +1185,76 @@
                 <w:rFonts w:ascii="Calibri" w:hAnsi="Calibri"/>
                 <w:b/>
                 <w:color w:val="1E2761"/>
-                <w:sz w:val="22"/>
+                <w:sz w:val="16"/>
               </w:rPr>
-              <w:t>WHAT I ASSUMED, AND WHAT WOULD CHANGE MY ANSWER</w:t>
+              <w:t>ASSUMPTIONS / WHAT WOULD CHANGE IT</w:t>
+            </w:r>
+          </w:p>
+        </w:tc>
+      </w:tr>
+      <w:tr>
+        <w:tc>
+          <w:tcPr>
+            <w:tcW w:type="dxa" w:w="3456"/>
+            <w:shd w:fill="FFF6E8" w:val="clear"/>
+          </w:tcPr>
+          <w:p>
+            <w:pPr>
+              <w:spacing w:after="40" w:before="40" w:line="240" w:lineRule="auto"/>
+            </w:pPr>
+            <w:r>
+              <w:rPr>
+                <w:rFonts w:ascii="Calibri" w:hAnsi="Calibri"/>
+                <w:b w:val="0"/>
+                <w:color w:val="3A2208"/>
+                <w:sz w:val="16"/>
+              </w:rPr>
+              <w:t>Other-doc camera after C1b: measure, not +180. Never-upload RC ~2,388 / Insurance ~2,530: assist RCT, not WhatsApp (CAMP 0 pp). Overlaps 726 C1a. Paid never-starts 11.5% vs fos ~1% — no CAC, not sized.</w:t>
+            </w:r>
+          </w:p>
+        </w:tc>
+        <w:tc>
+          <w:tcPr>
+            <w:tcW w:type="dxa" w:w="3456"/>
+            <w:shd w:fill="FFF6E8" w:val="clear"/>
+          </w:tcPr>
+          <w:p>
+            <w:pPr>
+              <w:spacing w:after="40" w:before="40" w:line="240" w:lineRule="auto"/>
+            </w:pPr>
+            <w:r>
+              <w:rPr>
+                <w:rFonts w:ascii="Calibri" w:hAnsi="Calibri"/>
+                <w:b w:val="0"/>
+                <w:color w:val="3A2208"/>
+                <w:sz w:val="16"/>
+              </w:rPr>
+              <w:t>Gap ₹31.6 (₹24.9 vs ₹56.5) ÷ 0.8931 eligible ≈ ₹35.4/leg. 80/100/120% → ~₹69–103k sample. ₹105 (30% of fare) overpays. City-core ₹104.7 is geography.</w:t>
+            </w:r>
+          </w:p>
+        </w:tc>
+        <w:tc>
+          <w:tcPr>
+            <w:tcW w:type="dxa" w:w="3456"/>
+            <w:shd w:fill="FFF6E8" w:val="clear"/>
+          </w:tcPr>
+          <w:p>
+            <w:pPr>
+              <w:spacing w:after="40" w:before="40" w:line="240" w:lineRule="auto"/>
+            </w:pPr>
+            <w:r>
+              <w:rPr>
+                <w:rFonts w:ascii="Calibri" w:hAnsi="Calibri"/>
+                <w:b w:val="0"/>
+                <w:color w:val="3A2208"/>
+                <w:sz w:val="16"/>
+              </w:rPr>
+              <w:t>~15.6-day cutoff (later capture-fails → 180 is a floor). doc_events, not docs_cleared. Field gap not banked. Re-derive ₹35.4 if night returns rise. C1a FTE ₹40–60k assumed. No CAC. Trips sampled. signup_zone_id ≠ airport zones. Capture-only counted on RC/Insurance only.</w:t>
             </w:r>
           </w:p>
         </w:tc>
       </w:tr>
     </w:tbl>
-    <w:p>
-      <w:pPr>
-        <w:spacing w:after="80" w:before="0" w:line="240" w:lineRule="auto"/>
-      </w:pPr>
-    </w:p>
-    <w:p>
-      <w:pPr>
-        <w:spacing w:after="40" w:before="0" w:line="240" w:lineRule="auto"/>
-      </w:pPr>
-      <w:r>
-        <w:rPr>
-          <w:rFonts w:ascii="Calibri" w:hAnsi="Calibri"/>
-          <w:b w:val="0"/>
-          <w:color w:val="3A2208"/>
-          <w:sz w:val="20"/>
-        </w:rPr>
-        <w:t>• ~15.6-day cutoff (max in_progress age). Later capture-fails still in flight → 180 is a floor; they finish alone → slight overstatement.  • doc_events.verification_pass, not approvals.docs_cleared (they disagree only while unfinished).  • Field vs app not banked until a randomised assist test on ordinary app/paid signups.  • ARA matches rest-suburban, not city-core. If night returns rise, re-derive ₹35.4; do not freeze it.  • C1a ops ₹40–60k assumes one FTE at 12–15 checks/day.  Unresolved, not omitted: no CAC so field vs paid cannot be priced. airport_trips.csv is sampled — rates hold; ₹/month is not a city budget. signup_zone_id does not join airport zones. Capture-only was counted only on RC and Insurance.</w:t>
-      </w:r>
-    </w:p>
     <w:sectPr>
       <w:pgSz w:w="12240" w:h="15840"/>
       <w:pgMar w:top="720" w:right="936" w:bottom="720" w:left="936" w:header="720" w:footer="720" w:gutter="0"/>

</xml_diff>

<commit_message>
Restyle memo and deck to a light Claude palette.
Use paper, peach, light yellow, and light orange only. Dark ink, larger type,
no white-on-red or navy fills. Vehicle drawings sit on the title and content
slides. Charts match the same lights.

Co-authored-by: KRRamanathan <KRRamanathan@users.noreply.github.com>
</commit_message>
<xml_diff>
--- a/MEMO.docx
+++ b/MEMO.docx
@@ -1,7 +1,7 @@
 
 <file path=word/document.xml><?xml version="1.0" encoding="utf-8"?>
 <w:document xmlns:wpc="http://schemas.microsoft.com/office/word/2010/wordprocessingCanvas" xmlns:mo="http://schemas.microsoft.com/office/mac/office/2008/main" xmlns:mc="http://schemas.openxmlformats.org/markup-compatibility/2006" xmlns:mv="urn:schemas-microsoft-com:mac:vml" xmlns:o="urn:schemas-microsoft-com:office:office" xmlns:r="http://schemas.openxmlformats.org/officeDocument/2006/relationships" xmlns:m="http://schemas.openxmlformats.org/officeDocument/2006/math" xmlns:v="urn:schemas-microsoft-com:vml" xmlns:wp14="http://schemas.microsoft.com/office/word/2010/wordprocessingDrawing" xmlns:wp="http://schemas.openxmlformats.org/drawingml/2006/wordprocessingDrawing" xmlns:w10="urn:schemas-microsoft-com:office:word" xmlns:w="http://schemas.openxmlformats.org/wordprocessingml/2006/main" xmlns:w14="http://schemas.microsoft.com/office/word/2010/wordml" xmlns:wpg="http://schemas.microsoft.com/office/word/2010/wordprocessingGroup" xmlns:wpi="http://schemas.microsoft.com/office/word/2010/wordprocessingInk" xmlns:wne="http://schemas.microsoft.com/office/word/2006/wordml" xmlns:wps="http://schemas.microsoft.com/office/word/2010/wordprocessingShape" mc:Ignorable="w14 wp14">
-  <w:background w:color="FFE8C2"/>
+  <w:background w:color="FAF7F2"/>
   <w:body>
     <w:tbl>
       <w:tblPr>
@@ -10,24 +10,24 @@
         <w:tblLook w:firstColumn="1" w:firstRow="1" w:lastColumn="0" w:lastRow="0" w:noHBand="0" w:noVBand="1" w:val="04A0"/>
       </w:tblPr>
       <w:tblGrid>
-        <w:gridCol w:w="10368"/>
+        <w:gridCol w:w="10224"/>
       </w:tblGrid>
       <w:tr>
         <w:tc>
           <w:tcPr>
-            <w:tcW w:type="dxa" w:w="10368"/>
-            <w:shd w:fill="FFC400" w:val="clear"/>
+            <w:tcW w:type="dxa" w:w="10224"/>
+            <w:shd w:fill="F3E6C0" w:val="clear"/>
           </w:tcPr>
           <w:p>
             <w:pPr>
-              <w:spacing w:after="40" w:before="40" w:line="240" w:lineRule="auto"/>
+              <w:spacing w:after="80" w:before="80" w:line="240" w:lineRule="auto"/>
             </w:pPr>
             <w:r>
               <w:rPr>
                 <w:rFonts w:ascii="Calibri" w:hAnsi="Calibri"/>
                 <w:b/>
-                <w:color w:val="1E2761"/>
-                <w:sz w:val="20"/>
+                <w:color w:val="1C1917"/>
+                <w:sz w:val="22"/>
               </w:rPr>
               <w:t>RAPIDO  ·  MEMO TO THE HEAD OF SUPPLY  ·  Ramanathan K R  ·  10 Sep 2026  ·  extract 30 Jun 2026, 23:59 IST</w:t>
             </w:r>
@@ -37,46 +37,46 @@
     </w:tbl>
     <w:p>
       <w:pPr>
-        <w:spacing w:after="40" w:before="0" w:line="240" w:lineRule="auto"/>
+        <w:spacing w:after="80" w:before="0" w:line="240" w:lineRule="auto"/>
       </w:pPr>
     </w:p>
     <w:p>
       <w:pPr>
-        <w:spacing w:after="120" w:before="0" w:line="240" w:lineRule="auto"/>
+        <w:spacing w:after="160" w:before="0" w:line="240" w:lineRule="auto"/>
       </w:pPr>
       <w:r>
         <w:rPr>
           <w:rFonts w:ascii="Cambria" w:hAnsi="Cambria"/>
           <w:b/>
-          <w:color w:val="1E2761"/>
-          <w:sz w:val="32"/>
+          <w:color w:val="1C1917"/>
+          <w:sz w:val="36"/>
         </w:rPr>
         <w:t>~180 more approved captains a month — two photo fixes, not five programmes</w:t>
       </w:r>
     </w:p>
     <w:p>
       <w:pPr>
-        <w:spacing w:after="120" w:before="0" w:line="240" w:lineRule="auto"/>
+        <w:spacing w:after="160" w:before="0" w:line="240" w:lineRule="auto"/>
       </w:pPr>
       <w:r>
         <w:rPr>
           <w:rFonts w:ascii="Calibri" w:hAnsi="Calibri"/>
           <w:b w:val="0"/>
-          <w:color w:val="3A2208"/>
-          <w:sz w:val="21"/>
+          <w:color w:val="1C1917"/>
+          <w:sz w:val="23"/>
         </w:rPr>
-        <w:t>Bank only two disjoint capture fixes: ~134/month from a 10-day in-person RC grace (C1a) and ~50 from Insurance upload UX (C1b). 98.7% of mature approved captains already take a first trip (3,895 / 3,946) — documents are the bottleneck, not first-order. Show-up for RC is unobserved; if Legal will not treat deferred RC as activation, C1a shrinks toward ~36/month. That is the only number I would put in a deck with my name on the campaign: 0 pp, not 5×.</w:t>
+        <w:t>Bank only two disjoint capture fixes: ~134/month from a 10-day in-person RC grace (C1a) and ~50 from Insurance upload UX (C1b). 98.7% of mature approved captains already take a first trip (3,895 / 3,946) — documents are the bottleneck, not first-order. Show-up for RC is unobserved; if Legal will not treat deferred RC as activation, C1a shrinks toward ~36/month. The campaign number I would put my name on is 0 pp, not 5×.</w:t>
       </w:r>
     </w:p>
     <w:p>
       <w:pPr>
-        <w:spacing w:after="40" w:before="0" w:line="240" w:lineRule="auto"/>
+        <w:spacing w:after="80" w:before="0" w:line="240" w:lineRule="auto"/>
         <w:jc w:val="center"/>
       </w:pPr>
       <w:r>
         <w:drawing>
           <wp:inline xmlns:a="http://schemas.openxmlformats.org/drawingml/2006/main" xmlns:pic="http://schemas.openxmlformats.org/drawingml/2006/picture">
-            <wp:extent cx="3063240" cy="1729397"/>
+            <wp:extent cx="2971800" cy="1407270"/>
             <wp:docPr id="1" name="Picture 1"/>
             <wp:cNvGraphicFramePr>
               <a:graphicFrameLocks noChangeAspect="1"/>
@@ -97,7 +97,7 @@
                   <pic:spPr>
                     <a:xfrm>
                       <a:off x="0" y="0"/>
-                      <a:ext cx="3063240" cy="1729397"/>
+                      <a:ext cx="2971800" cy="1407270"/>
                     </a:xfrm>
                     <a:prstGeom prst="rect"/>
                   </pic:spPr>
@@ -113,7 +113,7 @@
       <w:r>
         <w:drawing>
           <wp:inline xmlns:a="http://schemas.openxmlformats.org/drawingml/2006/main" xmlns:pic="http://schemas.openxmlformats.org/drawingml/2006/picture">
-            <wp:extent cx="3063240" cy="2157072"/>
+            <wp:extent cx="2971800" cy="1745022"/>
             <wp:docPr id="2" name="Picture 2"/>
             <wp:cNvGraphicFramePr>
               <a:graphicFrameLocks noChangeAspect="1"/>
@@ -134,7 +134,7 @@
                   <pic:spPr>
                     <a:xfrm>
                       <a:off x="0" y="0"/>
-                      <a:ext cx="3063240" cy="2157072"/>
+                      <a:ext cx="2971800" cy="1745022"/>
                     </a:xfrm>
                     <a:prstGeom prst="rect"/>
                   </pic:spPr>
@@ -157,8 +157,8 @@
         <w:rPr>
           <w:rFonts w:ascii="Calibri" w:hAnsi="Calibri"/>
           <w:b w:val="0"/>
-          <w:color w:val="6B4A2A"/>
-          <w:sz w:val="17"/>
+          <w:color w:val="57534E"/>
+          <w:sz w:val="21"/>
         </w:rPr>
         <w:t>Left: bank C1a + C1b only. Right: 84% of airport unfulfilled volume is 21:00–03:59.</w:t>
       </w:r>
@@ -170,24 +170,24 @@
         <w:tblLook w:firstColumn="1" w:firstRow="1" w:lastColumn="0" w:lastRow="0" w:noHBand="0" w:noVBand="1" w:val="04A0"/>
       </w:tblPr>
       <w:tblGrid>
-        <w:gridCol w:w="10368"/>
+        <w:gridCol w:w="10224"/>
       </w:tblGrid>
       <w:tr>
         <w:tc>
           <w:tcPr>
-            <w:tcW w:type="dxa" w:w="10368"/>
-            <w:shd w:fill="FF8A3D" w:val="clear"/>
+            <w:tcW w:type="dxa" w:w="10224"/>
+            <w:shd w:fill="F0C9A0" w:val="clear"/>
           </w:tcPr>
           <w:p>
             <w:pPr>
-              <w:spacing w:after="40" w:before="40" w:line="240" w:lineRule="auto"/>
+              <w:spacing w:after="80" w:before="80" w:line="240" w:lineRule="auto"/>
             </w:pPr>
             <w:r>
               <w:rPr>
                 <w:rFonts w:ascii="Calibri" w:hAnsi="Calibri"/>
                 <w:b/>
-                <w:color w:val="FFFFFF"/>
-                <w:sz w:val="22"/>
+                <w:color w:val="1C1917"/>
+                <w:sz w:val="24"/>
               </w:rPr>
               <w:t>PAGE 1  ·  WHAT TO DO THIS WEEK</w:t>
             </w:r>
@@ -197,7 +197,7 @@
     </w:tbl>
     <w:p>
       <w:pPr>
-        <w:spacing w:after="40" w:before="0" w:line="240" w:lineRule="auto"/>
+        <w:spacing w:after="80" w:before="0" w:line="240" w:lineRule="auto"/>
       </w:pPr>
     </w:p>
     <w:tbl>
@@ -208,28 +208,28 @@
         <w:tblLook w:firstColumn="1" w:firstRow="1" w:lastColumn="0" w:lastRow="0" w:noHBand="0" w:noVBand="1" w:val="04A0"/>
       </w:tblPr>
       <w:tblGrid>
-        <w:gridCol w:w="2074"/>
-        <w:gridCol w:w="2074"/>
-        <w:gridCol w:w="2074"/>
-        <w:gridCol w:w="2074"/>
-        <w:gridCol w:w="2074"/>
+        <w:gridCol w:w="2045"/>
+        <w:gridCol w:w="2045"/>
+        <w:gridCol w:w="2045"/>
+        <w:gridCol w:w="2045"/>
+        <w:gridCol w:w="2045"/>
       </w:tblGrid>
       <w:tr>
         <w:tc>
           <w:tcPr>
             <w:tcW w:type="dxa" w:w="576"/>
-            <w:shd w:fill="E85D4C" w:val="clear"/>
+            <w:shd w:fill="F0C9A0" w:val="clear"/>
           </w:tcPr>
           <w:p>
             <w:pPr>
-              <w:spacing w:after="40" w:before="40" w:line="240" w:lineRule="auto"/>
+              <w:spacing w:after="60" w:before="60" w:line="240" w:lineRule="auto"/>
             </w:pPr>
             <w:r>
               <w:rPr>
                 <w:rFonts w:ascii="Calibri" w:hAnsi="Calibri"/>
                 <w:b/>
-                <w:color w:val="FFFFFF"/>
-                <w:sz w:val="17"/>
+                <w:color w:val="1C1917"/>
+                <w:sz w:val="21"/>
               </w:rPr>
               <w:t>#</w:t>
             </w:r>
@@ -237,19 +237,19 @@
         </w:tc>
         <w:tc>
           <w:tcPr>
-            <w:tcW w:type="dxa" w:w="3672"/>
-            <w:shd w:fill="E85D4C" w:val="clear"/>
+            <w:tcW w:type="dxa" w:w="3600"/>
+            <w:shd w:fill="F0C9A0" w:val="clear"/>
           </w:tcPr>
           <w:p>
             <w:pPr>
-              <w:spacing w:after="40" w:before="40" w:line="240" w:lineRule="auto"/>
+              <w:spacing w:after="60" w:before="60" w:line="240" w:lineRule="auto"/>
             </w:pPr>
             <w:r>
               <w:rPr>
                 <w:rFonts w:ascii="Calibri" w:hAnsi="Calibri"/>
                 <w:b/>
-                <w:color w:val="FFFFFF"/>
-                <w:sz w:val="17"/>
+                <w:color w:val="1C1917"/>
+                <w:sz w:val="21"/>
               </w:rPr>
               <w:t>Do this</w:t>
             </w:r>
@@ -258,18 +258,18 @@
         <w:tc>
           <w:tcPr>
             <w:tcW w:type="dxa" w:w="2232"/>
-            <w:shd w:fill="E85D4C" w:val="clear"/>
+            <w:shd w:fill="F0C9A0" w:val="clear"/>
           </w:tcPr>
           <w:p>
             <w:pPr>
-              <w:spacing w:after="40" w:before="40" w:line="240" w:lineRule="auto"/>
+              <w:spacing w:after="60" w:before="60" w:line="240" w:lineRule="auto"/>
             </w:pPr>
             <w:r>
               <w:rPr>
                 <w:rFonts w:ascii="Calibri" w:hAnsi="Calibri"/>
                 <w:b/>
-                <w:color w:val="FFFFFF"/>
-                <w:sz w:val="17"/>
+                <w:color w:val="1C1917"/>
+                <w:sz w:val="21"/>
               </w:rPr>
               <w:t>Impact</w:t>
             </w:r>
@@ -278,18 +278,18 @@
         <w:tc>
           <w:tcPr>
             <w:tcW w:type="dxa" w:w="2448"/>
-            <w:shd w:fill="E85D4C" w:val="clear"/>
+            <w:shd w:fill="F0C9A0" w:val="clear"/>
           </w:tcPr>
           <w:p>
             <w:pPr>
-              <w:spacing w:after="40" w:before="40" w:line="240" w:lineRule="auto"/>
+              <w:spacing w:after="60" w:before="60" w:line="240" w:lineRule="auto"/>
             </w:pPr>
             <w:r>
               <w:rPr>
                 <w:rFonts w:ascii="Calibri" w:hAnsi="Calibri"/>
                 <w:b/>
-                <w:color w:val="FFFFFF"/>
-                <w:sz w:val="17"/>
+                <w:color w:val="1C1917"/>
+                <w:sz w:val="21"/>
               </w:rPr>
               <w:t>Cost / risk</w:t>
             </w:r>
@@ -298,18 +298,18 @@
         <w:tc>
           <w:tcPr>
             <w:tcW w:type="dxa" w:w="2160"/>
-            <w:shd w:fill="E85D4C" w:val="clear"/>
+            <w:shd w:fill="F0C9A0" w:val="clear"/>
           </w:tcPr>
           <w:p>
             <w:pPr>
-              <w:spacing w:after="40" w:before="40" w:line="240" w:lineRule="auto"/>
+              <w:spacing w:after="60" w:before="60" w:line="240" w:lineRule="auto"/>
             </w:pPr>
             <w:r>
               <w:rPr>
                 <w:rFonts w:ascii="Calibri" w:hAnsi="Calibri"/>
                 <w:b/>
-                <w:color w:val="FFFFFF"/>
-                <w:sz w:val="17"/>
+                <w:color w:val="1C1917"/>
+                <w:sz w:val="21"/>
               </w:rPr>
               <w:t>Watch</w:t>
             </w:r>
@@ -320,18 +320,18 @@
         <w:tc>
           <w:tcPr>
             <w:tcW w:type="dxa" w:w="576"/>
-            <w:shd w:fill="FFE8C2" w:val="clear"/>
+            <w:shd w:fill="F6E4D4" w:val="clear"/>
           </w:tcPr>
           <w:p>
             <w:pPr>
-              <w:spacing w:after="60" w:before="40" w:line="240" w:lineRule="auto"/>
+              <w:spacing w:after="80" w:before="60" w:line="240" w:lineRule="auto"/>
             </w:pPr>
             <w:r>
               <w:rPr>
                 <w:rFonts w:ascii="Calibri" w:hAnsi="Calibri"/>
                 <w:b/>
-                <w:color w:val="1E2761"/>
-                <w:sz w:val="16"/>
+                <w:color w:val="1C1917"/>
+                <w:sz w:val="20"/>
               </w:rPr>
               <w:t>1</w:t>
             </w:r>
@@ -339,19 +339,19 @@
         </w:tc>
         <w:tc>
           <w:tcPr>
-            <w:tcW w:type="dxa" w:w="3672"/>
-            <w:shd w:fill="FFE8C2" w:val="clear"/>
+            <w:tcW w:type="dxa" w:w="3600"/>
+            <w:shd w:fill="F6E4D4" w:val="clear"/>
           </w:tcPr>
           <w:p>
             <w:pPr>
-              <w:spacing w:after="60" w:before="40" w:line="240" w:lineRule="auto"/>
+              <w:spacing w:after="80" w:before="60" w:line="240" w:lineRule="auto"/>
             </w:pPr>
             <w:r>
               <w:rPr>
                 <w:rFonts w:ascii="Calibri" w:hAnsi="Calibri"/>
                 <w:b w:val="0"/>
-                <w:color w:val="3A2208"/>
-                <w:sz w:val="16"/>
+                <w:color w:val="1C1917"/>
+                <w:sz w:val="20"/>
               </w:rPr>
               <w:t>C1b Insurance camera this week (411). Then C1a 10-day RC grace after Legal (1,637). Same camera on other docs: free rider, not in 180.</w:t>
             </w:r>
@@ -360,18 +360,18 @@
         <w:tc>
           <w:tcPr>
             <w:tcW w:type="dxa" w:w="2232"/>
-            <w:shd w:fill="FFE8C2" w:val="clear"/>
+            <w:shd w:fill="F6E4D4" w:val="clear"/>
           </w:tcPr>
           <w:p>
             <w:pPr>
-              <w:spacing w:after="60" w:before="40" w:line="240" w:lineRule="auto"/>
+              <w:spacing w:after="80" w:before="60" w:line="240" w:lineRule="auto"/>
             </w:pPr>
             <w:r>
               <w:rPr>
                 <w:rFonts w:ascii="Calibri" w:hAnsi="Calibri"/>
                 <w:b w:val="0"/>
-                <w:color w:val="3A2208"/>
-                <w:sz w:val="16"/>
+                <w:color w:val="1C1917"/>
+                <w:sz w:val="20"/>
               </w:rPr>
               <w:t>~180/mo (~50 + ~134)</w:t>
             </w:r>
@@ -380,18 +380,18 @@
         <w:tc>
           <w:tcPr>
             <w:tcW w:type="dxa" w:w="2448"/>
-            <w:shd w:fill="FFE8C2" w:val="clear"/>
+            <w:shd w:fill="F6E4D4" w:val="clear"/>
           </w:tcPr>
           <w:p>
             <w:pPr>
-              <w:spacing w:after="60" w:before="40" w:line="240" w:lineRule="auto"/>
+              <w:spacing w:after="80" w:before="60" w:line="240" w:lineRule="auto"/>
             </w:pPr>
             <w:r>
               <w:rPr>
                 <w:rFonts w:ascii="Calibri" w:hAnsi="Calibri"/>
                 <w:b w:val="0"/>
-                <w:color w:val="3A2208"/>
-                <w:sz w:val="16"/>
+                <w:color w:val="1C1917"/>
+                <w:sz w:val="20"/>
               </w:rPr>
               <w:t>C1b: engineering. C1a: Legal/T&amp;S + ~1 FTE ₹40–60k (assumed).</w:t>
             </w:r>
@@ -400,18 +400,18 @@
         <w:tc>
           <w:tcPr>
             <w:tcW w:type="dxa" w:w="2160"/>
-            <w:shd w:fill="FFE8C2" w:val="clear"/>
+            <w:shd w:fill="F6E4D4" w:val="clear"/>
           </w:tcPr>
           <w:p>
             <w:pPr>
-              <w:spacing w:after="60" w:before="40" w:line="240" w:lineRule="auto"/>
+              <w:spacing w:after="80" w:before="60" w:line="240" w:lineRule="auto"/>
             </w:pPr>
             <w:r>
               <w:rPr>
                 <w:rFonts w:ascii="Calibri" w:hAnsi="Calibri"/>
                 <w:b w:val="0"/>
-                <w:color w:val="3A2208"/>
-                <w:sz w:val="16"/>
+                <w:color w:val="1C1917"/>
+                <w:sz w:val="20"/>
               </w:rPr>
               <w:t>Approved by cohort</w:t>
             </w:r>
@@ -422,18 +422,18 @@
         <w:tc>
           <w:tcPr>
             <w:tcW w:type="dxa" w:w="576"/>
-            <w:shd w:fill="FFF6E8" w:val="clear"/>
+            <w:shd w:fill="F8F1E3" w:val="clear"/>
           </w:tcPr>
           <w:p>
             <w:pPr>
-              <w:spacing w:after="60" w:before="40" w:line="240" w:lineRule="auto"/>
+              <w:spacing w:after="80" w:before="60" w:line="240" w:lineRule="auto"/>
             </w:pPr>
             <w:r>
               <w:rPr>
                 <w:rFonts w:ascii="Calibri" w:hAnsi="Calibri"/>
                 <w:b/>
-                <w:color w:val="1E2761"/>
-                <w:sz w:val="16"/>
+                <w:color w:val="1C1917"/>
+                <w:sz w:val="20"/>
               </w:rPr>
               <w:t>2</w:t>
             </w:r>
@@ -441,19 +441,19 @@
         </w:tc>
         <w:tc>
           <w:tcPr>
-            <w:tcW w:type="dxa" w:w="3672"/>
-            <w:shd w:fill="FFF6E8" w:val="clear"/>
+            <w:tcW w:type="dxa" w:w="3600"/>
+            <w:shd w:fill="F8F1E3" w:val="clear"/>
           </w:tcPr>
           <w:p>
             <w:pPr>
-              <w:spacing w:after="60" w:before="40" w:line="240" w:lineRule="auto"/>
+              <w:spacing w:after="80" w:before="60" w:line="240" w:lineRule="auto"/>
             </w:pPr>
             <w:r>
               <w:rPr>
                 <w:rFonts w:ascii="Calibri" w:hAnsi="Calibri"/>
                 <w:b w:val="0"/>
-                <w:color w:val="3A2208"/>
-                <w:sz w:val="16"/>
+                <w:color w:val="1C1917"/>
+                <w:sz w:val="20"/>
               </w:rPr>
               <w:t>Airport Return Assurance at ₹35.4 / unpaid night-suburban leg. Do not hire the catchment.</w:t>
             </w:r>
@@ -462,18 +462,18 @@
         <w:tc>
           <w:tcPr>
             <w:tcW w:type="dxa" w:w="2232"/>
-            <w:shd w:fill="FFF6E8" w:val="clear"/>
+            <w:shd w:fill="F8F1E3" w:val="clear"/>
           </w:tcPr>
           <w:p>
             <w:pPr>
-              <w:spacing w:after="60" w:before="40" w:line="240" w:lineRule="auto"/>
+              <w:spacing w:after="80" w:before="60" w:line="240" w:lineRule="auto"/>
             </w:pPr>
             <w:r>
               <w:rPr>
                 <w:rFonts w:ascii="Calibri" w:hAnsi="Calibri"/>
                 <w:b w:val="0"/>
-                <w:color w:val="3A2208"/>
-                <w:sz w:val="16"/>
+                <w:color w:val="1C1917"/>
+                <w:sz w:val="20"/>
               </w:rPr>
               <w:t>Sample ~₹69–103k/mo. Restores rest-suburban net.</w:t>
             </w:r>
@@ -482,18 +482,18 @@
         <w:tc>
           <w:tcPr>
             <w:tcW w:type="dxa" w:w="2448"/>
-            <w:shd w:fill="FFF6E8" w:val="clear"/>
+            <w:shd w:fill="F8F1E3" w:val="clear"/>
           </w:tcPr>
           <w:p>
             <w:pPr>
-              <w:spacing w:after="60" w:before="40" w:line="240" w:lineRule="auto"/>
+              <w:spacing w:after="80" w:before="60" w:line="240" w:lineRule="auto"/>
             </w:pPr>
             <w:r>
               <w:rPr>
                 <w:rFonts w:ascii="Calibri" w:hAnsi="Calibri"/>
                 <w:b w:val="0"/>
-                <w:color w:val="3A2208"/>
-                <w:sz w:val="16"/>
+                <w:color w:val="1C1917"/>
+                <w:sz w:val="20"/>
               </w:rPr>
               <w:t>Sampled trips ≠ city P&amp;L. Not city-core.</w:t>
             </w:r>
@@ -502,18 +502,18 @@
         <w:tc>
           <w:tcPr>
             <w:tcW w:type="dxa" w:w="2160"/>
-            <w:shd w:fill="FFF6E8" w:val="clear"/>
+            <w:shd w:fill="F8F1E3" w:val="clear"/>
           </w:tcPr>
           <w:p>
             <w:pPr>
-              <w:spacing w:after="60" w:before="40" w:line="240" w:lineRule="auto"/>
+              <w:spacing w:after="80" w:before="60" w:line="240" w:lineRule="auto"/>
             </w:pPr>
             <w:r>
               <w:rPr>
                 <w:rFonts w:ascii="Calibri" w:hAnsi="Calibri"/>
                 <w:b w:val="0"/>
-                <w:color w:val="3A2208"/>
-                <w:sz w:val="16"/>
+                <w:color w:val="1C1917"/>
+                <w:sz w:val="20"/>
               </w:rPr>
               <w:t>Return-in-20m, cancels, falling 4-wk run-rate</w:t>
             </w:r>
@@ -524,18 +524,18 @@
         <w:tc>
           <w:tcPr>
             <w:tcW w:type="dxa" w:w="576"/>
-            <w:shd w:fill="FFE8C2" w:val="clear"/>
+            <w:shd w:fill="F6E4D4" w:val="clear"/>
           </w:tcPr>
           <w:p>
             <w:pPr>
-              <w:spacing w:after="60" w:before="40" w:line="240" w:lineRule="auto"/>
+              <w:spacing w:after="80" w:before="60" w:line="240" w:lineRule="auto"/>
             </w:pPr>
             <w:r>
               <w:rPr>
                 <w:rFonts w:ascii="Calibri" w:hAnsi="Calibri"/>
                 <w:b/>
-                <w:color w:val="1E2761"/>
-                <w:sz w:val="16"/>
+                <w:color w:val="1C1917"/>
+                <w:sz w:val="20"/>
               </w:rPr>
               <w:t>3</w:t>
             </w:r>
@@ -543,19 +543,19 @@
         </w:tc>
         <w:tc>
           <w:tcPr>
-            <w:tcW w:type="dxa" w:w="3672"/>
-            <w:shd w:fill="FFE8C2" w:val="clear"/>
+            <w:tcW w:type="dxa" w:w="3600"/>
+            <w:shd w:fill="F6E4D4" w:val="clear"/>
           </w:tcPr>
           <w:p>
             <w:pPr>
-              <w:spacing w:after="60" w:before="40" w:line="240" w:lineRule="auto"/>
+              <w:spacing w:after="80" w:before="60" w:line="240" w:lineRule="auto"/>
             </w:pPr>
             <w:r>
               <w:rPr>
                 <w:rFonts w:ascii="Calibri" w:hAnsi="Calibri"/>
                 <w:b w:val="0"/>
-                <w:color w:val="3A2208"/>
-                <w:sz w:val="16"/>
+                <w:color w:val="1C1917"/>
+                <w:sz w:val="20"/>
               </w:rPr>
               <w:t>Kill CAMP_WA_002 5×. Send/no-send RCT on RC-cleared app/paid captains, no other campaign.</w:t>
             </w:r>
@@ -564,18 +564,18 @@
         <w:tc>
           <w:tcPr>
             <w:tcW w:type="dxa" w:w="2232"/>
-            <w:shd w:fill="FFE8C2" w:val="clear"/>
+            <w:shd w:fill="F6E4D4" w:val="clear"/>
           </w:tcPr>
           <w:p>
             <w:pPr>
-              <w:spacing w:after="60" w:before="40" w:line="240" w:lineRule="auto"/>
+              <w:spacing w:after="80" w:before="60" w:line="240" w:lineRule="auto"/>
             </w:pPr>
             <w:r>
               <w:rPr>
                 <w:rFonts w:ascii="Calibri" w:hAnsi="Calibri"/>
                 <w:b w:val="0"/>
-                <w:color w:val="3A2208"/>
-                <w:sz w:val="16"/>
+                <w:color w:val="1C1917"/>
+                <w:sz w:val="20"/>
               </w:rPr>
               <w:t>0 pp lift. Cost avoided + 4–6 week answer.</w:t>
             </w:r>
@@ -584,18 +584,18 @@
         <w:tc>
           <w:tcPr>
             <w:tcW w:type="dxa" w:w="2448"/>
-            <w:shd w:fill="FFE8C2" w:val="clear"/>
+            <w:shd w:fill="F6E4D4" w:val="clear"/>
           </w:tcPr>
           <w:p>
             <w:pPr>
-              <w:spacing w:after="60" w:before="40" w:line="240" w:lineRule="auto"/>
+              <w:spacing w:after="80" w:before="60" w:line="240" w:lineRule="auto"/>
             </w:pPr>
             <w:r>
               <w:rPr>
                 <w:rFonts w:ascii="Calibri" w:hAnsi="Calibri"/>
                 <w:b w:val="0"/>
-                <w:color w:val="3A2208"/>
-                <w:sz w:val="16"/>
+                <w:color w:val="1C1917"/>
+                <w:sz w:val="20"/>
               </w:rPr>
               <w:t>Near zero</w:t>
             </w:r>
@@ -604,18 +604,18 @@
         <w:tc>
           <w:tcPr>
             <w:tcW w:type="dxa" w:w="2160"/>
-            <w:shd w:fill="FFE8C2" w:val="clear"/>
+            <w:shd w:fill="F6E4D4" w:val="clear"/>
           </w:tcPr>
           <w:p>
             <w:pPr>
-              <w:spacing w:after="60" w:before="40" w:line="240" w:lineRule="auto"/>
+              <w:spacing w:after="80" w:before="60" w:line="240" w:lineRule="auto"/>
             </w:pPr>
             <w:r>
               <w:rPr>
                 <w:rFonts w:ascii="Calibri" w:hAnsi="Calibri"/>
                 <w:b w:val="0"/>
-                <w:color w:val="3A2208"/>
-                <w:sz w:val="16"/>
+                <w:color w:val="1C1917"/>
+                <w:sz w:val="20"/>
               </w:rPr>
               <w:t>Aadhaar pass and approved</w:t>
             </w:r>
@@ -625,7 +625,7 @@
     </w:tbl>
     <w:p>
       <w:pPr>
-        <w:spacing w:after="120" w:before="0" w:line="240" w:lineRule="auto"/>
+        <w:spacing w:after="160" w:before="0" w:line="240" w:lineRule="auto"/>
       </w:pPr>
     </w:p>
     <w:tbl>
@@ -634,22 +634,22 @@
         <w:tblLook w:firstColumn="1" w:firstRow="1" w:lastColumn="0" w:lastRow="0" w:noHBand="0" w:noVBand="1" w:val="04A0"/>
       </w:tblPr>
       <w:tblGrid>
-        <w:gridCol w:w="5184"/>
-        <w:gridCol w:w="5184"/>
+        <w:gridCol w:w="5112"/>
+        <w:gridCol w:w="5112"/>
       </w:tblGrid>
       <w:tr>
         <w:tc>
           <w:tcPr>
-            <w:tcW w:type="dxa" w:w="5112"/>
-            <w:shd w:fill="FF8A3D" w:val="clear"/>
+            <w:tcW w:type="dxa" w:w="5040"/>
+            <w:shd w:fill="F6E4D4" w:val="clear"/>
           </w:tcPr>
           <w:p>
             <w:r>
               <w:rPr>
                 <w:rFonts w:ascii="Calibri" w:hAnsi="Calibri"/>
                 <w:b/>
-                <w:color w:val="FFFFFF"/>
-                <w:sz w:val="20"/>
+                <w:color w:val="1C1917"/>
+                <w:sz w:val="24"/>
               </w:rPr>
               <w:t>Why rec 2 is “do not hire”</w:t>
               <w:br/>
@@ -658,8 +658,8 @@
               <w:rPr>
                 <w:rFonts w:ascii="Calibri" w:hAnsi="Calibri"/>
                 <w:b w:val="0"/>
-                <w:color w:val="FFFFFF"/>
-                <w:sz w:val="18"/>
+                <w:color w:val="1C1917"/>
+                <w:sz w:val="21"/>
               </w:rPr>
               <w:t>Terminals ~40% unfulfilled vs ~3% elsewhere. After the trip, suburban backhaul and overnight return-collapse compound. Mix does not shift after dark (χ² p=0.12). New hires inherit both penalties. Price the deadhead for 4 weeks; hire only if the payout run-rate is not falling.</w:t>
             </w:r>
@@ -668,15 +668,15 @@
         <w:tc>
           <w:tcPr>
             <w:tcW w:type="dxa" w:w="5112"/>
-            <w:shd w:fill="E85D4C" w:val="clear"/>
+            <w:shd w:fill="F8F1E3" w:val="clear"/>
           </w:tcPr>
           <w:p>
             <w:r>
               <w:rPr>
                 <w:rFonts w:ascii="Calibri" w:hAnsi="Calibri"/>
                 <w:b/>
-                <w:color w:val="FFFFFF"/>
-                <w:sz w:val="20"/>
+                <w:color w:val="1C1917"/>
+                <w:sz w:val="24"/>
               </w:rPr>
               <w:t>Why rec 3 is a hard no on 5×</w:t>
               <w:br/>
@@ -685,8 +685,8 @@
               <w:rPr>
                 <w:rFonts w:ascii="Calibri" w:hAnsi="Calibri"/>
                 <w:b w:val="0"/>
-                <w:color w:val="FFFFFF"/>
-                <w:sz w:val="18"/>
+                <w:color w:val="1C1917"/>
+                <w:sz w:val="21"/>
               </w:rPr>
               <w:t>Clicked vs not (delivered): −1.5pp, CI −3.6 to +0.6 → 0 pp. The 29% vs 11% “got CAMP” gap is targeting after RC, not lift. That same null is why never-upload is not another WhatsApp. Redirect the paper into a send/no-send RCT this week.</w:t>
             </w:r>
@@ -701,24 +701,24 @@
         <w:tblLook w:firstColumn="1" w:firstRow="1" w:lastColumn="0" w:lastRow="0" w:noHBand="0" w:noVBand="1" w:val="04A0"/>
       </w:tblPr>
       <w:tblGrid>
-        <w:gridCol w:w="10368"/>
+        <w:gridCol w:w="10224"/>
       </w:tblGrid>
       <w:tr>
         <w:tc>
           <w:tcPr>
-            <w:tcW w:type="dxa" w:w="10368"/>
-            <w:shd w:fill="FF8A3D" w:val="clear"/>
+            <w:tcW w:type="dxa" w:w="10224"/>
+            <w:shd w:fill="F3E6C0" w:val="clear"/>
           </w:tcPr>
           <w:p>
             <w:pPr>
-              <w:spacing w:after="40" w:before="40" w:line="240" w:lineRule="auto"/>
+              <w:spacing w:after="80" w:before="80" w:line="240" w:lineRule="auto"/>
             </w:pPr>
             <w:r>
               <w:rPr>
                 <w:rFonts w:ascii="Calibri" w:hAnsi="Calibri"/>
                 <w:b/>
-                <w:color w:val="FFFFFF"/>
-                <w:sz w:val="22"/>
+                <w:color w:val="1C1917"/>
+                <w:sz w:val="24"/>
               </w:rPr>
               <w:t>PAGE 2  ·  WHY THESE TWO STAGES, WHAT WE LEFT, WHAT WOULD CHANGE MY MIND</w:t>
             </w:r>
@@ -728,7 +728,7 @@
     </w:tbl>
     <w:p>
       <w:pPr>
-        <w:spacing w:after="40" w:before="0" w:line="240" w:lineRule="auto"/>
+        <w:spacing w:after="80" w:before="0" w:line="240" w:lineRule="auto"/>
       </w:pPr>
     </w:p>
     <w:p>
@@ -739,21 +739,21 @@
         <w:rPr>
           <w:rFonts w:ascii="Calibri" w:hAnsi="Calibri"/>
           <w:b w:val="0"/>
-          <w:color w:val="3A2208"/>
-          <w:sz w:val="21"/>
+          <w:color w:val="1C1917"/>
+          <w:sz w:val="22"/>
         </w:rPr>
-        <w:t>The deck shows the leaks. This page is the bound: what is C1a vs leftover, how ₹35.4 is derived, and which piles I refuse to add to 180. RC loses 5,405 people — largest stage — but only 1,637 failed solely on blur / OCR / illegible. Insurance loses 3,289; ~2,530 never uploaded after Fitness. C1b is the 411 photo fails and cannot defer (liability). DL (1,166) is 100% uploaded-fail and cannot be deferred. Aadhaar / Permit / Fitness (1,540 / 2,616 / 2,653) are mostly never-upload or eligibility. Rejected 409 already cleared docs — a gate, not a UX leak.</w:t>
+        <w:t>The deck shows the leaks. This page is the bound: what is C1a vs leftover, how ₹35.4 is derived, and which piles I refuse to add to 180. RC loses 5,405 people — largest stage — but only 1,637 failed solely on blur / OCR / illegible. Insurance loses 3,289; ~2,530 never uploaded after Fitness. C1b is the 411 photo fails and cannot defer (liability). DL (1,166) is 100% uploaded-fail and cannot be deferred. Aadhaar / Permit / Fitness (1,540 / 2,616 / 2,653) are mostly never-upload or eligibility. Rejected 409 already cleared docs — a gate.</w:t>
       </w:r>
     </w:p>
     <w:p>
       <w:pPr>
-        <w:spacing w:after="40" w:before="0" w:line="240" w:lineRule="auto"/>
+        <w:spacing w:after="80" w:before="0" w:line="240" w:lineRule="auto"/>
         <w:jc w:val="center"/>
       </w:pPr>
       <w:r>
         <w:drawing>
           <wp:inline xmlns:a="http://schemas.openxmlformats.org/drawingml/2006/main" xmlns:pic="http://schemas.openxmlformats.org/drawingml/2006/picture">
-            <wp:extent cx="2606040" cy="1603423"/>
+            <wp:extent cx="2651760" cy="1481228"/>
             <wp:docPr id="3" name="Picture 3"/>
             <wp:cNvGraphicFramePr>
               <a:graphicFrameLocks noChangeAspect="1"/>
@@ -774,7 +774,7 @@
                   <pic:spPr>
                     <a:xfrm>
                       <a:off x="0" y="0"/>
-                      <a:ext cx="2606040" cy="1603423"/>
+                      <a:ext cx="2651760" cy="1481228"/>
                     </a:xfrm>
                     <a:prstGeom prst="rect"/>
                   </pic:spPr>
@@ -790,7 +790,7 @@
       <w:r>
         <w:drawing>
           <wp:inline xmlns:a="http://schemas.openxmlformats.org/drawingml/2006/main" xmlns:pic="http://schemas.openxmlformats.org/drawingml/2006/picture">
-            <wp:extent cx="2606040" cy="1417571"/>
+            <wp:extent cx="2651760" cy="1361909"/>
             <wp:docPr id="4" name="Picture 4"/>
             <wp:cNvGraphicFramePr>
               <a:graphicFrameLocks noChangeAspect="1"/>
@@ -811,7 +811,7 @@
                   <pic:spPr>
                     <a:xfrm>
                       <a:off x="0" y="0"/>
-                      <a:ext cx="2606040" cy="1417571"/>
+                      <a:ext cx="2651760" cy="1361909"/>
                     </a:xfrm>
                     <a:prstGeom prst="rect"/>
                   </pic:spPr>
@@ -827,28 +827,28 @@
     </w:p>
     <w:p>
       <w:pPr>
-        <w:spacing w:after="60" w:before="0" w:line="240" w:lineRule="auto"/>
+        <w:spacing w:after="80" w:before="0" w:line="240" w:lineRule="auto"/>
         <w:jc w:val="center"/>
       </w:pPr>
       <w:r>
         <w:rPr>
           <w:rFonts w:ascii="Calibri" w:hAnsi="Calibri"/>
           <w:b w:val="0"/>
-          <w:color w:val="6B4A2A"/>
-          <w:sz w:val="17"/>
+          <w:color w:val="57534E"/>
+          <w:sz w:val="21"/>
         </w:rPr>
         <w:t>Left: 1,637 of 5,405 RC losses are C1a. Right: 411 of 3,289 Insurance leftovers are C1b.</w:t>
       </w:r>
     </w:p>
     <w:p>
       <w:pPr>
-        <w:spacing w:after="40" w:before="0" w:line="240" w:lineRule="auto"/>
+        <w:spacing w:after="80" w:before="0" w:line="240" w:lineRule="auto"/>
         <w:jc w:val="center"/>
       </w:pPr>
       <w:r>
         <w:drawing>
           <wp:inline xmlns:a="http://schemas.openxmlformats.org/drawingml/2006/main" xmlns:pic="http://schemas.openxmlformats.org/drawingml/2006/picture">
-            <wp:extent cx="5212080" cy="2630625"/>
+            <wp:extent cx="5303520" cy="2733137"/>
             <wp:docPr id="5" name="Picture 5"/>
             <wp:cNvGraphicFramePr>
               <a:graphicFrameLocks noChangeAspect="1"/>
@@ -869,7 +869,7 @@
                   <pic:spPr>
                     <a:xfrm>
                       <a:off x="0" y="0"/>
-                      <a:ext cx="5212080" cy="2630625"/>
+                      <a:ext cx="5303520" cy="2733137"/>
                     </a:xfrm>
                     <a:prstGeom prst="rect"/>
                   </pic:spPr>
@@ -888,24 +888,27 @@
         <w:tblLook w:firstColumn="1" w:firstRow="1" w:lastColumn="0" w:lastRow="0" w:noHBand="0" w:noVBand="1" w:val="04A0"/>
       </w:tblPr>
       <w:tblGrid>
-        <w:gridCol w:w="2592"/>
-        <w:gridCol w:w="2592"/>
-        <w:gridCol w:w="2592"/>
-        <w:gridCol w:w="2592"/>
+        <w:gridCol w:w="2556"/>
+        <w:gridCol w:w="2556"/>
+        <w:gridCol w:w="2556"/>
+        <w:gridCol w:w="2556"/>
       </w:tblGrid>
       <w:tr>
         <w:tc>
           <w:tcPr>
             <w:tcW w:type="dxa" w:w="2592"/>
-            <w:shd w:fill="FFC400" w:val="clear"/>
+            <w:shd w:fill="F3E6C0" w:val="clear"/>
           </w:tcPr>
           <w:p>
+            <w:pPr>
+              <w:spacing w:after="60" w:before="60" w:line="240" w:lineRule="auto"/>
+            </w:pPr>
             <w:r>
               <w:rPr>
                 <w:rFonts w:ascii="Calibri" w:hAnsi="Calibri"/>
                 <w:b/>
-                <w:color w:val="1E2761"/>
-                <w:sz w:val="18"/>
+                <w:color w:val="1C1917"/>
+                <w:sz w:val="22"/>
               </w:rPr>
               <w:t>Fix</w:t>
             </w:r>
@@ -914,15 +917,18 @@
         <w:tc>
           <w:tcPr>
             <w:tcW w:type="dxa" w:w="2736"/>
-            <w:shd w:fill="FFC400" w:val="clear"/>
+            <w:shd w:fill="F3E6C0" w:val="clear"/>
           </w:tcPr>
           <w:p>
+            <w:pPr>
+              <w:spacing w:after="60" w:before="60" w:line="240" w:lineRule="auto"/>
+            </w:pPr>
             <w:r>
               <w:rPr>
                 <w:rFonts w:ascii="Calibri" w:hAnsi="Calibri"/>
                 <w:b/>
-                <w:color w:val="1E2761"/>
-                <w:sz w:val="18"/>
+                <w:color w:val="1C1917"/>
+                <w:sz w:val="22"/>
               </w:rPr>
               <w:t>Flow</w:t>
             </w:r>
@@ -931,15 +937,18 @@
         <w:tc>
           <w:tcPr>
             <w:tcW w:type="dxa" w:w="3312"/>
-            <w:shd w:fill="FFC400" w:val="clear"/>
+            <w:shd w:fill="F3E6C0" w:val="clear"/>
           </w:tcPr>
           <w:p>
+            <w:pPr>
+              <w:spacing w:after="60" w:before="60" w:line="240" w:lineRule="auto"/>
+            </w:pPr>
             <w:r>
               <w:rPr>
                 <w:rFonts w:ascii="Calibri" w:hAnsi="Calibri"/>
                 <w:b/>
-                <w:color w:val="1E2761"/>
-                <w:sz w:val="18"/>
+                <w:color w:val="1C1917"/>
+                <w:sz w:val="22"/>
               </w:rPr>
               <w:t>Maths</w:t>
             </w:r>
@@ -948,15 +957,18 @@
         <w:tc>
           <w:tcPr>
             <w:tcW w:type="dxa" w:w="1584"/>
-            <w:shd w:fill="FFC400" w:val="clear"/>
+            <w:shd w:fill="F3E6C0" w:val="clear"/>
           </w:tcPr>
           <w:p>
+            <w:pPr>
+              <w:spacing w:after="60" w:before="60" w:line="240" w:lineRule="auto"/>
+            </w:pPr>
             <w:r>
               <w:rPr>
                 <w:rFonts w:ascii="Calibri" w:hAnsi="Calibri"/>
                 <w:b/>
-                <w:color w:val="1E2761"/>
-                <w:sz w:val="18"/>
+                <w:color w:val="1C1917"/>
+                <w:sz w:val="22"/>
               </w:rPr>
               <w:t>Bank</w:t>
             </w:r>
@@ -967,15 +979,18 @@
         <w:tc>
           <w:tcPr>
             <w:tcW w:type="dxa" w:w="2592"/>
-            <w:shd w:fill="FFF6E8" w:val="clear"/>
+            <w:shd w:fill="F8F1E3" w:val="clear"/>
           </w:tcPr>
           <w:p>
+            <w:pPr>
+              <w:spacing w:after="60" w:before="40" w:line="240" w:lineRule="auto"/>
+            </w:pPr>
             <w:r>
               <w:rPr>
                 <w:rFonts w:ascii="Calibri" w:hAnsi="Calibri"/>
                 <w:b w:val="0"/>
-                <w:color w:val="1E2761"/>
-                <w:sz w:val="18"/>
+                <w:color w:val="1C1917"/>
+                <w:sz w:val="21"/>
               </w:rPr>
               <w:t>C1a RC grace</w:t>
             </w:r>
@@ -984,15 +999,18 @@
         <w:tc>
           <w:tcPr>
             <w:tcW w:type="dxa" w:w="2736"/>
-            <w:shd w:fill="FFF6E8" w:val="clear"/>
+            <w:shd w:fill="F8F1E3" w:val="clear"/>
           </w:tcPr>
           <w:p>
+            <w:pPr>
+              <w:spacing w:after="60" w:before="40" w:line="240" w:lineRule="auto"/>
+            </w:pPr>
             <w:r>
               <w:rPr>
                 <w:rFonts w:ascii="Calibri" w:hAnsi="Calibri"/>
                 <w:b w:val="0"/>
-                <w:color w:val="1E2761"/>
-                <w:sz w:val="18"/>
+                <w:color w:val="1C1917"/>
+                <w:sz w:val="21"/>
               </w:rPr>
               <w:t>~300/mo capture-only</w:t>
             </w:r>
@@ -1001,15 +1019,18 @@
         <w:tc>
           <w:tcPr>
             <w:tcW w:type="dxa" w:w="3312"/>
-            <w:shd w:fill="FFF6E8" w:val="clear"/>
+            <w:shd w:fill="F8F1E3" w:val="clear"/>
           </w:tcPr>
           <w:p>
+            <w:pPr>
+              <w:spacing w:after="60" w:before="40" w:line="240" w:lineRule="auto"/>
+            </w:pPr>
             <w:r>
               <w:rPr>
                 <w:rFonts w:ascii="Calibri" w:hAnsi="Calibri"/>
                 <w:b w:val="0"/>
-                <w:color w:val="1E2761"/>
-                <w:sz w:val="18"/>
+                <w:color w:val="1C1917"/>
+                <w:sz w:val="21"/>
               </w:rPr>
               <w:t>× 60% show-up × 74% pass</w:t>
             </w:r>
@@ -1018,15 +1039,18 @@
         <w:tc>
           <w:tcPr>
             <w:tcW w:type="dxa" w:w="1584"/>
-            <w:shd w:fill="FFF6E8" w:val="clear"/>
+            <w:shd w:fill="F8F1E3" w:val="clear"/>
           </w:tcPr>
           <w:p>
+            <w:pPr>
+              <w:spacing w:after="60" w:before="40" w:line="240" w:lineRule="auto"/>
+            </w:pPr>
             <w:r>
               <w:rPr>
                 <w:rFonts w:ascii="Calibri" w:hAnsi="Calibri"/>
                 <w:b/>
-                <w:color w:val="1E2761"/>
-                <w:sz w:val="18"/>
+                <w:color w:val="1C1917"/>
+                <w:sz w:val="21"/>
               </w:rPr>
               <w:t>~134/mo</w:t>
             </w:r>
@@ -1037,15 +1061,18 @@
         <w:tc>
           <w:tcPr>
             <w:tcW w:type="dxa" w:w="2592"/>
-            <w:shd w:fill="FFF6E8" w:val="clear"/>
+            <w:shd w:fill="F8F1E3" w:val="clear"/>
           </w:tcPr>
           <w:p>
+            <w:pPr>
+              <w:spacing w:after="60" w:before="40" w:line="240" w:lineRule="auto"/>
+            </w:pPr>
             <w:r>
               <w:rPr>
                 <w:rFonts w:ascii="Calibri" w:hAnsi="Calibri"/>
                 <w:b w:val="0"/>
-                <w:color w:val="1E2761"/>
-                <w:sz w:val="18"/>
+                <w:color w:val="1C1917"/>
+                <w:sz w:val="21"/>
               </w:rPr>
               <w:t>C1b Insurance UX</w:t>
             </w:r>
@@ -1054,15 +1081,18 @@
         <w:tc>
           <w:tcPr>
             <w:tcW w:type="dxa" w:w="2736"/>
-            <w:shd w:fill="FFF6E8" w:val="clear"/>
+            <w:shd w:fill="F8F1E3" w:val="clear"/>
           </w:tcPr>
           <w:p>
+            <w:pPr>
+              <w:spacing w:after="60" w:before="40" w:line="240" w:lineRule="auto"/>
+            </w:pPr>
             <w:r>
               <w:rPr>
                 <w:rFonts w:ascii="Calibri" w:hAnsi="Calibri"/>
                 <w:b w:val="0"/>
-                <w:color w:val="1E2761"/>
-                <w:sz w:val="18"/>
+                <w:color w:val="1C1917"/>
+                <w:sz w:val="21"/>
               </w:rPr>
               <w:t>411 capture-only</w:t>
             </w:r>
@@ -1071,15 +1101,18 @@
         <w:tc>
           <w:tcPr>
             <w:tcW w:type="dxa" w:w="3312"/>
-            <w:shd w:fill="FFF6E8" w:val="clear"/>
+            <w:shd w:fill="F8F1E3" w:val="clear"/>
           </w:tcPr>
           <w:p>
+            <w:pPr>
+              <w:spacing w:after="60" w:before="40" w:line="240" w:lineRule="auto"/>
+            </w:pPr>
             <w:r>
               <w:rPr>
                 <w:rFonts w:ascii="Calibri" w:hAnsi="Calibri"/>
                 <w:b w:val="0"/>
-                <w:color w:val="1E2761"/>
-                <w:sz w:val="18"/>
+                <w:color w:val="1C1917"/>
+                <w:sz w:val="21"/>
               </w:rPr>
               <w:t>67→76% × 91% approved-if-cleared</w:t>
             </w:r>
@@ -1088,15 +1121,18 @@
         <w:tc>
           <w:tcPr>
             <w:tcW w:type="dxa" w:w="1584"/>
-            <w:shd w:fill="FFF6E8" w:val="clear"/>
+            <w:shd w:fill="F8F1E3" w:val="clear"/>
           </w:tcPr>
           <w:p>
+            <w:pPr>
+              <w:spacing w:after="60" w:before="40" w:line="240" w:lineRule="auto"/>
+            </w:pPr>
             <w:r>
               <w:rPr>
                 <w:rFonts w:ascii="Calibri" w:hAnsi="Calibri"/>
                 <w:b/>
-                <w:color w:val="1E2761"/>
-                <w:sz w:val="18"/>
+                <w:color w:val="1C1917"/>
+                <w:sz w:val="21"/>
               </w:rPr>
               <w:t>~46–52/mo</w:t>
             </w:r>
@@ -1106,14 +1142,14 @@
     </w:tbl>
     <w:p>
       <w:pPr>
-        <w:spacing w:after="80" w:before="0" w:line="240" w:lineRule="auto"/>
+        <w:spacing w:after="120" w:before="0" w:line="240" w:lineRule="auto"/>
       </w:pPr>
       <w:r>
         <w:rPr>
           <w:rFonts w:ascii="Calibri" w:hAnsi="Calibri"/>
           <w:b w:val="0"/>
-          <w:color w:val="3A2208"/>
-          <w:sz w:val="19"/>
+          <w:color w:val="1C1917"/>
+          <w:sz w:val="22"/>
         </w:rPr>
         <w:t>40–80% show-up → ~89–188. If remaining docs still bind after RC, P(approved | passed RC)=27% → ~36/month (Legal ask).</w:t>
       </w:r>
@@ -1126,26 +1162,26 @@
         <w:tblLook w:firstColumn="1" w:firstRow="1" w:lastColumn="0" w:lastRow="0" w:noHBand="0" w:noVBand="1" w:val="04A0"/>
       </w:tblPr>
       <w:tblGrid>
-        <w:gridCol w:w="3456"/>
-        <w:gridCol w:w="3456"/>
-        <w:gridCol w:w="3456"/>
+        <w:gridCol w:w="3408"/>
+        <w:gridCol w:w="3408"/>
+        <w:gridCol w:w="3408"/>
       </w:tblGrid>
       <w:tr>
         <w:tc>
           <w:tcPr>
             <w:tcW w:type="dxa" w:w="3456"/>
-            <w:shd w:fill="E85D4C" w:val="clear"/>
+            <w:shd w:fill="F0C9A0" w:val="clear"/>
           </w:tcPr>
           <w:p>
             <w:pPr>
-              <w:spacing w:after="40" w:before="40" w:line="240" w:lineRule="auto"/>
+              <w:spacing w:after="60" w:before="60" w:line="240" w:lineRule="auto"/>
             </w:pPr>
             <w:r>
               <w:rPr>
                 <w:rFonts w:ascii="Calibri" w:hAnsi="Calibri"/>
                 <w:b/>
-                <w:color w:val="FFFFFF"/>
-                <w:sz w:val="16"/>
+                <w:color w:val="1C1917"/>
+                <w:sz w:val="21"/>
               </w:rPr>
               <w:t>NOT BANKED</w:t>
             </w:r>
@@ -1154,18 +1190,18 @@
         <w:tc>
           <w:tcPr>
             <w:tcW w:type="dxa" w:w="3456"/>
-            <w:shd w:fill="FF8A3D" w:val="clear"/>
+            <w:shd w:fill="F3E6C0" w:val="clear"/>
           </w:tcPr>
           <w:p>
             <w:pPr>
-              <w:spacing w:after="40" w:before="40" w:line="240" w:lineRule="auto"/>
+              <w:spacing w:after="60" w:before="60" w:line="240" w:lineRule="auto"/>
             </w:pPr>
             <w:r>
               <w:rPr>
                 <w:rFonts w:ascii="Calibri" w:hAnsi="Calibri"/>
                 <w:b/>
-                <w:color w:val="FFFFFF"/>
-                <w:sz w:val="16"/>
+                <w:color w:val="1C1917"/>
+                <w:sz w:val="21"/>
               </w:rPr>
               <w:t>ARA (not 30% of fare)</w:t>
             </w:r>
@@ -1174,18 +1210,18 @@
         <w:tc>
           <w:tcPr>
             <w:tcW w:type="dxa" w:w="3456"/>
-            <w:shd w:fill="FFC400" w:val="clear"/>
+            <w:shd w:fill="F6E4D4" w:val="clear"/>
           </w:tcPr>
           <w:p>
             <w:pPr>
-              <w:spacing w:after="40" w:before="40" w:line="240" w:lineRule="auto"/>
+              <w:spacing w:after="60" w:before="60" w:line="240" w:lineRule="auto"/>
             </w:pPr>
             <w:r>
               <w:rPr>
                 <w:rFonts w:ascii="Calibri" w:hAnsi="Calibri"/>
                 <w:b/>
-                <w:color w:val="1E2761"/>
-                <w:sz w:val="16"/>
+                <w:color w:val="1C1917"/>
+                <w:sz w:val="21"/>
               </w:rPr>
               <w:t>ASSUMPTIONS / WHAT WOULD CHANGE IT</w:t>
             </w:r>
@@ -1196,18 +1232,18 @@
         <w:tc>
           <w:tcPr>
             <w:tcW w:type="dxa" w:w="3456"/>
-            <w:shd w:fill="FFF6E8" w:val="clear"/>
+            <w:shd w:fill="FFFFFF" w:val="clear"/>
           </w:tcPr>
           <w:p>
             <w:pPr>
-              <w:spacing w:after="40" w:before="40" w:line="240" w:lineRule="auto"/>
+              <w:spacing w:after="60" w:before="60" w:line="240" w:lineRule="auto"/>
             </w:pPr>
             <w:r>
               <w:rPr>
                 <w:rFonts w:ascii="Calibri" w:hAnsi="Calibri"/>
                 <w:b w:val="0"/>
-                <w:color w:val="3A2208"/>
-                <w:sz w:val="16"/>
+                <w:color w:val="1C1917"/>
+                <w:sz w:val="20"/>
               </w:rPr>
               <w:t>Other-doc camera after C1b: measure, not +180. Never-upload RC ~2,388 / Insurance ~2,530: assist RCT, not WhatsApp (CAMP 0 pp). Overlaps 726 C1a. Paid never-starts 11.5% vs fos ~1% — no CAC, not sized.</w:t>
             </w:r>
@@ -1216,18 +1252,18 @@
         <w:tc>
           <w:tcPr>
             <w:tcW w:type="dxa" w:w="3456"/>
-            <w:shd w:fill="FFF6E8" w:val="clear"/>
+            <w:shd w:fill="FFFFFF" w:val="clear"/>
           </w:tcPr>
           <w:p>
             <w:pPr>
-              <w:spacing w:after="40" w:before="40" w:line="240" w:lineRule="auto"/>
+              <w:spacing w:after="60" w:before="60" w:line="240" w:lineRule="auto"/>
             </w:pPr>
             <w:r>
               <w:rPr>
                 <w:rFonts w:ascii="Calibri" w:hAnsi="Calibri"/>
                 <w:b w:val="0"/>
-                <w:color w:val="3A2208"/>
-                <w:sz w:val="16"/>
+                <w:color w:val="1C1917"/>
+                <w:sz w:val="20"/>
               </w:rPr>
               <w:t>Gap ₹31.6 (₹24.9 vs ₹56.5) ÷ 0.8931 eligible ≈ ₹35.4/leg. 80/100/120% → ~₹69–103k sample. ₹105 (30% of fare) overpays. City-core ₹104.7 is geography.</w:t>
             </w:r>
@@ -1236,18 +1272,18 @@
         <w:tc>
           <w:tcPr>
             <w:tcW w:type="dxa" w:w="3456"/>
-            <w:shd w:fill="FFF6E8" w:val="clear"/>
+            <w:shd w:fill="FFFFFF" w:val="clear"/>
           </w:tcPr>
           <w:p>
             <w:pPr>
-              <w:spacing w:after="40" w:before="40" w:line="240" w:lineRule="auto"/>
+              <w:spacing w:after="60" w:before="60" w:line="240" w:lineRule="auto"/>
             </w:pPr>
             <w:r>
               <w:rPr>
                 <w:rFonts w:ascii="Calibri" w:hAnsi="Calibri"/>
                 <w:b w:val="0"/>
-                <w:color w:val="3A2208"/>
-                <w:sz w:val="16"/>
+                <w:color w:val="1C1917"/>
+                <w:sz w:val="20"/>
               </w:rPr>
               <w:t>~15.6-day cutoff (later capture-fails → 180 is a floor). doc_events, not docs_cleared. Field gap not banked. Re-derive ₹35.4 if night returns rise. C1a FTE ₹40–60k assumed. No CAC. Trips sampled. signup_zone_id ≠ airport zones. Capture-only counted on RC/Insurance only.</w:t>
             </w:r>
@@ -1257,7 +1293,7 @@
     </w:tbl>
     <w:sectPr>
       <w:pgSz w:w="12240" w:h="15840"/>
-      <w:pgMar w:top="720" w:right="936" w:bottom="720" w:left="936" w:header="720" w:footer="720" w:gutter="0"/>
+      <w:pgMar w:top="792" w:right="1008" w:bottom="792" w:left="1008" w:header="720" w:footer="720" w:gutter="0"/>
       <w:cols w:space="720"/>
       <w:docGrid w:linePitch="360"/>
     </w:sectPr>

</xml_diff>

<commit_message>
Lead the packet with ~50 this week, not an unconditional 180.
C1a is a Legal scenario (~134 or ~36). Deck is 6 slides. Airport slide
states B2 (after the trip, mix p=0.12). Memo and dashboard match.

Co-authored-by: KRRamanathan <KRRamanathan@users.noreply.github.com>
</commit_message>
<xml_diff>
--- a/MEMO.docx
+++ b/MEMO.docx
@@ -49,9 +49,9 @@
           <w:rFonts w:ascii="Cambria" w:hAnsi="Cambria"/>
           <w:b/>
           <w:color w:val="1C1917"/>
-          <w:sz w:val="36"/>
+          <w:sz w:val="34"/>
         </w:rPr>
-        <w:t>~180 more approved captains a month — two photo fixes, not five programmes</w:t>
+        <w:t>Ship ~50 extra approved captains this week. Do not bank ~180.</w:t>
       </w:r>
     </w:p>
     <w:p>
@@ -65,7 +65,7 @@
           <w:color w:val="1C1917"/>
           <w:sz w:val="23"/>
         </w:rPr>
-        <w:t>Bank only two disjoint capture fixes: ~134/month from a 10-day in-person RC grace (C1a) and ~50 from Insurance upload UX (C1b). 98.7% of mature approved captains already take a first trip (3,895 / 3,946) — documents are the bottleneck, not first-order. Show-up for RC is unobserved; if Legal will not treat deferred RC as activation, C1a shrinks toward ~36/month. The campaign number I would put my name on is 0 pp, not 5×.</w:t>
+        <w:t>The number I will put my name on this week is ~46–52 extra approved / month from Insurance capture UX (C1b). It needs engineering, not Legal. A 10-day RC grace (C1a) is ~134/month only if Legal treats deferred RC as activation and captains show up — show-up is unobserved. If remaining docs still bind after RC, that path is ~36/month. 98.7% of mature approved already take a first trip (3,895 / 3,946) — documents are the bottleneck, not first-order. CAMP_WA_002 is 0 pp, not 5×. Airport: do not hire; price the night at ₹35.4 / unpaid suburban leg.</w:t>
       </w:r>
     </w:p>
     <w:p>
@@ -160,7 +160,7 @@
           <w:color w:val="57534E"/>
           <w:sz w:val="21"/>
         </w:rPr>
-        <w:t>Left: bank C1a + C1b only. Right: 84% of airport unfulfilled volume is 21:00–03:59.</w:t>
+        <w:t>Left: C1a vs C1b if Legal says yes — not this week’s bank. Right: 84% of airport unfulfilled is 21:00–03:59.</w:t>
       </w:r>
     </w:p>
     <w:tbl>
@@ -353,7 +353,7 @@
                 <w:color w:val="1C1917"/>
                 <w:sz w:val="20"/>
               </w:rPr>
-              <w:t>C1b Insurance camera this week (411). Then C1a 10-day RC grace after Legal (1,637). Same camera on other docs: free rider, not in 180.</w:t>
+              <w:t>C1b Insurance camera this week (411). Same camera on other docs: measure, not in the bank. Legal scoping on C1a RC grace (1,637) in parallel — do not add ~134 until they say yes.</w:t>
             </w:r>
           </w:p>
         </w:tc>
@@ -373,7 +373,7 @@
                 <w:color w:val="1C1917"/>
                 <w:sz w:val="20"/>
               </w:rPr>
-              <w:t>~180/mo (~50 + ~134)</w:t>
+              <w:t>~50/mo now. +~134 only if Legal; else ~36.</w:t>
             </w:r>
           </w:p>
         </w:tc>
@@ -393,7 +393,7 @@
                 <w:color w:val="1C1917"/>
                 <w:sz w:val="20"/>
               </w:rPr>
-              <w:t>C1b: engineering. C1a: Legal/T&amp;S + ~1 FTE ₹40–60k (assumed).</w:t>
+              <w:t>C1b: engineering. C1a: Legal/T&amp;S. Show-up unobserved. FTE ₹40–60k assumed.</w:t>
             </w:r>
           </w:p>
         </w:tc>
@@ -742,7 +742,7 @@
           <w:color w:val="1C1917"/>
           <w:sz w:val="22"/>
         </w:rPr>
-        <w:t>The deck shows the leaks. This page is the bound: what is C1a vs leftover, how ₹35.4 is derived, and which piles I refuse to add to 180. RC loses 5,405 people — largest stage — but only 1,637 failed solely on blur / OCR / illegible. Insurance loses 3,289; ~2,530 never uploaded after Fitness. C1b is the 411 photo fails and cannot defer (liability). DL (1,166) is 100% uploaded-fail and cannot be deferred. Aadhaar / Permit / Fitness (1,540 / 2,616 / 2,653) are mostly never-upload or eligibility. Rejected 409 already cleared docs — a gate.</w:t>
+        <w:t>The deck shows the leaks. This page is the bound: C1b is unconditional; C1a is a Legal scenario; ₹35.4 is derived; these piles are not added to ~50. RC loses 5,405 — only 1,637 failed solely on blur / OCR / illegible. Insurance loses 3,289; ~2,530 never uploaded after Fitness. C1b is the 411 photo fails and cannot defer (liability). DL (1,166) is 100% uploaded-fail and cannot be deferred. Aadhaar / Permit / Fitness (1,540 / 2,616 / 2,653) are mostly never-upload or eligibility. Rejected 409 already cleared docs — a gate.</w:t>
       </w:r>
     </w:p>
     <w:p>
@@ -970,7 +970,89 @@
                 <w:color w:val="1C1917"/>
                 <w:sz w:val="22"/>
               </w:rPr>
-              <w:t>Bank</w:t>
+              <w:t>What I bank</w:t>
+            </w:r>
+          </w:p>
+        </w:tc>
+      </w:tr>
+      <w:tr>
+        <w:tc>
+          <w:tcPr>
+            <w:tcW w:type="dxa" w:w="2592"/>
+            <w:shd w:fill="F8F1E3" w:val="clear"/>
+          </w:tcPr>
+          <w:p>
+            <w:pPr>
+              <w:spacing w:after="60" w:before="40" w:line="240" w:lineRule="auto"/>
+            </w:pPr>
+            <w:r>
+              <w:rPr>
+                <w:rFonts w:ascii="Calibri" w:hAnsi="Calibri"/>
+                <w:b w:val="0"/>
+                <w:color w:val="1C1917"/>
+                <w:sz w:val="21"/>
+              </w:rPr>
+              <w:t>C1b Insurance UX</w:t>
+            </w:r>
+          </w:p>
+        </w:tc>
+        <w:tc>
+          <w:tcPr>
+            <w:tcW w:type="dxa" w:w="2736"/>
+            <w:shd w:fill="F8F1E3" w:val="clear"/>
+          </w:tcPr>
+          <w:p>
+            <w:pPr>
+              <w:spacing w:after="60" w:before="40" w:line="240" w:lineRule="auto"/>
+            </w:pPr>
+            <w:r>
+              <w:rPr>
+                <w:rFonts w:ascii="Calibri" w:hAnsi="Calibri"/>
+                <w:b w:val="0"/>
+                <w:color w:val="1C1917"/>
+                <w:sz w:val="21"/>
+              </w:rPr>
+              <w:t>411 capture-only</w:t>
+            </w:r>
+          </w:p>
+        </w:tc>
+        <w:tc>
+          <w:tcPr>
+            <w:tcW w:type="dxa" w:w="3312"/>
+            <w:shd w:fill="F8F1E3" w:val="clear"/>
+          </w:tcPr>
+          <w:p>
+            <w:pPr>
+              <w:spacing w:after="60" w:before="40" w:line="240" w:lineRule="auto"/>
+            </w:pPr>
+            <w:r>
+              <w:rPr>
+                <w:rFonts w:ascii="Calibri" w:hAnsi="Calibri"/>
+                <w:b w:val="0"/>
+                <w:color w:val="1C1917"/>
+                <w:sz w:val="21"/>
+              </w:rPr>
+              <w:t>67→76% × 91% approved-if-cleared</w:t>
+            </w:r>
+          </w:p>
+        </w:tc>
+        <w:tc>
+          <w:tcPr>
+            <w:tcW w:type="dxa" w:w="1584"/>
+            <w:shd w:fill="F8F1E3" w:val="clear"/>
+          </w:tcPr>
+          <w:p>
+            <w:pPr>
+              <w:spacing w:after="60" w:before="40" w:line="240" w:lineRule="auto"/>
+            </w:pPr>
+            <w:r>
+              <w:rPr>
+                <w:rFonts w:ascii="Calibri" w:hAnsi="Calibri"/>
+                <w:b/>
+                <w:color w:val="1C1917"/>
+                <w:sz w:val="21"/>
+              </w:rPr>
+              <w:t>~50/mo — yes</w:t>
             </w:r>
           </w:p>
         </w:tc>
@@ -1052,89 +1134,7 @@
                 <w:color w:val="1C1917"/>
                 <w:sz w:val="21"/>
               </w:rPr>
-              <w:t>~134/mo</w:t>
-            </w:r>
-          </w:p>
-        </w:tc>
-      </w:tr>
-      <w:tr>
-        <w:tc>
-          <w:tcPr>
-            <w:tcW w:type="dxa" w:w="2592"/>
-            <w:shd w:fill="F8F1E3" w:val="clear"/>
-          </w:tcPr>
-          <w:p>
-            <w:pPr>
-              <w:spacing w:after="60" w:before="40" w:line="240" w:lineRule="auto"/>
-            </w:pPr>
-            <w:r>
-              <w:rPr>
-                <w:rFonts w:ascii="Calibri" w:hAnsi="Calibri"/>
-                <w:b w:val="0"/>
-                <w:color w:val="1C1917"/>
-                <w:sz w:val="21"/>
-              </w:rPr>
-              <w:t>C1b Insurance UX</w:t>
-            </w:r>
-          </w:p>
-        </w:tc>
-        <w:tc>
-          <w:tcPr>
-            <w:tcW w:type="dxa" w:w="2736"/>
-            <w:shd w:fill="F8F1E3" w:val="clear"/>
-          </w:tcPr>
-          <w:p>
-            <w:pPr>
-              <w:spacing w:after="60" w:before="40" w:line="240" w:lineRule="auto"/>
-            </w:pPr>
-            <w:r>
-              <w:rPr>
-                <w:rFonts w:ascii="Calibri" w:hAnsi="Calibri"/>
-                <w:b w:val="0"/>
-                <w:color w:val="1C1917"/>
-                <w:sz w:val="21"/>
-              </w:rPr>
-              <w:t>411 capture-only</w:t>
-            </w:r>
-          </w:p>
-        </w:tc>
-        <w:tc>
-          <w:tcPr>
-            <w:tcW w:type="dxa" w:w="3312"/>
-            <w:shd w:fill="F8F1E3" w:val="clear"/>
-          </w:tcPr>
-          <w:p>
-            <w:pPr>
-              <w:spacing w:after="60" w:before="40" w:line="240" w:lineRule="auto"/>
-            </w:pPr>
-            <w:r>
-              <w:rPr>
-                <w:rFonts w:ascii="Calibri" w:hAnsi="Calibri"/>
-                <w:b w:val="0"/>
-                <w:color w:val="1C1917"/>
-                <w:sz w:val="21"/>
-              </w:rPr>
-              <w:t>67→76% × 91% approved-if-cleared</w:t>
-            </w:r>
-          </w:p>
-        </w:tc>
-        <w:tc>
-          <w:tcPr>
-            <w:tcW w:type="dxa" w:w="1584"/>
-            <w:shd w:fill="F8F1E3" w:val="clear"/>
-          </w:tcPr>
-          <w:p>
-            <w:pPr>
-              <w:spacing w:after="60" w:before="40" w:line="240" w:lineRule="auto"/>
-            </w:pPr>
-            <w:r>
-              <w:rPr>
-                <w:rFonts w:ascii="Calibri" w:hAnsi="Calibri"/>
-                <w:b/>
-                <w:color w:val="1C1917"/>
-                <w:sz w:val="21"/>
-              </w:rPr>
-              <w:t>~46–52/mo</w:t>
+              <w:t>~134 if Legal; ~36 if not</w:t>
             </w:r>
           </w:p>
         </w:tc>
@@ -1151,7 +1151,7 @@
           <w:color w:val="1C1917"/>
           <w:sz w:val="22"/>
         </w:rPr>
-        <w:t>40–80% show-up → ~89–188. If remaining docs still bind after RC, P(approved | passed RC)=27% → ~36/month (Legal ask).</w:t>
+        <w:t>40–80% show-up → C1a ~89–188. I would not put 180 in a deck with my name on it until Legal answers.</w:t>
       </w:r>
     </w:p>
     <w:tbl>
@@ -1245,7 +1245,7 @@
                 <w:color w:val="1C1917"/>
                 <w:sz w:val="20"/>
               </w:rPr>
-              <w:t>Other-doc camera after C1b: measure, not +180. Never-upload RC ~2,388 / Insurance ~2,530: assist RCT, not WhatsApp (CAMP 0 pp). Overlaps 726 C1a. Paid never-starts 11.5% vs fos ~1% — no CAC, not sized.</w:t>
+              <w:t>Other-doc camera after C1b: measure, not +50. Never-upload RC ~2,388 / Insurance ~2,530: assist RCT, not WhatsApp (CAMP 0 pp). Overlaps 726 C1a. Paid never-starts 11.5% vs fos ~1% — no CAC, not sized.</w:t>
             </w:r>
           </w:p>
         </w:tc>
@@ -1285,7 +1285,7 @@
                 <w:color w:val="1C1917"/>
                 <w:sz w:val="20"/>
               </w:rPr>
-              <w:t>~15.6-day cutoff (later capture-fails → 180 is a floor). doc_events, not docs_cleared. Field gap not banked. Re-derive ₹35.4 if night returns rise. C1a FTE ₹40–60k assumed. No CAC. Trips sampled. signup_zone_id ≠ airport zones. Capture-only counted on RC/Insurance only.</w:t>
+              <w:t>~15.6-day cutoff (eligible pool is a floor, not a bank). doc_events, not docs_cleared. Field gap not banked. C1a 60% show-up unobserved — if Legal says no, bank C1b only. Re-derive ₹35.4 if night returns rise. C1a FTE ₹40–60k assumed. No CAC. Trips sampled. signup_zone_id ≠ airport zones.</w:t>
             </w:r>
           </w:p>
         </w:tc>

</xml_diff>